<commit_message>
lab4: started on document
</commit_message>
<xml_diff>
--- a/lab4/lab4_report.docx
+++ b/lab4/lab4_report.docx
@@ -65,61 +65,7 @@
           <w:lang w:val="en-GB" w:eastAsia="nb-NO"/>
           <w14:ligatures w14:val="none"/>
         </w:rPr>
-        <w:t xml:space="preserve">Report for Lab </w:t>
-      </w:r>
-      <w:r>
-        <w:rPr>
-          <w:rFonts w:ascii="Times New Roman" w:eastAsiaTheme="majorEastAsia" w:hAnsi="Times New Roman" w:cs="Times New Roman"/>
-          <w:b/>
-          <w:bCs/>
-          <w:kern w:val="0"/>
-          <w:sz w:val="28"/>
-          <w:szCs w:val="28"/>
-          <w:lang w:val="en-GB" w:eastAsia="nb-NO"/>
-          <w14:ligatures w14:val="none"/>
-        </w:rPr>
-        <w:t>4</w:t>
-      </w:r>
-      <w:r>
-        <w:rPr>
-          <w:rFonts w:ascii="Times New Roman" w:eastAsiaTheme="majorEastAsia" w:hAnsi="Times New Roman" w:cs="Times New Roman"/>
-          <w:b/>
-          <w:bCs/>
-          <w:kern w:val="0"/>
-          <w:sz w:val="28"/>
-          <w:szCs w:val="28"/>
-          <w:lang w:val="en-GB" w:eastAsia="nb-NO"/>
-          <w14:ligatures w14:val="none"/>
-        </w:rPr>
-        <w:t xml:space="preserve">: </w:t>
-      </w:r>
-      <w:proofErr w:type="spellStart"/>
-      <w:r>
-        <w:rPr>
-          <w:rFonts w:ascii="Times New Roman" w:eastAsiaTheme="majorEastAsia" w:hAnsi="Times New Roman" w:cs="Times New Roman"/>
-          <w:b/>
-          <w:bCs/>
-          <w:kern w:val="0"/>
-          <w:sz w:val="28"/>
-          <w:szCs w:val="28"/>
-          <w:lang w:eastAsia="nb-NO"/>
-          <w14:ligatures w14:val="none"/>
-        </w:rPr>
-        <w:t>ForkJoin</w:t>
-      </w:r>
-      <w:proofErr w:type="spellEnd"/>
-      <w:r>
-        <w:rPr>
-          <w:rFonts w:ascii="Times New Roman" w:eastAsiaTheme="majorEastAsia" w:hAnsi="Times New Roman" w:cs="Times New Roman"/>
-          <w:b/>
-          <w:bCs/>
-          <w:kern w:val="0"/>
-          <w:sz w:val="28"/>
-          <w:szCs w:val="28"/>
-          <w:lang w:eastAsia="nb-NO"/>
-          <w14:ligatures w14:val="none"/>
-        </w:rPr>
-        <w:t xml:space="preserve"> Framework</w:t>
+        <w:t>Report for Lab 4: ForkJoin Framework</w:t>
       </w:r>
     </w:p>
     <w:p>
@@ -192,24 +138,799 @@
       <w:pPr>
         <w:rPr>
           <w:rFonts w:ascii="Times New Roman" w:hAnsi="Times New Roman" w:cs="Times New Roman"/>
+          <w:lang w:val="en-GB"/>
         </w:rPr>
       </w:pPr>
       <w:r>
         <w:rPr>
           <w:rFonts w:ascii="Times New Roman" w:hAnsi="Times New Roman" w:cs="Times New Roman"/>
+          <w:lang w:val="en-GB"/>
         </w:rPr>
         <w:br w:type="page"/>
       </w:r>
     </w:p>
     <w:p>
       <w:pPr>
+        <w:pStyle w:val="Overskrift1"/>
+        <w:rPr>
+          <w:lang w:val="en-GB"/>
+        </w:rPr>
+      </w:pPr>
+      <w:r>
+        <w:rPr>
+          <w:lang w:val="en-GB"/>
+        </w:rPr>
+        <w:lastRenderedPageBreak/>
+        <w:t>Exercise 1: Review and run code</w:t>
+      </w:r>
+    </w:p>
+    <w:p>
+      <w:pPr>
+        <w:pStyle w:val="Overskrift2"/>
+        <w:rPr>
+          <w:lang w:val="en-GB"/>
+        </w:rPr>
+      </w:pPr>
+      <w:r>
+        <w:rPr>
+          <w:lang w:val="en-GB"/>
+        </w:rPr>
+        <w:t>1.1: Review code to see how to implement tasks in Forkjoin</w:t>
+      </w:r>
+    </w:p>
+    <w:p>
+      <w:pPr>
         <w:rPr>
           <w:rFonts w:ascii="Times New Roman" w:hAnsi="Times New Roman" w:cs="Times New Roman"/>
-        </w:rPr>
-      </w:pPr>
+          <w:lang w:val="en-GB"/>
+        </w:rPr>
+      </w:pPr>
+      <w:r>
+        <w:rPr>
+          <w:rFonts w:ascii="Times New Roman" w:hAnsi="Times New Roman" w:cs="Times New Roman"/>
+          <w:lang w:val="en-GB"/>
+        </w:rPr>
+        <w:t>In the Fork/Join framework, parallel work is implemented by extending either RecursiveTask&lt;T&gt; (when a result is returned) or RecursiveAction (when no result is returned), and overriding compute() with a threshold-based strategy. If the assigned range is small, the code performs the work directly; otherwise, it splits the range into two subtasks, calls fork() on one or both, then calls join() and combines results when needed.</w:t>
+      </w:r>
+    </w:p>
+    <w:p>
+      <w:pPr>
+        <w:rPr>
+          <w:rFonts w:ascii="Times New Roman" w:hAnsi="Times New Roman" w:cs="Times New Roman"/>
+          <w:lang w:val="en-GB"/>
+        </w:rPr>
+      </w:pPr>
+      <w:r>
+        <w:rPr>
+          <w:rFonts w:ascii="Times New Roman" w:hAnsi="Times New Roman" w:cs="Times New Roman"/>
+          <w:lang w:val="en-GB"/>
+        </w:rPr>
+        <w:t>In Task.java, the code uses a RecursiveTask&lt;Double&gt; to sum product prices by splitting the index range and combining partial sums. In Task.java, the code uses a RecursiveAction to update product prices in-place using the same split/fork/join pattern.</w:t>
+      </w:r>
+    </w:p>
+    <w:p>
+      <w:pPr>
+        <w:rPr>
+          <w:rFonts w:ascii="Times New Roman" w:hAnsi="Times New Roman" w:cs="Times New Roman"/>
+          <w:lang w:val="en-GB"/>
+        </w:rPr>
+      </w:pPr>
+      <w:r>
+        <w:rPr>
+          <w:rFonts w:ascii="Times New Roman" w:hAnsi="Times New Roman" w:cs="Times New Roman"/>
+          <w:lang w:val="en-GB"/>
+        </w:rPr>
+        <w:t>Execution is handled by creating or obtaining a ForkJoinPool and submitting the root task. The demo mains use the shared ForkJoinPool.commonPool() with pool.execute(task) (Main.java, Main.java), while the simpler examples create a dedicated pool with new ForkJoinPool() and run synchronously using pool.invoke(task) (Main.java, Main.java).</w:t>
+      </w:r>
+    </w:p>
+    <w:p>
+      <w:pPr>
+        <w:pStyle w:val="Overskrift2"/>
+        <w:rPr>
+          <w:lang w:val="en-GB"/>
+        </w:rPr>
+      </w:pPr>
+      <w:r>
+        <w:rPr>
+          <w:lang w:val="en-GB"/>
+        </w:rPr>
+        <w:t>1.2: Run code and include screenshots</w:t>
+      </w:r>
+      <w:r>
+        <w:rPr>
+          <w:lang w:val="en-GB"/>
+        </w:rPr>
+        <w:t xml:space="preserve"> (</w:t>
+      </w:r>
+      <w:r>
+        <w:rPr>
+          <w:lang w:val="en-GB"/>
+        </w:rPr>
+        <w:t>5</w:t>
+      </w:r>
+      <w:r>
+        <w:rPr>
+          <w:lang w:val="en-GB"/>
+        </w:rPr>
+        <w:t xml:space="preserve"> Screenshots)</w:t>
+      </w:r>
+    </w:p>
+    <w:p>
+      <w:pPr>
+        <w:rPr>
+          <w:lang w:val="en-GB"/>
+        </w:rPr>
+      </w:pPr>
+      <w:r>
+        <w:rPr>
+          <w:lang w:val="en-GB"/>
+        </w:rPr>
+        <w:t>Demo_recursive_action (2 screenshots):</w:t>
+      </w:r>
+    </w:p>
+    <w:p>
+      <w:pPr>
+        <w:rPr>
+          <w:lang w:val="en-GB"/>
+        </w:rPr>
+      </w:pPr>
+      <w:r>
+        <w:rPr>
+          <w:lang w:val="en-GB"/>
+        </w:rPr>
+        <w:lastRenderedPageBreak/>
+        <w:drawing>
+          <wp:inline distT="0" distB="0" distL="0" distR="0" wp14:anchorId="56C3E400" wp14:editId="33A2B218">
+            <wp:extent cx="3772426" cy="6916115"/>
+            <wp:effectExtent l="0" t="0" r="0" b="0"/>
+            <wp:docPr id="1716022997" name="Bilde 1" descr="Et bilde som inneholder tekst, skjermbilde, Font&#10;&#10;KI-generert innhold kan være feil."/>
+            <wp:cNvGraphicFramePr>
+              <a:graphicFrameLocks xmlns:a="http://schemas.openxmlformats.org/drawingml/2006/main" noChangeAspect="1"/>
+            </wp:cNvGraphicFramePr>
+            <a:graphic xmlns:a="http://schemas.openxmlformats.org/drawingml/2006/main">
+              <a:graphicData uri="http://schemas.openxmlformats.org/drawingml/2006/picture">
+                <pic:pic xmlns:pic="http://schemas.openxmlformats.org/drawingml/2006/picture">
+                  <pic:nvPicPr>
+                    <pic:cNvPr id="1716022997" name="Bilde 1" descr="Et bilde som inneholder tekst, skjermbilde, Font&#10;&#10;KI-generert innhold kan være feil."/>
+                    <pic:cNvPicPr/>
+                  </pic:nvPicPr>
+                  <pic:blipFill>
+                    <a:blip r:embed="rId7"/>
+                    <a:stretch>
+                      <a:fillRect/>
+                    </a:stretch>
+                  </pic:blipFill>
+                  <pic:spPr>
+                    <a:xfrm>
+                      <a:off x="0" y="0"/>
+                      <a:ext cx="3772426" cy="6916115"/>
+                    </a:xfrm>
+                    <a:prstGeom prst="rect">
+                      <a:avLst/>
+                    </a:prstGeom>
+                  </pic:spPr>
+                </pic:pic>
+              </a:graphicData>
+            </a:graphic>
+          </wp:inline>
+        </w:drawing>
+      </w:r>
+    </w:p>
+    <w:p>
+      <w:pPr>
+        <w:rPr>
+          <w:lang w:val="en-GB"/>
+        </w:rPr>
+      </w:pPr>
+      <w:r>
+        <w:rPr>
+          <w:lang w:val="en-GB"/>
+        </w:rPr>
+        <w:lastRenderedPageBreak/>
+        <w:drawing>
+          <wp:inline distT="0" distB="0" distL="0" distR="0" wp14:anchorId="361209E7" wp14:editId="7FF4D1C5">
+            <wp:extent cx="3820058" cy="7497221"/>
+            <wp:effectExtent l="0" t="0" r="9525" b="8890"/>
+            <wp:docPr id="1791801307" name="Bilde 1" descr="Et bilde som inneholder tekst, skjermbilde, Font, design&#10;&#10;KI-generert innhold kan være feil."/>
+            <wp:cNvGraphicFramePr>
+              <a:graphicFrameLocks xmlns:a="http://schemas.openxmlformats.org/drawingml/2006/main" noChangeAspect="1"/>
+            </wp:cNvGraphicFramePr>
+            <a:graphic xmlns:a="http://schemas.openxmlformats.org/drawingml/2006/main">
+              <a:graphicData uri="http://schemas.openxmlformats.org/drawingml/2006/picture">
+                <pic:pic xmlns:pic="http://schemas.openxmlformats.org/drawingml/2006/picture">
+                  <pic:nvPicPr>
+                    <pic:cNvPr id="1791801307" name="Bilde 1" descr="Et bilde som inneholder tekst, skjermbilde, Font, design&#10;&#10;KI-generert innhold kan være feil."/>
+                    <pic:cNvPicPr/>
+                  </pic:nvPicPr>
+                  <pic:blipFill>
+                    <a:blip r:embed="rId8"/>
+                    <a:stretch>
+                      <a:fillRect/>
+                    </a:stretch>
+                  </pic:blipFill>
+                  <pic:spPr>
+                    <a:xfrm>
+                      <a:off x="0" y="0"/>
+                      <a:ext cx="3820058" cy="7497221"/>
+                    </a:xfrm>
+                    <a:prstGeom prst="rect">
+                      <a:avLst/>
+                    </a:prstGeom>
+                  </pic:spPr>
+                </pic:pic>
+              </a:graphicData>
+            </a:graphic>
+          </wp:inline>
+        </w:drawing>
+      </w:r>
+    </w:p>
+    <w:p>
+      <w:pPr>
+        <w:rPr>
+          <w:lang w:val="en-GB"/>
+        </w:rPr>
+      </w:pPr>
+    </w:p>
+    <w:p>
+      <w:pPr>
+        <w:rPr>
+          <w:lang w:val="en-GB"/>
+        </w:rPr>
+      </w:pPr>
+    </w:p>
+    <w:p>
+      <w:pPr>
+        <w:rPr>
+          <w:lang w:val="en-GB"/>
+        </w:rPr>
+      </w:pPr>
+      <w:r>
+        <w:rPr>
+          <w:lang w:val="en-GB"/>
+        </w:rPr>
+        <w:t>Demo_recursive_task (3 screenshots):</w:t>
+      </w:r>
+    </w:p>
+    <w:p>
+      <w:pPr>
+        <w:rPr>
+          <w:lang w:val="en-GB"/>
+        </w:rPr>
+      </w:pPr>
+      <w:r>
+        <w:rPr>
+          <w:lang w:val="en-GB"/>
+        </w:rPr>
+        <w:lastRenderedPageBreak/>
+        <w:drawing>
+          <wp:inline distT="0" distB="0" distL="0" distR="0" wp14:anchorId="588CE833" wp14:editId="22479487">
+            <wp:extent cx="3119120" cy="8892540"/>
+            <wp:effectExtent l="0" t="0" r="5080" b="3810"/>
+            <wp:docPr id="1000179976" name="Bilde 1" descr="Et bilde som inneholder tekst, skjermbilde, Font, design&#10;&#10;KI-generert innhold kan være feil."/>
+            <wp:cNvGraphicFramePr>
+              <a:graphicFrameLocks xmlns:a="http://schemas.openxmlformats.org/drawingml/2006/main" noChangeAspect="1"/>
+            </wp:cNvGraphicFramePr>
+            <a:graphic xmlns:a="http://schemas.openxmlformats.org/drawingml/2006/main">
+              <a:graphicData uri="http://schemas.openxmlformats.org/drawingml/2006/picture">
+                <pic:pic xmlns:pic="http://schemas.openxmlformats.org/drawingml/2006/picture">
+                  <pic:nvPicPr>
+                    <pic:cNvPr id="1000179976" name="Bilde 1" descr="Et bilde som inneholder tekst, skjermbilde, Font, design&#10;&#10;KI-generert innhold kan være feil."/>
+                    <pic:cNvPicPr/>
+                  </pic:nvPicPr>
+                  <pic:blipFill>
+                    <a:blip r:embed="rId9"/>
+                    <a:stretch>
+                      <a:fillRect/>
+                    </a:stretch>
+                  </pic:blipFill>
+                  <pic:spPr>
+                    <a:xfrm>
+                      <a:off x="0" y="0"/>
+                      <a:ext cx="3119120" cy="8892540"/>
+                    </a:xfrm>
+                    <a:prstGeom prst="rect">
+                      <a:avLst/>
+                    </a:prstGeom>
+                  </pic:spPr>
+                </pic:pic>
+              </a:graphicData>
+            </a:graphic>
+          </wp:inline>
+        </w:drawing>
+      </w:r>
+    </w:p>
+    <w:p>
+      <w:pPr>
+        <w:rPr>
+          <w:lang w:val="en-GB"/>
+        </w:rPr>
+      </w:pPr>
+      <w:r>
+        <w:rPr>
+          <w:lang w:val="en-GB"/>
+        </w:rPr>
+        <w:lastRenderedPageBreak/>
+        <w:drawing>
+          <wp:inline distT="0" distB="0" distL="0" distR="0" wp14:anchorId="29F24630" wp14:editId="6D1A21D0">
+            <wp:extent cx="3372321" cy="7792537"/>
+            <wp:effectExtent l="0" t="0" r="0" b="0"/>
+            <wp:docPr id="951696196" name="Bilde 1" descr="Et bilde som inneholder tekst, skjermbilde, meny, Font&#10;&#10;KI-generert innhold kan være feil."/>
+            <wp:cNvGraphicFramePr>
+              <a:graphicFrameLocks xmlns:a="http://schemas.openxmlformats.org/drawingml/2006/main" noChangeAspect="1"/>
+            </wp:cNvGraphicFramePr>
+            <a:graphic xmlns:a="http://schemas.openxmlformats.org/drawingml/2006/main">
+              <a:graphicData uri="http://schemas.openxmlformats.org/drawingml/2006/picture">
+                <pic:pic xmlns:pic="http://schemas.openxmlformats.org/drawingml/2006/picture">
+                  <pic:nvPicPr>
+                    <pic:cNvPr id="951696196" name="Bilde 1" descr="Et bilde som inneholder tekst, skjermbilde, meny, Font&#10;&#10;KI-generert innhold kan være feil."/>
+                    <pic:cNvPicPr/>
+                  </pic:nvPicPr>
+                  <pic:blipFill>
+                    <a:blip r:embed="rId10"/>
+                    <a:stretch>
+                      <a:fillRect/>
+                    </a:stretch>
+                  </pic:blipFill>
+                  <pic:spPr>
+                    <a:xfrm>
+                      <a:off x="0" y="0"/>
+                      <a:ext cx="3372321" cy="7792537"/>
+                    </a:xfrm>
+                    <a:prstGeom prst="rect">
+                      <a:avLst/>
+                    </a:prstGeom>
+                  </pic:spPr>
+                </pic:pic>
+              </a:graphicData>
+            </a:graphic>
+          </wp:inline>
+        </w:drawing>
+      </w:r>
+    </w:p>
+    <w:p>
+      <w:pPr>
+        <w:rPr>
+          <w:lang w:val="en-GB"/>
+        </w:rPr>
+      </w:pPr>
+      <w:r>
+        <w:rPr>
+          <w:lang w:val="en-GB"/>
+        </w:rPr>
+        <w:lastRenderedPageBreak/>
+        <w:drawing>
+          <wp:inline distT="0" distB="0" distL="0" distR="0" wp14:anchorId="2E9DDBB7" wp14:editId="79B93F3F">
+            <wp:extent cx="3753374" cy="4744112"/>
+            <wp:effectExtent l="0" t="0" r="0" b="0"/>
+            <wp:docPr id="1582664666" name="Bilde 1" descr="Et bilde som inneholder tekst, skjermbilde, Font, design&#10;&#10;KI-generert innhold kan være feil."/>
+            <wp:cNvGraphicFramePr>
+              <a:graphicFrameLocks xmlns:a="http://schemas.openxmlformats.org/drawingml/2006/main" noChangeAspect="1"/>
+            </wp:cNvGraphicFramePr>
+            <a:graphic xmlns:a="http://schemas.openxmlformats.org/drawingml/2006/main">
+              <a:graphicData uri="http://schemas.openxmlformats.org/drawingml/2006/picture">
+                <pic:pic xmlns:pic="http://schemas.openxmlformats.org/drawingml/2006/picture">
+                  <pic:nvPicPr>
+                    <pic:cNvPr id="1582664666" name="Bilde 1" descr="Et bilde som inneholder tekst, skjermbilde, Font, design&#10;&#10;KI-generert innhold kan være feil."/>
+                    <pic:cNvPicPr/>
+                  </pic:nvPicPr>
+                  <pic:blipFill>
+                    <a:blip r:embed="rId11"/>
+                    <a:stretch>
+                      <a:fillRect/>
+                    </a:stretch>
+                  </pic:blipFill>
+                  <pic:spPr>
+                    <a:xfrm>
+                      <a:off x="0" y="0"/>
+                      <a:ext cx="3753374" cy="4744112"/>
+                    </a:xfrm>
+                    <a:prstGeom prst="rect">
+                      <a:avLst/>
+                    </a:prstGeom>
+                  </pic:spPr>
+                </pic:pic>
+              </a:graphicData>
+            </a:graphic>
+          </wp:inline>
+        </w:drawing>
+      </w:r>
+    </w:p>
+    <w:p>
+      <w:pPr>
+        <w:rPr>
+          <w:lang w:val="en-GB"/>
+        </w:rPr>
+      </w:pPr>
+    </w:p>
+    <w:p>
+      <w:pPr>
+        <w:rPr>
+          <w:lang w:val="en-GB"/>
+        </w:rPr>
+      </w:pPr>
+    </w:p>
+    <w:p>
+      <w:pPr>
+        <w:rPr>
+          <w:lang w:val="en-GB"/>
+        </w:rPr>
+      </w:pPr>
+    </w:p>
+    <w:p>
+      <w:pPr>
+        <w:pStyle w:val="Overskrift1"/>
+        <w:rPr>
+          <w:lang w:val="en-GB"/>
+        </w:rPr>
+      </w:pPr>
+    </w:p>
+    <w:p>
+      <w:pPr>
+        <w:pStyle w:val="Overskrift1"/>
+        <w:rPr>
+          <w:lang w:val="en-GB"/>
+        </w:rPr>
+      </w:pPr>
+      <w:r>
+        <w:rPr>
+          <w:lang w:val="en-GB"/>
+        </w:rPr>
+        <w:t>Exercise 2: Investigate threadshold and level of parallelism.</w:t>
+      </w:r>
+    </w:p>
+    <w:p>
+      <w:pPr>
+        <w:pStyle w:val="Listeavsnitt"/>
+        <w:numPr>
+          <w:ilvl w:val="0"/>
+          <w:numId w:val="5"/>
+        </w:numPr>
+        <w:autoSpaceDE w:val="0"/>
+        <w:autoSpaceDN w:val="0"/>
+        <w:adjustRightInd w:val="0"/>
+        <w:spacing w:after="0" w:line="240" w:lineRule="auto"/>
+        <w:rPr>
+          <w:rFonts w:ascii="Times New Roman" w:eastAsia="CMR10" w:hAnsi="Times New Roman" w:cs="Times New Roman"/>
+          <w:kern w:val="0"/>
+        </w:rPr>
+      </w:pPr>
+      <w:r>
+        <w:rPr>
+          <w:rFonts w:ascii="Times New Roman" w:eastAsia="CMBX10" w:hAnsi="Times New Roman" w:cs="Times New Roman"/>
+          <w:kern w:val="0"/>
+        </w:rPr>
+        <w:t xml:space="preserve">(10 pts) </w:t>
+      </w:r>
+      <w:r>
+        <w:rPr>
+          <w:rFonts w:ascii="Times New Roman" w:eastAsia="CMR10" w:hAnsi="Times New Roman" w:cs="Times New Roman"/>
+          <w:kern w:val="0"/>
+        </w:rPr>
+        <w:t xml:space="preserve">Create a project and name it </w:t>
+      </w:r>
+      <w:r>
+        <w:rPr>
+          <w:rFonts w:ascii="Times New Roman" w:eastAsia="CMTT10" w:hAnsi="Times New Roman" w:cs="Times New Roman"/>
+          <w:kern w:val="0"/>
+        </w:rPr>
+        <w:t xml:space="preserve">Exercise </w:t>
+      </w:r>
+      <w:r>
+        <w:rPr>
+          <w:rFonts w:ascii="Times New Roman" w:eastAsia="CMR10" w:hAnsi="Times New Roman" w:cs="Times New Roman"/>
+          <w:kern w:val="0"/>
+        </w:rPr>
+        <w:t>for this exercise.</w:t>
+      </w:r>
+    </w:p>
+    <w:p>
+      <w:pPr>
+        <w:pStyle w:val="Listeavsnitt"/>
+        <w:numPr>
+          <w:ilvl w:val="0"/>
+          <w:numId w:val="5"/>
+        </w:numPr>
+        <w:autoSpaceDE w:val="0"/>
+        <w:autoSpaceDN w:val="0"/>
+        <w:adjustRightInd w:val="0"/>
+        <w:spacing w:after="0" w:line="240" w:lineRule="auto"/>
+        <w:rPr>
+          <w:rFonts w:ascii="Times New Roman" w:eastAsia="CMR10" w:hAnsi="Times New Roman" w:cs="Times New Roman"/>
+          <w:kern w:val="0"/>
+        </w:rPr>
+      </w:pPr>
+      <w:r>
+        <w:rPr>
+          <w:rFonts w:ascii="Times New Roman" w:eastAsia="CMBX10" w:hAnsi="Times New Roman" w:cs="Times New Roman"/>
+          <w:kern w:val="0"/>
+        </w:rPr>
+        <w:t xml:space="preserve">(10 pts) </w:t>
+      </w:r>
+      <w:r>
+        <w:rPr>
+          <w:rFonts w:ascii="Times New Roman" w:eastAsia="CMR10" w:hAnsi="Times New Roman" w:cs="Times New Roman"/>
+          <w:kern w:val="0"/>
+        </w:rPr>
+        <w:t xml:space="preserve">Complete the implementation of </w:t>
+      </w:r>
+      <w:r>
+        <w:rPr>
+          <w:rFonts w:ascii="Times New Roman" w:eastAsia="CMTT10" w:hAnsi="Times New Roman" w:cs="Times New Roman"/>
+          <w:kern w:val="0"/>
+        </w:rPr>
+        <w:t xml:space="preserve">Task </w:t>
+      </w:r>
+      <w:r>
+        <w:rPr>
+          <w:rFonts w:ascii="Times New Roman" w:eastAsia="CMR10" w:hAnsi="Times New Roman" w:cs="Times New Roman"/>
+          <w:kern w:val="0"/>
+        </w:rPr>
+        <w:t xml:space="preserve">class and </w:t>
+      </w:r>
+      <w:r>
+        <w:rPr>
+          <w:rFonts w:ascii="Times New Roman" w:eastAsia="CMTT10" w:hAnsi="Times New Roman" w:cs="Times New Roman"/>
+          <w:kern w:val="0"/>
+        </w:rPr>
+        <w:t xml:space="preserve">Main </w:t>
+      </w:r>
+      <w:r>
+        <w:rPr>
+          <w:rFonts w:ascii="Times New Roman" w:eastAsia="CMR10" w:hAnsi="Times New Roman" w:cs="Times New Roman"/>
+          <w:kern w:val="0"/>
+        </w:rPr>
+        <w:t>class.</w:t>
+      </w:r>
+    </w:p>
+    <w:p>
+      <w:pPr>
+        <w:pStyle w:val="Listeavsnitt"/>
+        <w:numPr>
+          <w:ilvl w:val="0"/>
+          <w:numId w:val="5"/>
+        </w:numPr>
+        <w:autoSpaceDE w:val="0"/>
+        <w:autoSpaceDN w:val="0"/>
+        <w:adjustRightInd w:val="0"/>
+        <w:spacing w:after="0" w:line="240" w:lineRule="auto"/>
+        <w:rPr>
+          <w:rFonts w:ascii="Times New Roman" w:eastAsia="CMR10" w:hAnsi="Times New Roman" w:cs="Times New Roman"/>
+          <w:kern w:val="0"/>
+        </w:rPr>
+      </w:pPr>
+      <w:r>
+        <w:rPr>
+          <w:rFonts w:ascii="Times New Roman" w:eastAsia="CMBX10" w:hAnsi="Times New Roman" w:cs="Times New Roman"/>
+          <w:kern w:val="0"/>
+        </w:rPr>
+        <w:t xml:space="preserve">(10 pts) </w:t>
+      </w:r>
+      <w:r>
+        <w:rPr>
+          <w:rFonts w:ascii="Times New Roman" w:eastAsia="CMR10" w:hAnsi="Times New Roman" w:cs="Times New Roman"/>
+          <w:kern w:val="0"/>
+        </w:rPr>
+        <w:t>Run your code with different values of Threshold and Level of Parallelism and add screenshots</w:t>
+      </w:r>
+      <w:r>
+        <w:rPr>
+          <w:rFonts w:ascii="Times New Roman" w:eastAsia="CMR10" w:hAnsi="Times New Roman" w:cs="Times New Roman"/>
+          <w:kern w:val="0"/>
+        </w:rPr>
+        <w:t xml:space="preserve"> </w:t>
+      </w:r>
+      <w:r>
+        <w:rPr>
+          <w:rFonts w:ascii="Times New Roman" w:eastAsia="CMR10" w:hAnsi="Times New Roman" w:cs="Times New Roman"/>
+          <w:kern w:val="0"/>
+        </w:rPr>
+        <w:t>to your report.</w:t>
+      </w:r>
+    </w:p>
+    <w:p>
+      <w:pPr>
+        <w:pStyle w:val="Listeavsnitt"/>
+        <w:numPr>
+          <w:ilvl w:val="0"/>
+          <w:numId w:val="5"/>
+        </w:numPr>
+        <w:autoSpaceDE w:val="0"/>
+        <w:autoSpaceDN w:val="0"/>
+        <w:adjustRightInd w:val="0"/>
+        <w:spacing w:after="0" w:line="240" w:lineRule="auto"/>
+        <w:rPr>
+          <w:rFonts w:ascii="Times New Roman" w:eastAsia="CMR10" w:hAnsi="Times New Roman" w:cs="Times New Roman"/>
+          <w:kern w:val="0"/>
+        </w:rPr>
+      </w:pPr>
+      <w:r>
+        <w:rPr>
+          <w:rFonts w:ascii="Times New Roman" w:eastAsia="CMBX10" w:hAnsi="Times New Roman" w:cs="Times New Roman"/>
+          <w:kern w:val="0"/>
+        </w:rPr>
+        <w:t xml:space="preserve">(10 pts) </w:t>
+      </w:r>
+      <w:r>
+        <w:rPr>
+          <w:rFonts w:ascii="Times New Roman" w:eastAsia="CMR10" w:hAnsi="Times New Roman" w:cs="Times New Roman"/>
+          <w:kern w:val="0"/>
+        </w:rPr>
+        <w:t>How the running time of the program varies with the above two arguments?</w:t>
+      </w:r>
+    </w:p>
+    <w:p>
+      <w:pPr>
+        <w:pStyle w:val="Listeavsnitt"/>
+        <w:numPr>
+          <w:ilvl w:val="0"/>
+          <w:numId w:val="5"/>
+        </w:numPr>
+        <w:autoSpaceDE w:val="0"/>
+        <w:autoSpaceDN w:val="0"/>
+        <w:adjustRightInd w:val="0"/>
+        <w:spacing w:after="0" w:line="240" w:lineRule="auto"/>
+        <w:rPr>
+          <w:rFonts w:ascii="Times New Roman" w:eastAsia="CMR10" w:hAnsi="Times New Roman" w:cs="Times New Roman"/>
+          <w:kern w:val="0"/>
+        </w:rPr>
+      </w:pPr>
+      <w:r>
+        <w:rPr>
+          <w:rFonts w:ascii="Times New Roman" w:eastAsia="CMBX10" w:hAnsi="Times New Roman" w:cs="Times New Roman"/>
+          <w:kern w:val="0"/>
+        </w:rPr>
+        <w:t xml:space="preserve">(10 pts) </w:t>
+      </w:r>
+      <w:r>
+        <w:rPr>
+          <w:rFonts w:ascii="Times New Roman" w:eastAsia="CMR10" w:hAnsi="Times New Roman" w:cs="Times New Roman"/>
+          <w:kern w:val="0"/>
+        </w:rPr>
+        <w:t xml:space="preserve">What happens when you set </w:t>
+      </w:r>
+      <w:r>
+        <w:rPr>
+          <w:rFonts w:ascii="Times New Roman" w:eastAsia="CMTT10" w:hAnsi="Times New Roman" w:cs="Times New Roman"/>
+          <w:kern w:val="0"/>
+        </w:rPr>
+        <w:t xml:space="preserve">paral level </w:t>
+      </w:r>
+      <w:r>
+        <w:rPr>
+          <w:rFonts w:ascii="Times New Roman" w:eastAsia="CMR10" w:hAnsi="Times New Roman" w:cs="Times New Roman"/>
+          <w:kern w:val="0"/>
+        </w:rPr>
+        <w:t>higher than the number of proccessors cores</w:t>
+      </w:r>
+      <w:r>
+        <w:rPr>
+          <w:rFonts w:ascii="Times New Roman" w:eastAsia="CMR10" w:hAnsi="Times New Roman" w:cs="Times New Roman"/>
+          <w:kern w:val="0"/>
+        </w:rPr>
+        <w:t xml:space="preserve"> </w:t>
+      </w:r>
+      <w:r>
+        <w:rPr>
+          <w:rFonts w:ascii="Times New Roman" w:eastAsia="CMR10" w:hAnsi="Times New Roman" w:cs="Times New Roman"/>
+          <w:kern w:val="0"/>
+        </w:rPr>
+        <w:t>available in your computer? Run the code with different settings and include the screenshots of the</w:t>
+      </w:r>
+      <w:r>
+        <w:rPr>
+          <w:rFonts w:ascii="Times New Roman" w:eastAsia="CMR10" w:hAnsi="Times New Roman" w:cs="Times New Roman"/>
+          <w:kern w:val="0"/>
+        </w:rPr>
+        <w:t xml:space="preserve"> </w:t>
+      </w:r>
+      <w:r>
+        <w:rPr>
+          <w:rFonts w:ascii="Times New Roman" w:eastAsia="CMR10" w:hAnsi="Times New Roman" w:cs="Times New Roman"/>
+          <w:kern w:val="0"/>
+        </w:rPr>
+        <w:t>output in your report to support your arguments.</w:t>
+      </w:r>
+    </w:p>
+    <w:p>
+      <w:pPr>
+        <w:pStyle w:val="Listeavsnitt"/>
+        <w:numPr>
+          <w:ilvl w:val="0"/>
+          <w:numId w:val="5"/>
+        </w:numPr>
+        <w:autoSpaceDE w:val="0"/>
+        <w:autoSpaceDN w:val="0"/>
+        <w:adjustRightInd w:val="0"/>
+        <w:spacing w:after="0" w:line="240" w:lineRule="auto"/>
+        <w:rPr>
+          <w:rFonts w:ascii="Times New Roman" w:eastAsia="CMR10" w:hAnsi="Times New Roman" w:cs="Times New Roman"/>
+          <w:kern w:val="0"/>
+        </w:rPr>
+      </w:pPr>
+      <w:r>
+        <w:rPr>
+          <w:rFonts w:ascii="Times New Roman" w:eastAsia="CMBX10" w:hAnsi="Times New Roman" w:cs="Times New Roman"/>
+          <w:kern w:val="0"/>
+        </w:rPr>
+        <w:t xml:space="preserve">(10 pts) </w:t>
+      </w:r>
+      <w:r>
+        <w:rPr>
+          <w:rFonts w:ascii="Times New Roman" w:eastAsia="CMR10" w:hAnsi="Times New Roman" w:cs="Times New Roman"/>
+          <w:kern w:val="0"/>
+        </w:rPr>
+        <w:t xml:space="preserve">Which values of </w:t>
+      </w:r>
+      <w:r>
+        <w:rPr>
+          <w:rFonts w:ascii="Times New Roman" w:eastAsia="CMTT10" w:hAnsi="Times New Roman" w:cs="Times New Roman"/>
+          <w:kern w:val="0"/>
+        </w:rPr>
+        <w:t xml:space="preserve">Threshold </w:t>
+      </w:r>
+      <w:r>
+        <w:rPr>
+          <w:rFonts w:ascii="Times New Roman" w:eastAsia="CMR10" w:hAnsi="Times New Roman" w:cs="Times New Roman"/>
+          <w:kern w:val="0"/>
+        </w:rPr>
+        <w:t xml:space="preserve">and </w:t>
+      </w:r>
+      <w:r>
+        <w:rPr>
+          <w:rFonts w:ascii="Times New Roman" w:eastAsia="CMTT10" w:hAnsi="Times New Roman" w:cs="Times New Roman"/>
+          <w:kern w:val="0"/>
+        </w:rPr>
+        <w:t xml:space="preserve">Level of Parallelism </w:t>
+      </w:r>
+      <w:r>
+        <w:rPr>
+          <w:rFonts w:ascii="Times New Roman" w:eastAsia="CMR10" w:hAnsi="Times New Roman" w:cs="Times New Roman"/>
+          <w:kern w:val="0"/>
+        </w:rPr>
+        <w:t>give you the (likely) shortest</w:t>
+      </w:r>
+      <w:r>
+        <w:rPr>
+          <w:rFonts w:ascii="Times New Roman" w:eastAsia="CMR10" w:hAnsi="Times New Roman" w:cs="Times New Roman"/>
+          <w:kern w:val="0"/>
+        </w:rPr>
+        <w:t xml:space="preserve"> </w:t>
+      </w:r>
+      <w:r>
+        <w:rPr>
+          <w:rFonts w:ascii="Times New Roman" w:eastAsia="CMR10" w:hAnsi="Times New Roman" w:cs="Times New Roman"/>
+          <w:kern w:val="0"/>
+        </w:rPr>
+        <w:t>running time?</w:t>
+      </w:r>
+    </w:p>
+    <w:p>
+      <w:pPr>
+        <w:pStyle w:val="Listeavsnitt"/>
+        <w:numPr>
+          <w:ilvl w:val="0"/>
+          <w:numId w:val="5"/>
+        </w:numPr>
+        <w:rPr>
+          <w:rFonts w:ascii="Times New Roman" w:hAnsi="Times New Roman" w:cs="Times New Roman"/>
+          <w:lang w:val="en-GB"/>
+        </w:rPr>
+      </w:pPr>
+      <w:r>
+        <w:rPr>
+          <w:rFonts w:ascii="Times New Roman" w:eastAsia="CMBX10" w:hAnsi="Times New Roman" w:cs="Times New Roman"/>
+        </w:rPr>
+        <w:t xml:space="preserve">(10 pts) </w:t>
+      </w:r>
+      <w:r>
+        <w:rPr>
+          <w:rFonts w:ascii="Times New Roman" w:hAnsi="Times New Roman" w:cs="Times New Roman"/>
+        </w:rPr>
+        <w:t>Use one AI tool to complete the implementation of Task class and</w:t>
+      </w:r>
     </w:p>
     <w:sectPr>
-      <w:headerReference w:type="default" r:id="rId7"/>
+      <w:headerReference w:type="default" r:id="rId12"/>
       <w:pgSz w:w="11906" w:h="16838"/>
       <w:pgMar w:top="1417" w:right="1417" w:bottom="1417" w:left="1417" w:header="708" w:footer="708" w:gutter="0"/>
       <w:cols w:space="708"/>
@@ -279,6 +1000,7 @@
         <w:docPartUnique/>
       </w:docPartObj>
     </w:sdtPr>
+    <w:sdtEndPr/>
     <w:sdtContent>
       <w:p>
         <w:pPr>
@@ -409,7 +1131,6 @@
     <w:lvl w:ilvl="0">
       <w:start w:val="1"/>
       <w:numFmt w:val="decimal"/>
-      <w:pStyle w:val="Overskrift1"/>
       <w:lvlText w:val="%1."/>
       <w:lvlJc w:val="left"/>
       <w:pPr>
@@ -422,7 +1143,6 @@
     <w:lvl w:ilvl="1">
       <w:start w:val="1"/>
       <w:numFmt w:val="decimal"/>
-      <w:pStyle w:val="Overskrift2"/>
       <w:lvlText w:val="%2."/>
       <w:lvlJc w:val="left"/>
       <w:pPr>
@@ -621,6 +1341,119 @@
       </w:pPr>
       <w:rPr>
         <w:rFonts w:hint="default"/>
+      </w:rPr>
+    </w:lvl>
+  </w:abstractNum>
+  <w:abstractNum w:abstractNumId="3" w15:restartNumberingAfterBreak="0">
+    <w:nsid w:val="6EAF004A"/>
+    <w:multiLevelType w:val="hybridMultilevel"/>
+    <w:tmpl w:val="D64467B2"/>
+    <w:lvl w:ilvl="0" w:tplc="131EECE0">
+      <w:start w:val="1"/>
+      <w:numFmt w:val="bullet"/>
+      <w:lvlText w:val="-"/>
+      <w:lvlJc w:val="left"/>
+      <w:pPr>
+        <w:ind w:left="720" w:hanging="360"/>
+      </w:pPr>
+      <w:rPr>
+        <w:rFonts w:ascii="Times New Roman" w:eastAsia="CMBX10" w:hAnsi="Times New Roman" w:cs="Times New Roman" w:hint="default"/>
+      </w:rPr>
+    </w:lvl>
+    <w:lvl w:ilvl="1" w:tplc="04140003" w:tentative="1">
+      <w:start w:val="1"/>
+      <w:numFmt w:val="bullet"/>
+      <w:lvlText w:val="o"/>
+      <w:lvlJc w:val="left"/>
+      <w:pPr>
+        <w:ind w:left="1440" w:hanging="360"/>
+      </w:pPr>
+      <w:rPr>
+        <w:rFonts w:ascii="Courier New" w:hAnsi="Courier New" w:cs="Courier New" w:hint="default"/>
+      </w:rPr>
+    </w:lvl>
+    <w:lvl w:ilvl="2" w:tplc="04140005" w:tentative="1">
+      <w:start w:val="1"/>
+      <w:numFmt w:val="bullet"/>
+      <w:lvlText w:val=""/>
+      <w:lvlJc w:val="left"/>
+      <w:pPr>
+        <w:ind w:left="2160" w:hanging="360"/>
+      </w:pPr>
+      <w:rPr>
+        <w:rFonts w:ascii="Wingdings" w:hAnsi="Wingdings" w:hint="default"/>
+      </w:rPr>
+    </w:lvl>
+    <w:lvl w:ilvl="3" w:tplc="04140001" w:tentative="1">
+      <w:start w:val="1"/>
+      <w:numFmt w:val="bullet"/>
+      <w:lvlText w:val=""/>
+      <w:lvlJc w:val="left"/>
+      <w:pPr>
+        <w:ind w:left="2880" w:hanging="360"/>
+      </w:pPr>
+      <w:rPr>
+        <w:rFonts w:ascii="Symbol" w:hAnsi="Symbol" w:hint="default"/>
+      </w:rPr>
+    </w:lvl>
+    <w:lvl w:ilvl="4" w:tplc="04140003" w:tentative="1">
+      <w:start w:val="1"/>
+      <w:numFmt w:val="bullet"/>
+      <w:lvlText w:val="o"/>
+      <w:lvlJc w:val="left"/>
+      <w:pPr>
+        <w:ind w:left="3600" w:hanging="360"/>
+      </w:pPr>
+      <w:rPr>
+        <w:rFonts w:ascii="Courier New" w:hAnsi="Courier New" w:cs="Courier New" w:hint="default"/>
+      </w:rPr>
+    </w:lvl>
+    <w:lvl w:ilvl="5" w:tplc="04140005" w:tentative="1">
+      <w:start w:val="1"/>
+      <w:numFmt w:val="bullet"/>
+      <w:lvlText w:val=""/>
+      <w:lvlJc w:val="left"/>
+      <w:pPr>
+        <w:ind w:left="4320" w:hanging="360"/>
+      </w:pPr>
+      <w:rPr>
+        <w:rFonts w:ascii="Wingdings" w:hAnsi="Wingdings" w:hint="default"/>
+      </w:rPr>
+    </w:lvl>
+    <w:lvl w:ilvl="6" w:tplc="04140001" w:tentative="1">
+      <w:start w:val="1"/>
+      <w:numFmt w:val="bullet"/>
+      <w:lvlText w:val=""/>
+      <w:lvlJc w:val="left"/>
+      <w:pPr>
+        <w:ind w:left="5040" w:hanging="360"/>
+      </w:pPr>
+      <w:rPr>
+        <w:rFonts w:ascii="Symbol" w:hAnsi="Symbol" w:hint="default"/>
+      </w:rPr>
+    </w:lvl>
+    <w:lvl w:ilvl="7" w:tplc="04140003" w:tentative="1">
+      <w:start w:val="1"/>
+      <w:numFmt w:val="bullet"/>
+      <w:lvlText w:val="o"/>
+      <w:lvlJc w:val="left"/>
+      <w:pPr>
+        <w:ind w:left="5760" w:hanging="360"/>
+      </w:pPr>
+      <w:rPr>
+        <w:rFonts w:ascii="Courier New" w:hAnsi="Courier New" w:cs="Courier New" w:hint="default"/>
+      </w:rPr>
+    </w:lvl>
+    <w:lvl w:ilvl="8" w:tplc="04140005" w:tentative="1">
+      <w:start w:val="1"/>
+      <w:numFmt w:val="bullet"/>
+      <w:lvlText w:val=""/>
+      <w:lvlJc w:val="left"/>
+      <w:pPr>
+        <w:ind w:left="6480" w:hanging="360"/>
+      </w:pPr>
+      <w:rPr>
+        <w:rFonts w:ascii="Wingdings" w:hAnsi="Wingdings" w:hint="default"/>
       </w:rPr>
     </w:lvl>
   </w:abstractNum>
@@ -662,6 +1495,9 @@
     <w:lvlOverride w:ilvl="8">
       <w:startOverride w:val="1"/>
     </w:lvlOverride>
+  </w:num>
+  <w:num w:numId="5" w16cid:durableId="1643996506">
+    <w:abstractNumId w:val="3"/>
   </w:num>
 </w:numbering>
 </file>
@@ -1075,22 +1911,19 @@
     <w:autoRedefine/>
     <w:uiPriority w:val="9"/>
     <w:qFormat/>
-    <w:rsid w:val="002C6CDD"/>
+    <w:rsid w:val="005231AE"/>
     <w:pPr>
       <w:keepNext/>
       <w:keepLines/>
-      <w:numPr>
-        <w:numId w:val="3"/>
-      </w:numPr>
       <w:spacing w:before="360" w:after="120" w:line="240" w:lineRule="auto"/>
-      <w:ind w:left="360" w:right="360" w:hanging="360"/>
+      <w:ind w:right="360"/>
       <w:outlineLvl w:val="0"/>
     </w:pPr>
     <w:rPr>
-      <w:rFonts w:ascii="Arial" w:eastAsiaTheme="majorEastAsia" w:hAnsi="Arial" w:cstheme="majorBidi"/>
+      <w:rFonts w:ascii="Times New Roman" w:eastAsiaTheme="majorEastAsia" w:hAnsi="Times New Roman" w:cs="Times New Roman"/>
       <w:kern w:val="0"/>
-      <w:sz w:val="40"/>
-      <w:szCs w:val="40"/>
+      <w:sz w:val="32"/>
+      <w:szCs w:val="32"/>
       <w:lang w:eastAsia="nb-NO"/>
       <w14:ligatures w14:val="none"/>
     </w:rPr>
@@ -1105,19 +1938,14 @@
     <w:uiPriority w:val="9"/>
     <w:unhideWhenUsed/>
     <w:qFormat/>
-    <w:rsid w:val="002C6CDD"/>
+    <w:rsid w:val="005231AE"/>
     <w:pPr>
-      <w:numPr>
-        <w:ilvl w:val="1"/>
-        <w:numId w:val="4"/>
-      </w:numPr>
       <w:spacing w:before="165" w:after="90"/>
-      <w:ind w:left="585" w:hanging="585"/>
       <w:outlineLvl w:val="1"/>
     </w:pPr>
     <w:rPr>
-      <w:sz w:val="32"/>
-      <w:szCs w:val="32"/>
+      <w:sz w:val="28"/>
+      <w:szCs w:val="28"/>
     </w:rPr>
   </w:style>
   <w:style w:type="paragraph" w:styleId="Overskrift3">
@@ -1307,12 +2135,12 @@
     <w:basedOn w:val="Standardskriftforavsnitt"/>
     <w:link w:val="Overskrift2"/>
     <w:uiPriority w:val="9"/>
-    <w:rsid w:val="002C6CDD"/>
+    <w:rsid w:val="005231AE"/>
     <w:rPr>
       <w:rFonts w:ascii="Arial" w:eastAsiaTheme="majorEastAsia" w:hAnsi="Arial" w:cstheme="majorBidi"/>
       <w:kern w:val="0"/>
-      <w:sz w:val="32"/>
-      <w:szCs w:val="32"/>
+      <w:sz w:val="28"/>
+      <w:szCs w:val="28"/>
       <w:lang w:eastAsia="nb-NO"/>
       <w14:ligatures w14:val="none"/>
     </w:rPr>
@@ -1323,12 +2151,12 @@
     <w:basedOn w:val="Standardskriftforavsnitt"/>
     <w:link w:val="Overskrift1"/>
     <w:uiPriority w:val="9"/>
-    <w:rsid w:val="002C6CDD"/>
-    <w:rPr>
-      <w:rFonts w:ascii="Arial" w:eastAsiaTheme="majorEastAsia" w:hAnsi="Arial" w:cstheme="majorBidi"/>
+    <w:rsid w:val="005231AE"/>
+    <w:rPr>
+      <w:rFonts w:ascii="Times New Roman" w:eastAsiaTheme="majorEastAsia" w:hAnsi="Times New Roman" w:cs="Times New Roman"/>
       <w:kern w:val="0"/>
-      <w:sz w:val="40"/>
-      <w:szCs w:val="40"/>
+      <w:sz w:val="32"/>
+      <w:szCs w:val="32"/>
       <w:lang w:eastAsia="nb-NO"/>
       <w14:ligatures w14:val="none"/>
     </w:rPr>
@@ -1639,6 +2467,29 @@
     <w:link w:val="Bunntekst"/>
     <w:uiPriority w:val="99"/>
     <w:rsid w:val="007D2C53"/>
+  </w:style>
+  <w:style w:type="character" w:styleId="Hyperkobling">
+    <w:name w:val="Hyperlink"/>
+    <w:basedOn w:val="Standardskriftforavsnitt"/>
+    <w:uiPriority w:val="99"/>
+    <w:unhideWhenUsed/>
+    <w:rsid w:val="000F62D0"/>
+    <w:rPr>
+      <w:color w:val="467886" w:themeColor="hyperlink"/>
+      <w:u w:val="single"/>
+    </w:rPr>
+  </w:style>
+  <w:style w:type="character" w:styleId="Ulstomtale">
+    <w:name w:val="Unresolved Mention"/>
+    <w:basedOn w:val="Standardskriftforavsnitt"/>
+    <w:uiPriority w:val="99"/>
+    <w:semiHidden/>
+    <w:unhideWhenUsed/>
+    <w:rsid w:val="000F62D0"/>
+    <w:rPr>
+      <w:color w:val="605E5C"/>
+      <w:shd w:val="clear" w:color="auto" w:fill="E1DFDD"/>
+    </w:rPr>
   </w:style>
 </w:styles>
 </file>

</xml_diff>

<commit_message>
lab4: Finished exercise 1, and created number 2
</commit_message>
<xml_diff>
--- a/lab4/lab4_report.docx
+++ b/lab4/lab4_report.docx
@@ -12,8 +12,6 @@
         <w:outlineLvl w:val="0"/>
         <w:rPr>
           <w:rFonts w:ascii="Times New Roman" w:eastAsiaTheme="majorEastAsia" w:hAnsi="Times New Roman" w:cs="Times New Roman"/>
-          <w:b/>
-          <w:bCs/>
           <w:kern w:val="0"/>
           <w:sz w:val="28"/>
           <w:szCs w:val="28"/>
@@ -24,8 +22,6 @@
       <w:r>
         <w:rPr>
           <w:rFonts w:ascii="Times New Roman" w:eastAsiaTheme="majorEastAsia" w:hAnsi="Times New Roman" w:cs="Times New Roman"/>
-          <w:b/>
-          <w:bCs/>
           <w:kern w:val="0"/>
           <w:sz w:val="28"/>
           <w:szCs w:val="28"/>
@@ -45,8 +41,6 @@
         <w:outlineLvl w:val="0"/>
         <w:rPr>
           <w:rFonts w:ascii="Times New Roman" w:eastAsiaTheme="majorEastAsia" w:hAnsi="Times New Roman" w:cs="Times New Roman"/>
-          <w:b/>
-          <w:bCs/>
           <w:kern w:val="0"/>
           <w:sz w:val="28"/>
           <w:szCs w:val="28"/>
@@ -57,15 +51,37 @@
       <w:r>
         <w:rPr>
           <w:rFonts w:ascii="Times New Roman" w:eastAsiaTheme="majorEastAsia" w:hAnsi="Times New Roman" w:cs="Times New Roman"/>
-          <w:b/>
-          <w:bCs/>
           <w:kern w:val="0"/>
           <w:sz w:val="28"/>
           <w:szCs w:val="28"/>
           <w:lang w:val="en-GB" w:eastAsia="nb-NO"/>
           <w14:ligatures w14:val="none"/>
         </w:rPr>
-        <w:t>Report for Lab 4: ForkJoin Framework</w:t>
+        <w:t xml:space="preserve">Report for Lab 4: </w:t>
+      </w:r>
+      <w:proofErr w:type="spellStart"/>
+      <w:r>
+        <w:rPr>
+          <w:rFonts w:ascii="Times New Roman" w:eastAsiaTheme="majorEastAsia" w:hAnsi="Times New Roman" w:cs="Times New Roman"/>
+          <w:kern w:val="0"/>
+          <w:sz w:val="28"/>
+          <w:szCs w:val="28"/>
+          <w:lang w:val="en-GB" w:eastAsia="nb-NO"/>
+          <w14:ligatures w14:val="none"/>
+        </w:rPr>
+        <w:t>ForkJoin</w:t>
+      </w:r>
+      <w:proofErr w:type="spellEnd"/>
+      <w:r>
+        <w:rPr>
+          <w:rFonts w:ascii="Times New Roman" w:eastAsiaTheme="majorEastAsia" w:hAnsi="Times New Roman" w:cs="Times New Roman"/>
+          <w:kern w:val="0"/>
+          <w:sz w:val="28"/>
+          <w:szCs w:val="28"/>
+          <w:lang w:val="en-GB" w:eastAsia="nb-NO"/>
+          <w14:ligatures w14:val="none"/>
+        </w:rPr>
+        <w:t xml:space="preserve"> Framework</w:t>
       </w:r>
     </w:p>
     <w:p>
@@ -78,8 +94,6 @@
         <w:outlineLvl w:val="0"/>
         <w:rPr>
           <w:rFonts w:ascii="Times New Roman" w:eastAsiaTheme="majorEastAsia" w:hAnsi="Times New Roman" w:cs="Times New Roman"/>
-          <w:b/>
-          <w:bCs/>
           <w:kern w:val="0"/>
           <w:sz w:val="28"/>
           <w:szCs w:val="28"/>
@@ -90,8 +104,6 @@
       <w:r>
         <w:rPr>
           <w:rFonts w:ascii="Times New Roman" w:eastAsiaTheme="majorEastAsia" w:hAnsi="Times New Roman" w:cs="Times New Roman"/>
-          <w:b/>
-          <w:bCs/>
           <w:kern w:val="0"/>
           <w:sz w:val="28"/>
           <w:szCs w:val="28"/>
@@ -111,8 +123,6 @@
         <w:outlineLvl w:val="0"/>
         <w:rPr>
           <w:rFonts w:ascii="Times New Roman" w:eastAsiaTheme="majorEastAsia" w:hAnsi="Times New Roman" w:cs="Times New Roman"/>
-          <w:b/>
-          <w:bCs/>
           <w:kern w:val="0"/>
           <w:sz w:val="28"/>
           <w:szCs w:val="28"/>
@@ -123,8 +133,6 @@
       <w:r>
         <w:rPr>
           <w:rFonts w:ascii="Times New Roman" w:eastAsiaTheme="majorEastAsia" w:hAnsi="Times New Roman" w:cs="Times New Roman"/>
-          <w:b/>
-          <w:bCs/>
           <w:kern w:val="0"/>
           <w:sz w:val="28"/>
           <w:szCs w:val="28"/>
@@ -175,22 +183,29 @@
         <w:rPr>
           <w:lang w:val="en-GB"/>
         </w:rPr>
-        <w:t>1.1: Review code to see how to implement tasks in Forkjoin</w:t>
-      </w:r>
+        <w:t xml:space="preserve">1.1: Review code to see how to implement tasks in </w:t>
+      </w:r>
+      <w:proofErr w:type="spellStart"/>
+      <w:r>
+        <w:rPr>
+          <w:lang w:val="en-GB"/>
+        </w:rPr>
+        <w:t>Forkjoin</w:t>
+      </w:r>
+      <w:proofErr w:type="spellEnd"/>
     </w:p>
     <w:p>
       <w:pPr>
-        <w:rPr>
-          <w:rFonts w:ascii="Times New Roman" w:hAnsi="Times New Roman" w:cs="Times New Roman"/>
-          <w:lang w:val="en-GB"/>
-        </w:rPr>
-      </w:pPr>
-      <w:r>
-        <w:rPr>
-          <w:rFonts w:ascii="Times New Roman" w:hAnsi="Times New Roman" w:cs="Times New Roman"/>
-          <w:lang w:val="en-GB"/>
-        </w:rPr>
-        <w:t>In the Fork/Join framework, parallel work is implemented by extending either RecursiveTask&lt;T&gt; (when a result is returned) or RecursiveAction (when no result is returned), and overriding compute() with a threshold-based strategy. If the assigned range is small, the code performs the work directly; otherwise, it splits the range into two subtasks, calls fork() on one or both, then calls join() and combines results when needed.</w:t>
+        <w:pStyle w:val="Overskrift2"/>
+        <w:rPr>
+          <w:lang w:val="en-GB"/>
+        </w:rPr>
+      </w:pPr>
+      <w:r>
+        <w:rPr>
+          <w:lang w:val="en-GB"/>
+        </w:rPr>
+        <w:t>Demo Recursive Task:</w:t>
       </w:r>
     </w:p>
     <w:p>
@@ -205,7 +220,23 @@
           <w:rFonts w:ascii="Times New Roman" w:hAnsi="Times New Roman" w:cs="Times New Roman"/>
           <w:lang w:val="en-GB"/>
         </w:rPr>
-        <w:t>In Task.java, the code uses a RecursiveTask&lt;Double&gt; to sum product prices by splitting the index range and combining partial sums. In Task.java, the code uses a RecursiveAction to update product prices in-place using the same split/fork/join pattern.</w:t>
+        <w:t xml:space="preserve">Task.java extends </w:t>
+      </w:r>
+      <w:proofErr w:type="spellStart"/>
+      <w:r>
+        <w:rPr>
+          <w:rFonts w:ascii="Times New Roman" w:hAnsi="Times New Roman" w:cs="Times New Roman"/>
+          <w:lang w:val="en-GB"/>
+        </w:rPr>
+        <w:t>RecursiveTask</w:t>
+      </w:r>
+      <w:proofErr w:type="spellEnd"/>
+      <w:r>
+        <w:rPr>
+          <w:rFonts w:ascii="Times New Roman" w:hAnsi="Times New Roman" w:cs="Times New Roman"/>
+          <w:lang w:val="en-GB"/>
+        </w:rPr>
+        <w:t>&lt;Double&gt; and implements compute() using the usual pattern: if the assigned index range is small, it sums prices directly in a loop; if it’s large, it splits the range into two subtasks, forks one, computes the other, then combines the two results.</w:t>
       </w:r>
     </w:p>
     <w:p>
@@ -220,7 +251,55 @@
           <w:rFonts w:ascii="Times New Roman" w:hAnsi="Times New Roman" w:cs="Times New Roman"/>
           <w:lang w:val="en-GB"/>
         </w:rPr>
-        <w:t>Execution is handled by creating or obtaining a ForkJoinPool and submitting the root task. The demo mains use the shared ForkJoinPool.commonPool() with pool.execute(task) (Main.java, Main.java), while the simpler examples create a dedicated pool with new ForkJoinPool() and run synchronously using pool.invoke(task) (Main.java, Main.java).</w:t>
+        <w:t xml:space="preserve">The pool usage is in Main.java. Main creates a big product list, builds one root Task for the full range, runs it in </w:t>
+      </w:r>
+      <w:proofErr w:type="spellStart"/>
+      <w:r>
+        <w:rPr>
+          <w:rFonts w:ascii="Times New Roman" w:hAnsi="Times New Roman" w:cs="Times New Roman"/>
+          <w:lang w:val="en-GB"/>
+        </w:rPr>
+        <w:t>ForkJoinPool.commonPool</w:t>
+      </w:r>
+      <w:proofErr w:type="spellEnd"/>
+      <w:r>
+        <w:rPr>
+          <w:rFonts w:ascii="Times New Roman" w:hAnsi="Times New Roman" w:cs="Times New Roman"/>
+          <w:lang w:val="en-GB"/>
+        </w:rPr>
+        <w:t xml:space="preserve">() via </w:t>
+      </w:r>
+      <w:proofErr w:type="spellStart"/>
+      <w:r>
+        <w:rPr>
+          <w:rFonts w:ascii="Times New Roman" w:hAnsi="Times New Roman" w:cs="Times New Roman"/>
+          <w:lang w:val="en-GB"/>
+        </w:rPr>
+        <w:t>pool.execute</w:t>
+      </w:r>
+      <w:proofErr w:type="spellEnd"/>
+      <w:r>
+        <w:rPr>
+          <w:rFonts w:ascii="Times New Roman" w:hAnsi="Times New Roman" w:cs="Times New Roman"/>
+          <w:lang w:val="en-GB"/>
+        </w:rPr>
+        <w:t>(task), waits until it’s done, then reads the final sum from the task (</w:t>
+      </w:r>
+      <w:proofErr w:type="spellStart"/>
+      <w:r>
+        <w:rPr>
+          <w:rFonts w:ascii="Times New Roman" w:hAnsi="Times New Roman" w:cs="Times New Roman"/>
+          <w:lang w:val="en-GB"/>
+        </w:rPr>
+        <w:t>task.get</w:t>
+      </w:r>
+      <w:proofErr w:type="spellEnd"/>
+      <w:r>
+        <w:rPr>
+          <w:rFonts w:ascii="Times New Roman" w:hAnsi="Times New Roman" w:cs="Times New Roman"/>
+          <w:lang w:val="en-GB"/>
+        </w:rPr>
+        <w:t>()) and shuts the pool down.</w:t>
       </w:r>
     </w:p>
     <w:p>
@@ -234,48 +313,249 @@
         <w:rPr>
           <w:lang w:val="en-GB"/>
         </w:rPr>
-        <w:t>1.2: Run code and include screenshots</w:t>
-      </w:r>
-      <w:r>
-        <w:rPr>
-          <w:lang w:val="en-GB"/>
-        </w:rPr>
-        <w:t xml:space="preserve"> (</w:t>
-      </w:r>
-      <w:r>
-        <w:rPr>
-          <w:lang w:val="en-GB"/>
-        </w:rPr>
-        <w:t>5</w:t>
-      </w:r>
-      <w:r>
-        <w:rPr>
-          <w:lang w:val="en-GB"/>
-        </w:rPr>
-        <w:t xml:space="preserve"> Screenshots)</w:t>
+        <w:t>Demo Recursive Action:</w:t>
       </w:r>
     </w:p>
     <w:p>
       <w:pPr>
         <w:rPr>
-          <w:lang w:val="en-GB"/>
-        </w:rPr>
-      </w:pPr>
-      <w:r>
-        <w:rPr>
-          <w:lang w:val="en-GB"/>
-        </w:rPr>
-        <w:t>Demo_recursive_action (2 screenshots):</w:t>
+          <w:rFonts w:ascii="Times New Roman" w:hAnsi="Times New Roman" w:cs="Times New Roman"/>
+          <w:lang w:val="en-GB"/>
+        </w:rPr>
+      </w:pPr>
+      <w:r>
+        <w:rPr>
+          <w:rFonts w:ascii="Times New Roman" w:hAnsi="Times New Roman" w:cs="Times New Roman"/>
+          <w:lang w:val="en-GB"/>
+        </w:rPr>
+        <w:t xml:space="preserve">Task.java extends </w:t>
+      </w:r>
+      <w:proofErr w:type="spellStart"/>
+      <w:r>
+        <w:rPr>
+          <w:rFonts w:ascii="Times New Roman" w:hAnsi="Times New Roman" w:cs="Times New Roman"/>
+          <w:lang w:val="en-GB"/>
+        </w:rPr>
+        <w:t>RecursiveAction</w:t>
+      </w:r>
+      <w:proofErr w:type="spellEnd"/>
+      <w:r>
+        <w:rPr>
+          <w:rFonts w:ascii="Times New Roman" w:hAnsi="Times New Roman" w:cs="Times New Roman"/>
+          <w:lang w:val="en-GB"/>
+        </w:rPr>
+        <w:t xml:space="preserve"> and overrides compute(). If the assigned range is </w:t>
+      </w:r>
+      <w:r>
+        <w:rPr>
+          <w:rFonts w:ascii="Times New Roman" w:hAnsi="Times New Roman" w:cs="Times New Roman"/>
+          <w:lang w:val="en-GB"/>
+        </w:rPr>
+        <w:t>small,</w:t>
+      </w:r>
+      <w:r>
+        <w:rPr>
+          <w:rFonts w:ascii="Times New Roman" w:hAnsi="Times New Roman" w:cs="Times New Roman"/>
+          <w:lang w:val="en-GB"/>
+        </w:rPr>
+        <w:t xml:space="preserve"> it updates prices directly; </w:t>
+      </w:r>
+      <w:r>
+        <w:rPr>
+          <w:rFonts w:ascii="Times New Roman" w:hAnsi="Times New Roman" w:cs="Times New Roman"/>
+          <w:lang w:val="en-GB"/>
+        </w:rPr>
+        <w:t>otherwise,</w:t>
+      </w:r>
+      <w:r>
+        <w:rPr>
+          <w:rFonts w:ascii="Times New Roman" w:hAnsi="Times New Roman" w:cs="Times New Roman"/>
+          <w:lang w:val="en-GB"/>
+        </w:rPr>
+        <w:t xml:space="preserve"> it splits the range into two new Tasks and runs them in parallel using fork() + join()</w:t>
+      </w:r>
+      <w:r>
+        <w:rPr>
+          <w:rFonts w:ascii="Times New Roman" w:hAnsi="Times New Roman" w:cs="Times New Roman"/>
+          <w:lang w:val="en-GB"/>
+        </w:rPr>
+        <w:t xml:space="preserve">, </w:t>
+      </w:r>
+      <w:r>
+        <w:rPr>
+          <w:rFonts w:ascii="Times New Roman" w:hAnsi="Times New Roman" w:cs="Times New Roman"/>
+          <w:lang w:val="en-GB"/>
+        </w:rPr>
+        <w:t xml:space="preserve">or </w:t>
+      </w:r>
+      <w:proofErr w:type="spellStart"/>
+      <w:r>
+        <w:rPr>
+          <w:rFonts w:ascii="Times New Roman" w:hAnsi="Times New Roman" w:cs="Times New Roman"/>
+          <w:lang w:val="en-GB"/>
+        </w:rPr>
+        <w:t>invokeAll</w:t>
+      </w:r>
+      <w:proofErr w:type="spellEnd"/>
+      <w:r>
+        <w:rPr>
+          <w:rFonts w:ascii="Times New Roman" w:hAnsi="Times New Roman" w:cs="Times New Roman"/>
+          <w:lang w:val="en-GB"/>
+        </w:rPr>
+        <w:t>, shown as an alternative.</w:t>
       </w:r>
     </w:p>
     <w:p>
       <w:pPr>
         <w:rPr>
-          <w:lang w:val="en-GB"/>
-        </w:rPr>
-      </w:pPr>
-      <w:r>
-        <w:rPr>
+          <w:rFonts w:ascii="Times New Roman" w:hAnsi="Times New Roman" w:cs="Times New Roman"/>
+          <w:lang w:val="en-GB"/>
+        </w:rPr>
+      </w:pPr>
+      <w:r>
+        <w:rPr>
+          <w:rFonts w:ascii="Times New Roman" w:hAnsi="Times New Roman" w:cs="Times New Roman"/>
+          <w:lang w:val="en-GB"/>
+        </w:rPr>
+        <w:t xml:space="preserve">The pool usage is in </w:t>
+      </w:r>
+      <w:r>
+        <w:rPr>
+          <w:rFonts w:ascii="Times New Roman" w:hAnsi="Times New Roman" w:cs="Times New Roman"/>
+          <w:lang w:val="en-GB"/>
+        </w:rPr>
+        <w:t>Main.java</w:t>
+      </w:r>
+      <w:r>
+        <w:rPr>
+          <w:rFonts w:ascii="Times New Roman" w:hAnsi="Times New Roman" w:cs="Times New Roman"/>
+          <w:lang w:val="en-GB"/>
+        </w:rPr>
+        <w:t xml:space="preserve">. It uses </w:t>
+      </w:r>
+      <w:proofErr w:type="spellStart"/>
+      <w:r>
+        <w:rPr>
+          <w:rFonts w:ascii="Times New Roman" w:hAnsi="Times New Roman" w:cs="Times New Roman"/>
+          <w:lang w:val="en-GB"/>
+        </w:rPr>
+        <w:t>ForkJoinPool.commonPool</w:t>
+      </w:r>
+      <w:proofErr w:type="spellEnd"/>
+      <w:r>
+        <w:rPr>
+          <w:rFonts w:ascii="Times New Roman" w:hAnsi="Times New Roman" w:cs="Times New Roman"/>
+          <w:lang w:val="en-GB"/>
+        </w:rPr>
+        <w:t xml:space="preserve">() to get a pool, submits the task with </w:t>
+      </w:r>
+      <w:proofErr w:type="spellStart"/>
+      <w:r>
+        <w:rPr>
+          <w:rFonts w:ascii="Times New Roman" w:hAnsi="Times New Roman" w:cs="Times New Roman"/>
+          <w:lang w:val="en-GB"/>
+        </w:rPr>
+        <w:t>pool.execute</w:t>
+      </w:r>
+      <w:proofErr w:type="spellEnd"/>
+      <w:r>
+        <w:rPr>
+          <w:rFonts w:ascii="Times New Roman" w:hAnsi="Times New Roman" w:cs="Times New Roman"/>
+          <w:lang w:val="en-GB"/>
+        </w:rPr>
+        <w:t xml:space="preserve">(task), waits until the task is done, then calls </w:t>
+      </w:r>
+      <w:proofErr w:type="spellStart"/>
+      <w:r>
+        <w:rPr>
+          <w:rFonts w:ascii="Times New Roman" w:hAnsi="Times New Roman" w:cs="Times New Roman"/>
+          <w:lang w:val="en-GB"/>
+        </w:rPr>
+        <w:t>pool.shutdown</w:t>
+      </w:r>
+      <w:proofErr w:type="spellEnd"/>
+      <w:r>
+        <w:rPr>
+          <w:rFonts w:ascii="Times New Roman" w:hAnsi="Times New Roman" w:cs="Times New Roman"/>
+          <w:lang w:val="en-GB"/>
+        </w:rPr>
+        <w:t>().</w:t>
+      </w:r>
+    </w:p>
+    <w:p>
+      <w:pPr>
+        <w:rPr>
+          <w:lang w:val="en-GB"/>
+        </w:rPr>
+      </w:pPr>
+    </w:p>
+    <w:p>
+      <w:pPr>
+        <w:pStyle w:val="Overskrift2"/>
+        <w:rPr>
+          <w:lang w:val="en-GB"/>
+        </w:rPr>
+      </w:pPr>
+      <w:r>
+        <w:rPr>
+          <w:lang w:val="en-GB"/>
+        </w:rPr>
+        <w:t>1.2: Run code and include screenshots</w:t>
+      </w:r>
+      <w:r>
+        <w:rPr>
+          <w:lang w:val="en-GB"/>
+        </w:rPr>
+        <w:t xml:space="preserve"> (</w:t>
+      </w:r>
+      <w:r>
+        <w:rPr>
+          <w:lang w:val="en-GB"/>
+        </w:rPr>
+        <w:t>5</w:t>
+      </w:r>
+      <w:r>
+        <w:rPr>
+          <w:lang w:val="en-GB"/>
+        </w:rPr>
+        <w:t xml:space="preserve"> Screenshots)</w:t>
+      </w:r>
+    </w:p>
+    <w:p>
+      <w:pPr>
+        <w:rPr>
+          <w:rFonts w:ascii="Times New Roman" w:hAnsi="Times New Roman" w:cs="Times New Roman"/>
+          <w:lang w:val="en-GB"/>
+        </w:rPr>
+      </w:pPr>
+      <w:proofErr w:type="spellStart"/>
+      <w:r>
+        <w:rPr>
+          <w:rFonts w:ascii="Times New Roman" w:hAnsi="Times New Roman" w:cs="Times New Roman"/>
+          <w:lang w:val="en-GB"/>
+        </w:rPr>
+        <w:t>Demo_recursive_action</w:t>
+      </w:r>
+      <w:proofErr w:type="spellEnd"/>
+      <w:r>
+        <w:rPr>
+          <w:rFonts w:ascii="Times New Roman" w:hAnsi="Times New Roman" w:cs="Times New Roman"/>
+          <w:lang w:val="en-GB"/>
+        </w:rPr>
+        <w:t xml:space="preserve"> (2 screenshots):</w:t>
+      </w:r>
+    </w:p>
+    <w:p>
+      <w:pPr>
+        <w:rPr>
+          <w:rFonts w:ascii="Times New Roman" w:hAnsi="Times New Roman" w:cs="Times New Roman"/>
+          <w:lang w:val="en-GB"/>
+        </w:rPr>
+      </w:pPr>
+      <w:r>
+        <w:rPr>
+          <w:rFonts w:ascii="Times New Roman" w:hAnsi="Times New Roman" w:cs="Times New Roman"/>
+          <w:noProof/>
           <w:lang w:val="en-GB"/>
         </w:rPr>
         <w:lastRenderedPageBreak/>
@@ -319,11 +599,14 @@
     <w:p>
       <w:pPr>
         <w:rPr>
-          <w:lang w:val="en-GB"/>
-        </w:rPr>
-      </w:pPr>
-      <w:r>
-        <w:rPr>
+          <w:rFonts w:ascii="Times New Roman" w:hAnsi="Times New Roman" w:cs="Times New Roman"/>
+          <w:lang w:val="en-GB"/>
+        </w:rPr>
+      </w:pPr>
+      <w:r>
+        <w:rPr>
+          <w:rFonts w:ascii="Times New Roman" w:hAnsi="Times New Roman" w:cs="Times New Roman"/>
+          <w:noProof/>
           <w:lang w:val="en-GB"/>
         </w:rPr>
         <w:lastRenderedPageBreak/>
@@ -367,6 +650,7 @@
     <w:p>
       <w:pPr>
         <w:rPr>
+          <w:rFonts w:ascii="Times New Roman" w:hAnsi="Times New Roman" w:cs="Times New Roman"/>
           <w:lang w:val="en-GB"/>
         </w:rPr>
       </w:pPr>
@@ -374,6 +658,7 @@
     <w:p>
       <w:pPr>
         <w:rPr>
+          <w:rFonts w:ascii="Times New Roman" w:hAnsi="Times New Roman" w:cs="Times New Roman"/>
           <w:lang w:val="en-GB"/>
         </w:rPr>
       </w:pPr>
@@ -381,24 +666,38 @@
     <w:p>
       <w:pPr>
         <w:rPr>
-          <w:lang w:val="en-GB"/>
-        </w:rPr>
-      </w:pPr>
-      <w:r>
-        <w:rPr>
-          <w:lang w:val="en-GB"/>
-        </w:rPr>
-        <w:t>Demo_recursive_task (3 screenshots):</w:t>
+          <w:rFonts w:ascii="Times New Roman" w:hAnsi="Times New Roman" w:cs="Times New Roman"/>
+          <w:lang w:val="en-GB"/>
+        </w:rPr>
+      </w:pPr>
+      <w:proofErr w:type="spellStart"/>
+      <w:r>
+        <w:rPr>
+          <w:rFonts w:ascii="Times New Roman" w:hAnsi="Times New Roman" w:cs="Times New Roman"/>
+          <w:lang w:val="en-GB"/>
+        </w:rPr>
+        <w:t>Demo_recursive_task</w:t>
+      </w:r>
+      <w:proofErr w:type="spellEnd"/>
+      <w:r>
+        <w:rPr>
+          <w:rFonts w:ascii="Times New Roman" w:hAnsi="Times New Roman" w:cs="Times New Roman"/>
+          <w:lang w:val="en-GB"/>
+        </w:rPr>
+        <w:t xml:space="preserve"> (3 screenshots):</w:t>
       </w:r>
     </w:p>
     <w:p>
       <w:pPr>
         <w:rPr>
-          <w:lang w:val="en-GB"/>
-        </w:rPr>
-      </w:pPr>
-      <w:r>
-        <w:rPr>
+          <w:rFonts w:ascii="Times New Roman" w:hAnsi="Times New Roman" w:cs="Times New Roman"/>
+          <w:lang w:val="en-GB"/>
+        </w:rPr>
+      </w:pPr>
+      <w:r>
+        <w:rPr>
+          <w:rFonts w:ascii="Times New Roman" w:hAnsi="Times New Roman" w:cs="Times New Roman"/>
+          <w:noProof/>
           <w:lang w:val="en-GB"/>
         </w:rPr>
         <w:lastRenderedPageBreak/>
@@ -442,11 +741,14 @@
     <w:p>
       <w:pPr>
         <w:rPr>
-          <w:lang w:val="en-GB"/>
-        </w:rPr>
-      </w:pPr>
-      <w:r>
-        <w:rPr>
+          <w:rFonts w:ascii="Times New Roman" w:hAnsi="Times New Roman" w:cs="Times New Roman"/>
+          <w:lang w:val="en-GB"/>
+        </w:rPr>
+      </w:pPr>
+      <w:r>
+        <w:rPr>
+          <w:rFonts w:ascii="Times New Roman" w:hAnsi="Times New Roman" w:cs="Times New Roman"/>
+          <w:noProof/>
           <w:lang w:val="en-GB"/>
         </w:rPr>
         <w:lastRenderedPageBreak/>
@@ -490,11 +792,14 @@
     <w:p>
       <w:pPr>
         <w:rPr>
-          <w:lang w:val="en-GB"/>
-        </w:rPr>
-      </w:pPr>
-      <w:r>
-        <w:rPr>
+          <w:rFonts w:ascii="Times New Roman" w:hAnsi="Times New Roman" w:cs="Times New Roman"/>
+          <w:lang w:val="en-GB"/>
+        </w:rPr>
+      </w:pPr>
+      <w:r>
+        <w:rPr>
+          <w:rFonts w:ascii="Times New Roman" w:hAnsi="Times New Roman" w:cs="Times New Roman"/>
+          <w:noProof/>
           <w:lang w:val="en-GB"/>
         </w:rPr>
         <w:lastRenderedPageBreak/>
@@ -538,44 +843,37 @@
     <w:p>
       <w:pPr>
         <w:rPr>
+          <w:rFonts w:ascii="Times New Roman" w:hAnsi="Times New Roman" w:cs="Times New Roman"/>
           <w:lang w:val="en-GB"/>
         </w:rPr>
       </w:pPr>
     </w:p>
     <w:p>
       <w:pPr>
-        <w:rPr>
-          <w:lang w:val="en-GB"/>
-        </w:rPr>
-      </w:pPr>
-    </w:p>
-    <w:p>
-      <w:pPr>
-        <w:rPr>
-          <w:lang w:val="en-GB"/>
-        </w:rPr>
-      </w:pPr>
-    </w:p>
-    <w:p>
-      <w:pPr>
         <w:pStyle w:val="Overskrift1"/>
         <w:rPr>
           <w:lang w:val="en-GB"/>
         </w:rPr>
       </w:pPr>
-    </w:p>
-    <w:p>
-      <w:pPr>
-        <w:pStyle w:val="Overskrift1"/>
-        <w:rPr>
-          <w:lang w:val="en-GB"/>
-        </w:rPr>
-      </w:pPr>
-      <w:r>
-        <w:rPr>
-          <w:lang w:val="en-GB"/>
-        </w:rPr>
-        <w:t>Exercise 2: Investigate threadshold and level of parallelism.</w:t>
+      <w:r>
+        <w:rPr>
+          <w:lang w:val="en-GB"/>
+        </w:rPr>
+        <w:t xml:space="preserve">Exercise 2: Investigate </w:t>
+      </w:r>
+      <w:proofErr w:type="spellStart"/>
+      <w:r>
+        <w:rPr>
+          <w:lang w:val="en-GB"/>
+        </w:rPr>
+        <w:t>threadshold</w:t>
+      </w:r>
+      <w:proofErr w:type="spellEnd"/>
+      <w:r>
+        <w:rPr>
+          <w:lang w:val="en-GB"/>
+        </w:rPr>
+        <w:t xml:space="preserve"> and level of parallelism.</w:t>
       </w:r>
     </w:p>
     <w:p>
@@ -599,28 +897,126 @@
           <w:rFonts w:ascii="Times New Roman" w:eastAsia="CMBX10" w:hAnsi="Times New Roman" w:cs="Times New Roman"/>
           <w:kern w:val="0"/>
         </w:rPr>
-        <w:t xml:space="preserve">(10 pts) </w:t>
-      </w:r>
-      <w:r>
-        <w:rPr>
-          <w:rFonts w:ascii="Times New Roman" w:eastAsia="CMR10" w:hAnsi="Times New Roman" w:cs="Times New Roman"/>
-          <w:kern w:val="0"/>
-        </w:rPr>
-        <w:t xml:space="preserve">Create a project and name it </w:t>
-      </w:r>
+        <w:t xml:space="preserve">(10 </w:t>
+      </w:r>
+      <w:proofErr w:type="spellStart"/>
+      <w:r>
+        <w:rPr>
+          <w:rFonts w:ascii="Times New Roman" w:eastAsia="CMBX10" w:hAnsi="Times New Roman" w:cs="Times New Roman"/>
+          <w:kern w:val="0"/>
+        </w:rPr>
+        <w:t>pts</w:t>
+      </w:r>
+      <w:proofErr w:type="spellEnd"/>
+      <w:r>
+        <w:rPr>
+          <w:rFonts w:ascii="Times New Roman" w:eastAsia="CMBX10" w:hAnsi="Times New Roman" w:cs="Times New Roman"/>
+          <w:kern w:val="0"/>
+        </w:rPr>
+        <w:t xml:space="preserve">) </w:t>
+      </w:r>
+      <w:proofErr w:type="spellStart"/>
+      <w:r>
+        <w:rPr>
+          <w:rFonts w:ascii="Times New Roman" w:eastAsia="CMR10" w:hAnsi="Times New Roman" w:cs="Times New Roman"/>
+          <w:kern w:val="0"/>
+        </w:rPr>
+        <w:t>Create</w:t>
+      </w:r>
+      <w:proofErr w:type="spellEnd"/>
+      <w:r>
+        <w:rPr>
+          <w:rFonts w:ascii="Times New Roman" w:eastAsia="CMR10" w:hAnsi="Times New Roman" w:cs="Times New Roman"/>
+          <w:kern w:val="0"/>
+        </w:rPr>
+        <w:t xml:space="preserve"> a </w:t>
+      </w:r>
+      <w:proofErr w:type="spellStart"/>
+      <w:r>
+        <w:rPr>
+          <w:rFonts w:ascii="Times New Roman" w:eastAsia="CMR10" w:hAnsi="Times New Roman" w:cs="Times New Roman"/>
+          <w:kern w:val="0"/>
+        </w:rPr>
+        <w:t>project</w:t>
+      </w:r>
+      <w:proofErr w:type="spellEnd"/>
+      <w:r>
+        <w:rPr>
+          <w:rFonts w:ascii="Times New Roman" w:eastAsia="CMR10" w:hAnsi="Times New Roman" w:cs="Times New Roman"/>
+          <w:kern w:val="0"/>
+        </w:rPr>
+        <w:t xml:space="preserve"> and </w:t>
+      </w:r>
+      <w:proofErr w:type="spellStart"/>
+      <w:r>
+        <w:rPr>
+          <w:rFonts w:ascii="Times New Roman" w:eastAsia="CMR10" w:hAnsi="Times New Roman" w:cs="Times New Roman"/>
+          <w:kern w:val="0"/>
+        </w:rPr>
+        <w:t>name</w:t>
+      </w:r>
+      <w:proofErr w:type="spellEnd"/>
+      <w:r>
+        <w:rPr>
+          <w:rFonts w:ascii="Times New Roman" w:eastAsia="CMR10" w:hAnsi="Times New Roman" w:cs="Times New Roman"/>
+          <w:kern w:val="0"/>
+        </w:rPr>
+        <w:t xml:space="preserve"> it </w:t>
+      </w:r>
+      <w:proofErr w:type="spellStart"/>
       <w:r>
         <w:rPr>
           <w:rFonts w:ascii="Times New Roman" w:eastAsia="CMTT10" w:hAnsi="Times New Roman" w:cs="Times New Roman"/>
           <w:kern w:val="0"/>
         </w:rPr>
-        <w:t xml:space="preserve">Exercise </w:t>
-      </w:r>
-      <w:r>
-        <w:rPr>
-          <w:rFonts w:ascii="Times New Roman" w:eastAsia="CMR10" w:hAnsi="Times New Roman" w:cs="Times New Roman"/>
-          <w:kern w:val="0"/>
-        </w:rPr>
-        <w:t>for this exercise.</w:t>
+        <w:t>Exercise</w:t>
+      </w:r>
+      <w:proofErr w:type="spellEnd"/>
+      <w:r>
+        <w:rPr>
+          <w:rFonts w:ascii="Times New Roman" w:eastAsia="CMTT10" w:hAnsi="Times New Roman" w:cs="Times New Roman"/>
+          <w:kern w:val="0"/>
+        </w:rPr>
+        <w:t xml:space="preserve"> </w:t>
+      </w:r>
+      <w:r>
+        <w:rPr>
+          <w:rFonts w:ascii="Times New Roman" w:eastAsia="CMR10" w:hAnsi="Times New Roman" w:cs="Times New Roman"/>
+          <w:kern w:val="0"/>
+        </w:rPr>
+        <w:t xml:space="preserve">for </w:t>
+      </w:r>
+      <w:proofErr w:type="spellStart"/>
+      <w:r>
+        <w:rPr>
+          <w:rFonts w:ascii="Times New Roman" w:eastAsia="CMR10" w:hAnsi="Times New Roman" w:cs="Times New Roman"/>
+          <w:kern w:val="0"/>
+        </w:rPr>
+        <w:t>this</w:t>
+      </w:r>
+      <w:proofErr w:type="spellEnd"/>
+      <w:r>
+        <w:rPr>
+          <w:rFonts w:ascii="Times New Roman" w:eastAsia="CMR10" w:hAnsi="Times New Roman" w:cs="Times New Roman"/>
+          <w:kern w:val="0"/>
+        </w:rPr>
+        <w:t xml:space="preserve"> </w:t>
+      </w:r>
+      <w:proofErr w:type="spellStart"/>
+      <w:r>
+        <w:rPr>
+          <w:rFonts w:ascii="Times New Roman" w:eastAsia="CMR10" w:hAnsi="Times New Roman" w:cs="Times New Roman"/>
+          <w:kern w:val="0"/>
+        </w:rPr>
+        <w:t>exercise</w:t>
+      </w:r>
+      <w:proofErr w:type="spellEnd"/>
+      <w:r>
+        <w:rPr>
+          <w:rFonts w:ascii="Times New Roman" w:eastAsia="CMR10" w:hAnsi="Times New Roman" w:cs="Times New Roman"/>
+          <w:kern w:val="0"/>
+        </w:rPr>
+        <w:t>.</w:t>
       </w:r>
     </w:p>
     <w:p>
@@ -644,42 +1040,133 @@
           <w:rFonts w:ascii="Times New Roman" w:eastAsia="CMBX10" w:hAnsi="Times New Roman" w:cs="Times New Roman"/>
           <w:kern w:val="0"/>
         </w:rPr>
-        <w:t xml:space="preserve">(10 pts) </w:t>
-      </w:r>
-      <w:r>
-        <w:rPr>
-          <w:rFonts w:ascii="Times New Roman" w:eastAsia="CMR10" w:hAnsi="Times New Roman" w:cs="Times New Roman"/>
-          <w:kern w:val="0"/>
-        </w:rPr>
-        <w:t xml:space="preserve">Complete the implementation of </w:t>
-      </w:r>
+        <w:t xml:space="preserve">(10 </w:t>
+      </w:r>
+      <w:proofErr w:type="spellStart"/>
+      <w:r>
+        <w:rPr>
+          <w:rFonts w:ascii="Times New Roman" w:eastAsia="CMBX10" w:hAnsi="Times New Roman" w:cs="Times New Roman"/>
+          <w:kern w:val="0"/>
+        </w:rPr>
+        <w:t>pts</w:t>
+      </w:r>
+      <w:proofErr w:type="spellEnd"/>
+      <w:r>
+        <w:rPr>
+          <w:rFonts w:ascii="Times New Roman" w:eastAsia="CMBX10" w:hAnsi="Times New Roman" w:cs="Times New Roman"/>
+          <w:kern w:val="0"/>
+        </w:rPr>
+        <w:t xml:space="preserve">) </w:t>
+      </w:r>
+      <w:r>
+        <w:rPr>
+          <w:rFonts w:ascii="Times New Roman" w:eastAsia="CMR10" w:hAnsi="Times New Roman" w:cs="Times New Roman"/>
+          <w:kern w:val="0"/>
+        </w:rPr>
+        <w:t xml:space="preserve">Complete </w:t>
+      </w:r>
+      <w:proofErr w:type="spellStart"/>
+      <w:r>
+        <w:rPr>
+          <w:rFonts w:ascii="Times New Roman" w:eastAsia="CMR10" w:hAnsi="Times New Roman" w:cs="Times New Roman"/>
+          <w:kern w:val="0"/>
+        </w:rPr>
+        <w:t>the</w:t>
+      </w:r>
+      <w:proofErr w:type="spellEnd"/>
+      <w:r>
+        <w:rPr>
+          <w:rFonts w:ascii="Times New Roman" w:eastAsia="CMR10" w:hAnsi="Times New Roman" w:cs="Times New Roman"/>
+          <w:kern w:val="0"/>
+        </w:rPr>
+        <w:t xml:space="preserve"> </w:t>
+      </w:r>
+      <w:proofErr w:type="spellStart"/>
+      <w:r>
+        <w:rPr>
+          <w:rFonts w:ascii="Times New Roman" w:eastAsia="CMR10" w:hAnsi="Times New Roman" w:cs="Times New Roman"/>
+          <w:kern w:val="0"/>
+        </w:rPr>
+        <w:t>implementation</w:t>
+      </w:r>
+      <w:proofErr w:type="spellEnd"/>
+      <w:r>
+        <w:rPr>
+          <w:rFonts w:ascii="Times New Roman" w:eastAsia="CMR10" w:hAnsi="Times New Roman" w:cs="Times New Roman"/>
+          <w:kern w:val="0"/>
+        </w:rPr>
+        <w:t xml:space="preserve"> </w:t>
+      </w:r>
+      <w:proofErr w:type="spellStart"/>
+      <w:r>
+        <w:rPr>
+          <w:rFonts w:ascii="Times New Roman" w:eastAsia="CMR10" w:hAnsi="Times New Roman" w:cs="Times New Roman"/>
+          <w:kern w:val="0"/>
+        </w:rPr>
+        <w:t>of</w:t>
+      </w:r>
+      <w:proofErr w:type="spellEnd"/>
+      <w:r>
+        <w:rPr>
+          <w:rFonts w:ascii="Times New Roman" w:eastAsia="CMR10" w:hAnsi="Times New Roman" w:cs="Times New Roman"/>
+          <w:kern w:val="0"/>
+        </w:rPr>
+        <w:t xml:space="preserve"> </w:t>
+      </w:r>
+      <w:proofErr w:type="spellStart"/>
       <w:r>
         <w:rPr>
           <w:rFonts w:ascii="Times New Roman" w:eastAsia="CMTT10" w:hAnsi="Times New Roman" w:cs="Times New Roman"/>
           <w:kern w:val="0"/>
         </w:rPr>
-        <w:t xml:space="preserve">Task </w:t>
-      </w:r>
-      <w:r>
-        <w:rPr>
-          <w:rFonts w:ascii="Times New Roman" w:eastAsia="CMR10" w:hAnsi="Times New Roman" w:cs="Times New Roman"/>
-          <w:kern w:val="0"/>
-        </w:rPr>
-        <w:t xml:space="preserve">class and </w:t>
-      </w:r>
+        <w:t>Task</w:t>
+      </w:r>
+      <w:proofErr w:type="spellEnd"/>
       <w:r>
         <w:rPr>
           <w:rFonts w:ascii="Times New Roman" w:eastAsia="CMTT10" w:hAnsi="Times New Roman" w:cs="Times New Roman"/>
           <w:kern w:val="0"/>
         </w:rPr>
+        <w:t xml:space="preserve"> </w:t>
+      </w:r>
+      <w:proofErr w:type="spellStart"/>
+      <w:r>
+        <w:rPr>
+          <w:rFonts w:ascii="Times New Roman" w:eastAsia="CMR10" w:hAnsi="Times New Roman" w:cs="Times New Roman"/>
+          <w:kern w:val="0"/>
+        </w:rPr>
+        <w:t>class</w:t>
+      </w:r>
+      <w:proofErr w:type="spellEnd"/>
+      <w:r>
+        <w:rPr>
+          <w:rFonts w:ascii="Times New Roman" w:eastAsia="CMR10" w:hAnsi="Times New Roman" w:cs="Times New Roman"/>
+          <w:kern w:val="0"/>
+        </w:rPr>
+        <w:t xml:space="preserve"> and </w:t>
+      </w:r>
+      <w:r>
+        <w:rPr>
+          <w:rFonts w:ascii="Times New Roman" w:eastAsia="CMTT10" w:hAnsi="Times New Roman" w:cs="Times New Roman"/>
+          <w:kern w:val="0"/>
+        </w:rPr>
         <w:t xml:space="preserve">Main </w:t>
       </w:r>
-      <w:r>
-        <w:rPr>
-          <w:rFonts w:ascii="Times New Roman" w:eastAsia="CMR10" w:hAnsi="Times New Roman" w:cs="Times New Roman"/>
-          <w:kern w:val="0"/>
-        </w:rPr>
-        <w:t>class.</w:t>
+      <w:proofErr w:type="spellStart"/>
+      <w:r>
+        <w:rPr>
+          <w:rFonts w:ascii="Times New Roman" w:eastAsia="CMR10" w:hAnsi="Times New Roman" w:cs="Times New Roman"/>
+          <w:kern w:val="0"/>
+        </w:rPr>
+        <w:t>class</w:t>
+      </w:r>
+      <w:proofErr w:type="spellEnd"/>
+      <w:r>
+        <w:rPr>
+          <w:rFonts w:ascii="Times New Roman" w:eastAsia="CMR10" w:hAnsi="Times New Roman" w:cs="Times New Roman"/>
+          <w:kern w:val="0"/>
+        </w:rPr>
+        <w:t>.</w:t>
       </w:r>
     </w:p>
     <w:p>
@@ -703,28 +1190,190 @@
           <w:rFonts w:ascii="Times New Roman" w:eastAsia="CMBX10" w:hAnsi="Times New Roman" w:cs="Times New Roman"/>
           <w:kern w:val="0"/>
         </w:rPr>
-        <w:t xml:space="preserve">(10 pts) </w:t>
-      </w:r>
-      <w:r>
-        <w:rPr>
-          <w:rFonts w:ascii="Times New Roman" w:eastAsia="CMR10" w:hAnsi="Times New Roman" w:cs="Times New Roman"/>
-          <w:kern w:val="0"/>
-        </w:rPr>
-        <w:t>Run your code with different values of Threshold and Level of Parallelism and add screenshots</w:t>
-      </w:r>
-      <w:r>
-        <w:rPr>
-          <w:rFonts w:ascii="Times New Roman" w:eastAsia="CMR10" w:hAnsi="Times New Roman" w:cs="Times New Roman"/>
-          <w:kern w:val="0"/>
-        </w:rPr>
-        <w:t xml:space="preserve"> </w:t>
-      </w:r>
-      <w:r>
-        <w:rPr>
-          <w:rFonts w:ascii="Times New Roman" w:eastAsia="CMR10" w:hAnsi="Times New Roman" w:cs="Times New Roman"/>
-          <w:kern w:val="0"/>
-        </w:rPr>
-        <w:t>to your report.</w:t>
+        <w:t xml:space="preserve">(10 </w:t>
+      </w:r>
+      <w:proofErr w:type="spellStart"/>
+      <w:r>
+        <w:rPr>
+          <w:rFonts w:ascii="Times New Roman" w:eastAsia="CMBX10" w:hAnsi="Times New Roman" w:cs="Times New Roman"/>
+          <w:kern w:val="0"/>
+        </w:rPr>
+        <w:t>pts</w:t>
+      </w:r>
+      <w:proofErr w:type="spellEnd"/>
+      <w:r>
+        <w:rPr>
+          <w:rFonts w:ascii="Times New Roman" w:eastAsia="CMBX10" w:hAnsi="Times New Roman" w:cs="Times New Roman"/>
+          <w:kern w:val="0"/>
+        </w:rPr>
+        <w:t xml:space="preserve">) </w:t>
+      </w:r>
+      <w:r>
+        <w:rPr>
+          <w:rFonts w:ascii="Times New Roman" w:eastAsia="CMR10" w:hAnsi="Times New Roman" w:cs="Times New Roman"/>
+          <w:kern w:val="0"/>
+        </w:rPr>
+        <w:t xml:space="preserve">Run </w:t>
+      </w:r>
+      <w:proofErr w:type="spellStart"/>
+      <w:r>
+        <w:rPr>
+          <w:rFonts w:ascii="Times New Roman" w:eastAsia="CMR10" w:hAnsi="Times New Roman" w:cs="Times New Roman"/>
+          <w:kern w:val="0"/>
+        </w:rPr>
+        <w:t>your</w:t>
+      </w:r>
+      <w:proofErr w:type="spellEnd"/>
+      <w:r>
+        <w:rPr>
+          <w:rFonts w:ascii="Times New Roman" w:eastAsia="CMR10" w:hAnsi="Times New Roman" w:cs="Times New Roman"/>
+          <w:kern w:val="0"/>
+        </w:rPr>
+        <w:t xml:space="preserve"> </w:t>
+      </w:r>
+      <w:proofErr w:type="spellStart"/>
+      <w:r>
+        <w:rPr>
+          <w:rFonts w:ascii="Times New Roman" w:eastAsia="CMR10" w:hAnsi="Times New Roman" w:cs="Times New Roman"/>
+          <w:kern w:val="0"/>
+        </w:rPr>
+        <w:t>code</w:t>
+      </w:r>
+      <w:proofErr w:type="spellEnd"/>
+      <w:r>
+        <w:rPr>
+          <w:rFonts w:ascii="Times New Roman" w:eastAsia="CMR10" w:hAnsi="Times New Roman" w:cs="Times New Roman"/>
+          <w:kern w:val="0"/>
+        </w:rPr>
+        <w:t xml:space="preserve"> </w:t>
+      </w:r>
+      <w:proofErr w:type="spellStart"/>
+      <w:r>
+        <w:rPr>
+          <w:rFonts w:ascii="Times New Roman" w:eastAsia="CMR10" w:hAnsi="Times New Roman" w:cs="Times New Roman"/>
+          <w:kern w:val="0"/>
+        </w:rPr>
+        <w:t>with</w:t>
+      </w:r>
+      <w:proofErr w:type="spellEnd"/>
+      <w:r>
+        <w:rPr>
+          <w:rFonts w:ascii="Times New Roman" w:eastAsia="CMR10" w:hAnsi="Times New Roman" w:cs="Times New Roman"/>
+          <w:kern w:val="0"/>
+        </w:rPr>
+        <w:t xml:space="preserve"> different </w:t>
+      </w:r>
+      <w:proofErr w:type="spellStart"/>
+      <w:r>
+        <w:rPr>
+          <w:rFonts w:ascii="Times New Roman" w:eastAsia="CMR10" w:hAnsi="Times New Roman" w:cs="Times New Roman"/>
+          <w:kern w:val="0"/>
+        </w:rPr>
+        <w:t>values</w:t>
+      </w:r>
+      <w:proofErr w:type="spellEnd"/>
+      <w:r>
+        <w:rPr>
+          <w:rFonts w:ascii="Times New Roman" w:eastAsia="CMR10" w:hAnsi="Times New Roman" w:cs="Times New Roman"/>
+          <w:kern w:val="0"/>
+        </w:rPr>
+        <w:t xml:space="preserve"> </w:t>
+      </w:r>
+      <w:proofErr w:type="spellStart"/>
+      <w:r>
+        <w:rPr>
+          <w:rFonts w:ascii="Times New Roman" w:eastAsia="CMR10" w:hAnsi="Times New Roman" w:cs="Times New Roman"/>
+          <w:kern w:val="0"/>
+        </w:rPr>
+        <w:t>of</w:t>
+      </w:r>
+      <w:proofErr w:type="spellEnd"/>
+      <w:r>
+        <w:rPr>
+          <w:rFonts w:ascii="Times New Roman" w:eastAsia="CMR10" w:hAnsi="Times New Roman" w:cs="Times New Roman"/>
+          <w:kern w:val="0"/>
+        </w:rPr>
+        <w:t xml:space="preserve"> </w:t>
+      </w:r>
+      <w:proofErr w:type="spellStart"/>
+      <w:r>
+        <w:rPr>
+          <w:rFonts w:ascii="Times New Roman" w:eastAsia="CMR10" w:hAnsi="Times New Roman" w:cs="Times New Roman"/>
+          <w:kern w:val="0"/>
+        </w:rPr>
+        <w:t>Threshold</w:t>
+      </w:r>
+      <w:proofErr w:type="spellEnd"/>
+      <w:r>
+        <w:rPr>
+          <w:rFonts w:ascii="Times New Roman" w:eastAsia="CMR10" w:hAnsi="Times New Roman" w:cs="Times New Roman"/>
+          <w:kern w:val="0"/>
+        </w:rPr>
+        <w:t xml:space="preserve"> and Level </w:t>
+      </w:r>
+      <w:proofErr w:type="spellStart"/>
+      <w:r>
+        <w:rPr>
+          <w:rFonts w:ascii="Times New Roman" w:eastAsia="CMR10" w:hAnsi="Times New Roman" w:cs="Times New Roman"/>
+          <w:kern w:val="0"/>
+        </w:rPr>
+        <w:t>of</w:t>
+      </w:r>
+      <w:proofErr w:type="spellEnd"/>
+      <w:r>
+        <w:rPr>
+          <w:rFonts w:ascii="Times New Roman" w:eastAsia="CMR10" w:hAnsi="Times New Roman" w:cs="Times New Roman"/>
+          <w:kern w:val="0"/>
+        </w:rPr>
+        <w:t xml:space="preserve"> </w:t>
+      </w:r>
+      <w:proofErr w:type="spellStart"/>
+      <w:r>
+        <w:rPr>
+          <w:rFonts w:ascii="Times New Roman" w:eastAsia="CMR10" w:hAnsi="Times New Roman" w:cs="Times New Roman"/>
+          <w:kern w:val="0"/>
+        </w:rPr>
+        <w:t>Parallelism</w:t>
+      </w:r>
+      <w:proofErr w:type="spellEnd"/>
+      <w:r>
+        <w:rPr>
+          <w:rFonts w:ascii="Times New Roman" w:eastAsia="CMR10" w:hAnsi="Times New Roman" w:cs="Times New Roman"/>
+          <w:kern w:val="0"/>
+        </w:rPr>
+        <w:t xml:space="preserve"> and </w:t>
+      </w:r>
+      <w:proofErr w:type="spellStart"/>
+      <w:r>
+        <w:rPr>
+          <w:rFonts w:ascii="Times New Roman" w:eastAsia="CMR10" w:hAnsi="Times New Roman" w:cs="Times New Roman"/>
+          <w:kern w:val="0"/>
+        </w:rPr>
+        <w:t>add</w:t>
+      </w:r>
+      <w:proofErr w:type="spellEnd"/>
+      <w:r>
+        <w:rPr>
+          <w:rFonts w:ascii="Times New Roman" w:eastAsia="CMR10" w:hAnsi="Times New Roman" w:cs="Times New Roman"/>
+          <w:kern w:val="0"/>
+        </w:rPr>
+        <w:t xml:space="preserve"> screenshots to </w:t>
+      </w:r>
+      <w:proofErr w:type="spellStart"/>
+      <w:r>
+        <w:rPr>
+          <w:rFonts w:ascii="Times New Roman" w:eastAsia="CMR10" w:hAnsi="Times New Roman" w:cs="Times New Roman"/>
+          <w:kern w:val="0"/>
+        </w:rPr>
+        <w:t>your</w:t>
+      </w:r>
+      <w:proofErr w:type="spellEnd"/>
+      <w:r>
+        <w:rPr>
+          <w:rFonts w:ascii="Times New Roman" w:eastAsia="CMR10" w:hAnsi="Times New Roman" w:cs="Times New Roman"/>
+          <w:kern w:val="0"/>
+        </w:rPr>
+        <w:t xml:space="preserve"> report.</w:t>
       </w:r>
     </w:p>
     <w:p>
@@ -748,14 +1397,174 @@
           <w:rFonts w:ascii="Times New Roman" w:eastAsia="CMBX10" w:hAnsi="Times New Roman" w:cs="Times New Roman"/>
           <w:kern w:val="0"/>
         </w:rPr>
-        <w:t xml:space="preserve">(10 pts) </w:t>
-      </w:r>
-      <w:r>
-        <w:rPr>
-          <w:rFonts w:ascii="Times New Roman" w:eastAsia="CMR10" w:hAnsi="Times New Roman" w:cs="Times New Roman"/>
-          <w:kern w:val="0"/>
-        </w:rPr>
-        <w:t>How the running time of the program varies with the above two arguments?</w:t>
+        <w:t xml:space="preserve">(10 </w:t>
+      </w:r>
+      <w:proofErr w:type="spellStart"/>
+      <w:r>
+        <w:rPr>
+          <w:rFonts w:ascii="Times New Roman" w:eastAsia="CMBX10" w:hAnsi="Times New Roman" w:cs="Times New Roman"/>
+          <w:kern w:val="0"/>
+        </w:rPr>
+        <w:t>pts</w:t>
+      </w:r>
+      <w:proofErr w:type="spellEnd"/>
+      <w:r>
+        <w:rPr>
+          <w:rFonts w:ascii="Times New Roman" w:eastAsia="CMBX10" w:hAnsi="Times New Roman" w:cs="Times New Roman"/>
+          <w:kern w:val="0"/>
+        </w:rPr>
+        <w:t xml:space="preserve">) </w:t>
+      </w:r>
+      <w:r>
+        <w:rPr>
+          <w:rFonts w:ascii="Times New Roman" w:eastAsia="CMR10" w:hAnsi="Times New Roman" w:cs="Times New Roman"/>
+          <w:kern w:val="0"/>
+        </w:rPr>
+        <w:t xml:space="preserve">How </w:t>
+      </w:r>
+      <w:proofErr w:type="spellStart"/>
+      <w:r>
+        <w:rPr>
+          <w:rFonts w:ascii="Times New Roman" w:eastAsia="CMR10" w:hAnsi="Times New Roman" w:cs="Times New Roman"/>
+          <w:kern w:val="0"/>
+        </w:rPr>
+        <w:t>the</w:t>
+      </w:r>
+      <w:proofErr w:type="spellEnd"/>
+      <w:r>
+        <w:rPr>
+          <w:rFonts w:ascii="Times New Roman" w:eastAsia="CMR10" w:hAnsi="Times New Roman" w:cs="Times New Roman"/>
+          <w:kern w:val="0"/>
+        </w:rPr>
+        <w:t xml:space="preserve"> </w:t>
+      </w:r>
+      <w:proofErr w:type="spellStart"/>
+      <w:r>
+        <w:rPr>
+          <w:rFonts w:ascii="Times New Roman" w:eastAsia="CMR10" w:hAnsi="Times New Roman" w:cs="Times New Roman"/>
+          <w:kern w:val="0"/>
+        </w:rPr>
+        <w:t>running</w:t>
+      </w:r>
+      <w:proofErr w:type="spellEnd"/>
+      <w:r>
+        <w:rPr>
+          <w:rFonts w:ascii="Times New Roman" w:eastAsia="CMR10" w:hAnsi="Times New Roman" w:cs="Times New Roman"/>
+          <w:kern w:val="0"/>
+        </w:rPr>
+        <w:t xml:space="preserve"> time </w:t>
+      </w:r>
+      <w:proofErr w:type="spellStart"/>
+      <w:r>
+        <w:rPr>
+          <w:rFonts w:ascii="Times New Roman" w:eastAsia="CMR10" w:hAnsi="Times New Roman" w:cs="Times New Roman"/>
+          <w:kern w:val="0"/>
+        </w:rPr>
+        <w:t>of</w:t>
+      </w:r>
+      <w:proofErr w:type="spellEnd"/>
+      <w:r>
+        <w:rPr>
+          <w:rFonts w:ascii="Times New Roman" w:eastAsia="CMR10" w:hAnsi="Times New Roman" w:cs="Times New Roman"/>
+          <w:kern w:val="0"/>
+        </w:rPr>
+        <w:t xml:space="preserve"> </w:t>
+      </w:r>
+      <w:proofErr w:type="spellStart"/>
+      <w:r>
+        <w:rPr>
+          <w:rFonts w:ascii="Times New Roman" w:eastAsia="CMR10" w:hAnsi="Times New Roman" w:cs="Times New Roman"/>
+          <w:kern w:val="0"/>
+        </w:rPr>
+        <w:t>the</w:t>
+      </w:r>
+      <w:proofErr w:type="spellEnd"/>
+      <w:r>
+        <w:rPr>
+          <w:rFonts w:ascii="Times New Roman" w:eastAsia="CMR10" w:hAnsi="Times New Roman" w:cs="Times New Roman"/>
+          <w:kern w:val="0"/>
+        </w:rPr>
+        <w:t xml:space="preserve"> program </w:t>
+      </w:r>
+      <w:proofErr w:type="spellStart"/>
+      <w:r>
+        <w:rPr>
+          <w:rFonts w:ascii="Times New Roman" w:eastAsia="CMR10" w:hAnsi="Times New Roman" w:cs="Times New Roman"/>
+          <w:kern w:val="0"/>
+        </w:rPr>
+        <w:t>varies</w:t>
+      </w:r>
+      <w:proofErr w:type="spellEnd"/>
+      <w:r>
+        <w:rPr>
+          <w:rFonts w:ascii="Times New Roman" w:eastAsia="CMR10" w:hAnsi="Times New Roman" w:cs="Times New Roman"/>
+          <w:kern w:val="0"/>
+        </w:rPr>
+        <w:t xml:space="preserve"> </w:t>
+      </w:r>
+      <w:proofErr w:type="spellStart"/>
+      <w:r>
+        <w:rPr>
+          <w:rFonts w:ascii="Times New Roman" w:eastAsia="CMR10" w:hAnsi="Times New Roman" w:cs="Times New Roman"/>
+          <w:kern w:val="0"/>
+        </w:rPr>
+        <w:t>with</w:t>
+      </w:r>
+      <w:proofErr w:type="spellEnd"/>
+      <w:r>
+        <w:rPr>
+          <w:rFonts w:ascii="Times New Roman" w:eastAsia="CMR10" w:hAnsi="Times New Roman" w:cs="Times New Roman"/>
+          <w:kern w:val="0"/>
+        </w:rPr>
+        <w:t xml:space="preserve"> </w:t>
+      </w:r>
+      <w:proofErr w:type="spellStart"/>
+      <w:r>
+        <w:rPr>
+          <w:rFonts w:ascii="Times New Roman" w:eastAsia="CMR10" w:hAnsi="Times New Roman" w:cs="Times New Roman"/>
+          <w:kern w:val="0"/>
+        </w:rPr>
+        <w:t>the</w:t>
+      </w:r>
+      <w:proofErr w:type="spellEnd"/>
+      <w:r>
+        <w:rPr>
+          <w:rFonts w:ascii="Times New Roman" w:eastAsia="CMR10" w:hAnsi="Times New Roman" w:cs="Times New Roman"/>
+          <w:kern w:val="0"/>
+        </w:rPr>
+        <w:t xml:space="preserve"> </w:t>
+      </w:r>
+      <w:proofErr w:type="spellStart"/>
+      <w:r>
+        <w:rPr>
+          <w:rFonts w:ascii="Times New Roman" w:eastAsia="CMR10" w:hAnsi="Times New Roman" w:cs="Times New Roman"/>
+          <w:kern w:val="0"/>
+        </w:rPr>
+        <w:t>above</w:t>
+      </w:r>
+      <w:proofErr w:type="spellEnd"/>
+      <w:r>
+        <w:rPr>
+          <w:rFonts w:ascii="Times New Roman" w:eastAsia="CMR10" w:hAnsi="Times New Roman" w:cs="Times New Roman"/>
+          <w:kern w:val="0"/>
+        </w:rPr>
+        <w:t xml:space="preserve"> </w:t>
+      </w:r>
+      <w:proofErr w:type="spellStart"/>
+      <w:r>
+        <w:rPr>
+          <w:rFonts w:ascii="Times New Roman" w:eastAsia="CMR10" w:hAnsi="Times New Roman" w:cs="Times New Roman"/>
+          <w:kern w:val="0"/>
+        </w:rPr>
+        <w:t>two</w:t>
+      </w:r>
+      <w:proofErr w:type="spellEnd"/>
+      <w:r>
+        <w:rPr>
+          <w:rFonts w:ascii="Times New Roman" w:eastAsia="CMR10" w:hAnsi="Times New Roman" w:cs="Times New Roman"/>
+          <w:kern w:val="0"/>
+        </w:rPr>
+        <w:t xml:space="preserve"> arguments?</w:t>
       </w:r>
     </w:p>
     <w:p>
@@ -779,56 +1588,423 @@
           <w:rFonts w:ascii="Times New Roman" w:eastAsia="CMBX10" w:hAnsi="Times New Roman" w:cs="Times New Roman"/>
           <w:kern w:val="0"/>
         </w:rPr>
-        <w:t xml:space="preserve">(10 pts) </w:t>
-      </w:r>
-      <w:r>
-        <w:rPr>
-          <w:rFonts w:ascii="Times New Roman" w:eastAsia="CMR10" w:hAnsi="Times New Roman" w:cs="Times New Roman"/>
-          <w:kern w:val="0"/>
-        </w:rPr>
-        <w:t xml:space="preserve">What happens when you set </w:t>
-      </w:r>
+        <w:t xml:space="preserve">(10 </w:t>
+      </w:r>
+      <w:proofErr w:type="spellStart"/>
+      <w:r>
+        <w:rPr>
+          <w:rFonts w:ascii="Times New Roman" w:eastAsia="CMBX10" w:hAnsi="Times New Roman" w:cs="Times New Roman"/>
+          <w:kern w:val="0"/>
+        </w:rPr>
+        <w:t>pts</w:t>
+      </w:r>
+      <w:proofErr w:type="spellEnd"/>
+      <w:r>
+        <w:rPr>
+          <w:rFonts w:ascii="Times New Roman" w:eastAsia="CMBX10" w:hAnsi="Times New Roman" w:cs="Times New Roman"/>
+          <w:kern w:val="0"/>
+        </w:rPr>
+        <w:t xml:space="preserve">) </w:t>
+      </w:r>
+      <w:proofErr w:type="spellStart"/>
+      <w:r>
+        <w:rPr>
+          <w:rFonts w:ascii="Times New Roman" w:eastAsia="CMR10" w:hAnsi="Times New Roman" w:cs="Times New Roman"/>
+          <w:kern w:val="0"/>
+        </w:rPr>
+        <w:t>What</w:t>
+      </w:r>
+      <w:proofErr w:type="spellEnd"/>
+      <w:r>
+        <w:rPr>
+          <w:rFonts w:ascii="Times New Roman" w:eastAsia="CMR10" w:hAnsi="Times New Roman" w:cs="Times New Roman"/>
+          <w:kern w:val="0"/>
+        </w:rPr>
+        <w:t xml:space="preserve"> </w:t>
+      </w:r>
+      <w:proofErr w:type="spellStart"/>
+      <w:r>
+        <w:rPr>
+          <w:rFonts w:ascii="Times New Roman" w:eastAsia="CMR10" w:hAnsi="Times New Roman" w:cs="Times New Roman"/>
+          <w:kern w:val="0"/>
+        </w:rPr>
+        <w:t>happens</w:t>
+      </w:r>
+      <w:proofErr w:type="spellEnd"/>
+      <w:r>
+        <w:rPr>
+          <w:rFonts w:ascii="Times New Roman" w:eastAsia="CMR10" w:hAnsi="Times New Roman" w:cs="Times New Roman"/>
+          <w:kern w:val="0"/>
+        </w:rPr>
+        <w:t xml:space="preserve"> </w:t>
+      </w:r>
+      <w:proofErr w:type="spellStart"/>
+      <w:r>
+        <w:rPr>
+          <w:rFonts w:ascii="Times New Roman" w:eastAsia="CMR10" w:hAnsi="Times New Roman" w:cs="Times New Roman"/>
+          <w:kern w:val="0"/>
+        </w:rPr>
+        <w:t>when</w:t>
+      </w:r>
+      <w:proofErr w:type="spellEnd"/>
+      <w:r>
+        <w:rPr>
+          <w:rFonts w:ascii="Times New Roman" w:eastAsia="CMR10" w:hAnsi="Times New Roman" w:cs="Times New Roman"/>
+          <w:kern w:val="0"/>
+        </w:rPr>
+        <w:t xml:space="preserve"> </w:t>
+      </w:r>
+      <w:proofErr w:type="spellStart"/>
+      <w:r>
+        <w:rPr>
+          <w:rFonts w:ascii="Times New Roman" w:eastAsia="CMR10" w:hAnsi="Times New Roman" w:cs="Times New Roman"/>
+          <w:kern w:val="0"/>
+        </w:rPr>
+        <w:t>you</w:t>
+      </w:r>
+      <w:proofErr w:type="spellEnd"/>
+      <w:r>
+        <w:rPr>
+          <w:rFonts w:ascii="Times New Roman" w:eastAsia="CMR10" w:hAnsi="Times New Roman" w:cs="Times New Roman"/>
+          <w:kern w:val="0"/>
+        </w:rPr>
+        <w:t xml:space="preserve"> </w:t>
+      </w:r>
+      <w:proofErr w:type="spellStart"/>
+      <w:r>
+        <w:rPr>
+          <w:rFonts w:ascii="Times New Roman" w:eastAsia="CMR10" w:hAnsi="Times New Roman" w:cs="Times New Roman"/>
+          <w:kern w:val="0"/>
+        </w:rPr>
+        <w:t>set</w:t>
+      </w:r>
+      <w:proofErr w:type="spellEnd"/>
+      <w:r>
+        <w:rPr>
+          <w:rFonts w:ascii="Times New Roman" w:eastAsia="CMR10" w:hAnsi="Times New Roman" w:cs="Times New Roman"/>
+          <w:kern w:val="0"/>
+        </w:rPr>
+        <w:t xml:space="preserve"> </w:t>
+      </w:r>
+      <w:proofErr w:type="spellStart"/>
       <w:r>
         <w:rPr>
           <w:rFonts w:ascii="Times New Roman" w:eastAsia="CMTT10" w:hAnsi="Times New Roman" w:cs="Times New Roman"/>
           <w:kern w:val="0"/>
         </w:rPr>
-        <w:t xml:space="preserve">paral level </w:t>
-      </w:r>
-      <w:r>
-        <w:rPr>
-          <w:rFonts w:ascii="Times New Roman" w:eastAsia="CMR10" w:hAnsi="Times New Roman" w:cs="Times New Roman"/>
-          <w:kern w:val="0"/>
-        </w:rPr>
-        <w:t>higher than the number of proccessors cores</w:t>
-      </w:r>
-      <w:r>
-        <w:rPr>
-          <w:rFonts w:ascii="Times New Roman" w:eastAsia="CMR10" w:hAnsi="Times New Roman" w:cs="Times New Roman"/>
-          <w:kern w:val="0"/>
-        </w:rPr>
-        <w:t xml:space="preserve"> </w:t>
-      </w:r>
-      <w:r>
-        <w:rPr>
-          <w:rFonts w:ascii="Times New Roman" w:eastAsia="CMR10" w:hAnsi="Times New Roman" w:cs="Times New Roman"/>
-          <w:kern w:val="0"/>
-        </w:rPr>
-        <w:t>available in your computer? Run the code with different settings and include the screenshots of the</w:t>
-      </w:r>
-      <w:r>
-        <w:rPr>
-          <w:rFonts w:ascii="Times New Roman" w:eastAsia="CMR10" w:hAnsi="Times New Roman" w:cs="Times New Roman"/>
-          <w:kern w:val="0"/>
-        </w:rPr>
-        <w:t xml:space="preserve"> </w:t>
-      </w:r>
-      <w:r>
-        <w:rPr>
-          <w:rFonts w:ascii="Times New Roman" w:eastAsia="CMR10" w:hAnsi="Times New Roman" w:cs="Times New Roman"/>
-          <w:kern w:val="0"/>
-        </w:rPr>
-        <w:t>output in your report to support your arguments.</w:t>
+        <w:t>paral</w:t>
+      </w:r>
+      <w:proofErr w:type="spellEnd"/>
+      <w:r>
+        <w:rPr>
+          <w:rFonts w:ascii="Times New Roman" w:eastAsia="CMTT10" w:hAnsi="Times New Roman" w:cs="Times New Roman"/>
+          <w:kern w:val="0"/>
+        </w:rPr>
+        <w:t xml:space="preserve"> </w:t>
+      </w:r>
+      <w:proofErr w:type="spellStart"/>
+      <w:r>
+        <w:rPr>
+          <w:rFonts w:ascii="Times New Roman" w:eastAsia="CMTT10" w:hAnsi="Times New Roman" w:cs="Times New Roman"/>
+          <w:kern w:val="0"/>
+        </w:rPr>
+        <w:t>level</w:t>
+      </w:r>
+      <w:proofErr w:type="spellEnd"/>
+      <w:r>
+        <w:rPr>
+          <w:rFonts w:ascii="Times New Roman" w:eastAsia="CMTT10" w:hAnsi="Times New Roman" w:cs="Times New Roman"/>
+          <w:kern w:val="0"/>
+        </w:rPr>
+        <w:t xml:space="preserve"> </w:t>
+      </w:r>
+      <w:proofErr w:type="spellStart"/>
+      <w:r>
+        <w:rPr>
+          <w:rFonts w:ascii="Times New Roman" w:eastAsia="CMR10" w:hAnsi="Times New Roman" w:cs="Times New Roman"/>
+          <w:kern w:val="0"/>
+        </w:rPr>
+        <w:t>higher</w:t>
+      </w:r>
+      <w:proofErr w:type="spellEnd"/>
+      <w:r>
+        <w:rPr>
+          <w:rFonts w:ascii="Times New Roman" w:eastAsia="CMR10" w:hAnsi="Times New Roman" w:cs="Times New Roman"/>
+          <w:kern w:val="0"/>
+        </w:rPr>
+        <w:t xml:space="preserve"> </w:t>
+      </w:r>
+      <w:proofErr w:type="spellStart"/>
+      <w:r>
+        <w:rPr>
+          <w:rFonts w:ascii="Times New Roman" w:eastAsia="CMR10" w:hAnsi="Times New Roman" w:cs="Times New Roman"/>
+          <w:kern w:val="0"/>
+        </w:rPr>
+        <w:t>than</w:t>
+      </w:r>
+      <w:proofErr w:type="spellEnd"/>
+      <w:r>
+        <w:rPr>
+          <w:rFonts w:ascii="Times New Roman" w:eastAsia="CMR10" w:hAnsi="Times New Roman" w:cs="Times New Roman"/>
+          <w:kern w:val="0"/>
+        </w:rPr>
+        <w:t xml:space="preserve"> </w:t>
+      </w:r>
+      <w:proofErr w:type="spellStart"/>
+      <w:r>
+        <w:rPr>
+          <w:rFonts w:ascii="Times New Roman" w:eastAsia="CMR10" w:hAnsi="Times New Roman" w:cs="Times New Roman"/>
+          <w:kern w:val="0"/>
+        </w:rPr>
+        <w:t>the</w:t>
+      </w:r>
+      <w:proofErr w:type="spellEnd"/>
+      <w:r>
+        <w:rPr>
+          <w:rFonts w:ascii="Times New Roman" w:eastAsia="CMR10" w:hAnsi="Times New Roman" w:cs="Times New Roman"/>
+          <w:kern w:val="0"/>
+        </w:rPr>
+        <w:t xml:space="preserve"> </w:t>
+      </w:r>
+      <w:proofErr w:type="spellStart"/>
+      <w:r>
+        <w:rPr>
+          <w:rFonts w:ascii="Times New Roman" w:eastAsia="CMR10" w:hAnsi="Times New Roman" w:cs="Times New Roman"/>
+          <w:kern w:val="0"/>
+        </w:rPr>
+        <w:t>number</w:t>
+      </w:r>
+      <w:proofErr w:type="spellEnd"/>
+      <w:r>
+        <w:rPr>
+          <w:rFonts w:ascii="Times New Roman" w:eastAsia="CMR10" w:hAnsi="Times New Roman" w:cs="Times New Roman"/>
+          <w:kern w:val="0"/>
+        </w:rPr>
+        <w:t xml:space="preserve"> </w:t>
+      </w:r>
+      <w:proofErr w:type="spellStart"/>
+      <w:r>
+        <w:rPr>
+          <w:rFonts w:ascii="Times New Roman" w:eastAsia="CMR10" w:hAnsi="Times New Roman" w:cs="Times New Roman"/>
+          <w:kern w:val="0"/>
+        </w:rPr>
+        <w:t>of</w:t>
+      </w:r>
+      <w:proofErr w:type="spellEnd"/>
+      <w:r>
+        <w:rPr>
+          <w:rFonts w:ascii="Times New Roman" w:eastAsia="CMR10" w:hAnsi="Times New Roman" w:cs="Times New Roman"/>
+          <w:kern w:val="0"/>
+        </w:rPr>
+        <w:t xml:space="preserve"> </w:t>
+      </w:r>
+      <w:proofErr w:type="spellStart"/>
+      <w:r>
+        <w:rPr>
+          <w:rFonts w:ascii="Times New Roman" w:eastAsia="CMR10" w:hAnsi="Times New Roman" w:cs="Times New Roman"/>
+          <w:kern w:val="0"/>
+        </w:rPr>
+        <w:t>proccessors</w:t>
+      </w:r>
+      <w:proofErr w:type="spellEnd"/>
+      <w:r>
+        <w:rPr>
+          <w:rFonts w:ascii="Times New Roman" w:eastAsia="CMR10" w:hAnsi="Times New Roman" w:cs="Times New Roman"/>
+          <w:kern w:val="0"/>
+        </w:rPr>
+        <w:t xml:space="preserve"> </w:t>
+      </w:r>
+      <w:proofErr w:type="spellStart"/>
+      <w:r>
+        <w:rPr>
+          <w:rFonts w:ascii="Times New Roman" w:eastAsia="CMR10" w:hAnsi="Times New Roman" w:cs="Times New Roman"/>
+          <w:kern w:val="0"/>
+        </w:rPr>
+        <w:t>cores</w:t>
+      </w:r>
+      <w:proofErr w:type="spellEnd"/>
+      <w:r>
+        <w:rPr>
+          <w:rFonts w:ascii="Times New Roman" w:eastAsia="CMR10" w:hAnsi="Times New Roman" w:cs="Times New Roman"/>
+          <w:kern w:val="0"/>
+        </w:rPr>
+        <w:t xml:space="preserve"> </w:t>
+      </w:r>
+      <w:proofErr w:type="spellStart"/>
+      <w:r>
+        <w:rPr>
+          <w:rFonts w:ascii="Times New Roman" w:eastAsia="CMR10" w:hAnsi="Times New Roman" w:cs="Times New Roman"/>
+          <w:kern w:val="0"/>
+        </w:rPr>
+        <w:t>available</w:t>
+      </w:r>
+      <w:proofErr w:type="spellEnd"/>
+      <w:r>
+        <w:rPr>
+          <w:rFonts w:ascii="Times New Roman" w:eastAsia="CMR10" w:hAnsi="Times New Roman" w:cs="Times New Roman"/>
+          <w:kern w:val="0"/>
+        </w:rPr>
+        <w:t xml:space="preserve"> in </w:t>
+      </w:r>
+      <w:proofErr w:type="spellStart"/>
+      <w:r>
+        <w:rPr>
+          <w:rFonts w:ascii="Times New Roman" w:eastAsia="CMR10" w:hAnsi="Times New Roman" w:cs="Times New Roman"/>
+          <w:kern w:val="0"/>
+        </w:rPr>
+        <w:t>your</w:t>
+      </w:r>
+      <w:proofErr w:type="spellEnd"/>
+      <w:r>
+        <w:rPr>
+          <w:rFonts w:ascii="Times New Roman" w:eastAsia="CMR10" w:hAnsi="Times New Roman" w:cs="Times New Roman"/>
+          <w:kern w:val="0"/>
+        </w:rPr>
+        <w:t xml:space="preserve"> computer? Run </w:t>
+      </w:r>
+      <w:proofErr w:type="spellStart"/>
+      <w:r>
+        <w:rPr>
+          <w:rFonts w:ascii="Times New Roman" w:eastAsia="CMR10" w:hAnsi="Times New Roman" w:cs="Times New Roman"/>
+          <w:kern w:val="0"/>
+        </w:rPr>
+        <w:t>the</w:t>
+      </w:r>
+      <w:proofErr w:type="spellEnd"/>
+      <w:r>
+        <w:rPr>
+          <w:rFonts w:ascii="Times New Roman" w:eastAsia="CMR10" w:hAnsi="Times New Roman" w:cs="Times New Roman"/>
+          <w:kern w:val="0"/>
+        </w:rPr>
+        <w:t xml:space="preserve"> </w:t>
+      </w:r>
+      <w:proofErr w:type="spellStart"/>
+      <w:r>
+        <w:rPr>
+          <w:rFonts w:ascii="Times New Roman" w:eastAsia="CMR10" w:hAnsi="Times New Roman" w:cs="Times New Roman"/>
+          <w:kern w:val="0"/>
+        </w:rPr>
+        <w:t>code</w:t>
+      </w:r>
+      <w:proofErr w:type="spellEnd"/>
+      <w:r>
+        <w:rPr>
+          <w:rFonts w:ascii="Times New Roman" w:eastAsia="CMR10" w:hAnsi="Times New Roman" w:cs="Times New Roman"/>
+          <w:kern w:val="0"/>
+        </w:rPr>
+        <w:t xml:space="preserve"> </w:t>
+      </w:r>
+      <w:proofErr w:type="spellStart"/>
+      <w:r>
+        <w:rPr>
+          <w:rFonts w:ascii="Times New Roman" w:eastAsia="CMR10" w:hAnsi="Times New Roman" w:cs="Times New Roman"/>
+          <w:kern w:val="0"/>
+        </w:rPr>
+        <w:t>with</w:t>
+      </w:r>
+      <w:proofErr w:type="spellEnd"/>
+      <w:r>
+        <w:rPr>
+          <w:rFonts w:ascii="Times New Roman" w:eastAsia="CMR10" w:hAnsi="Times New Roman" w:cs="Times New Roman"/>
+          <w:kern w:val="0"/>
+        </w:rPr>
+        <w:t xml:space="preserve"> different settings and </w:t>
+      </w:r>
+      <w:proofErr w:type="spellStart"/>
+      <w:r>
+        <w:rPr>
+          <w:rFonts w:ascii="Times New Roman" w:eastAsia="CMR10" w:hAnsi="Times New Roman" w:cs="Times New Roman"/>
+          <w:kern w:val="0"/>
+        </w:rPr>
+        <w:t>include</w:t>
+      </w:r>
+      <w:proofErr w:type="spellEnd"/>
+      <w:r>
+        <w:rPr>
+          <w:rFonts w:ascii="Times New Roman" w:eastAsia="CMR10" w:hAnsi="Times New Roman" w:cs="Times New Roman"/>
+          <w:kern w:val="0"/>
+        </w:rPr>
+        <w:t xml:space="preserve"> </w:t>
+      </w:r>
+      <w:proofErr w:type="spellStart"/>
+      <w:r>
+        <w:rPr>
+          <w:rFonts w:ascii="Times New Roman" w:eastAsia="CMR10" w:hAnsi="Times New Roman" w:cs="Times New Roman"/>
+          <w:kern w:val="0"/>
+        </w:rPr>
+        <w:t>the</w:t>
+      </w:r>
+      <w:proofErr w:type="spellEnd"/>
+      <w:r>
+        <w:rPr>
+          <w:rFonts w:ascii="Times New Roman" w:eastAsia="CMR10" w:hAnsi="Times New Roman" w:cs="Times New Roman"/>
+          <w:kern w:val="0"/>
+        </w:rPr>
+        <w:t xml:space="preserve"> screenshots </w:t>
+      </w:r>
+      <w:proofErr w:type="spellStart"/>
+      <w:r>
+        <w:rPr>
+          <w:rFonts w:ascii="Times New Roman" w:eastAsia="CMR10" w:hAnsi="Times New Roman" w:cs="Times New Roman"/>
+          <w:kern w:val="0"/>
+        </w:rPr>
+        <w:t>of</w:t>
+      </w:r>
+      <w:proofErr w:type="spellEnd"/>
+      <w:r>
+        <w:rPr>
+          <w:rFonts w:ascii="Times New Roman" w:eastAsia="CMR10" w:hAnsi="Times New Roman" w:cs="Times New Roman"/>
+          <w:kern w:val="0"/>
+        </w:rPr>
+        <w:t xml:space="preserve"> </w:t>
+      </w:r>
+      <w:proofErr w:type="spellStart"/>
+      <w:r>
+        <w:rPr>
+          <w:rFonts w:ascii="Times New Roman" w:eastAsia="CMR10" w:hAnsi="Times New Roman" w:cs="Times New Roman"/>
+          <w:kern w:val="0"/>
+        </w:rPr>
+        <w:t>the</w:t>
+      </w:r>
+      <w:proofErr w:type="spellEnd"/>
+      <w:r>
+        <w:rPr>
+          <w:rFonts w:ascii="Times New Roman" w:eastAsia="CMR10" w:hAnsi="Times New Roman" w:cs="Times New Roman"/>
+          <w:kern w:val="0"/>
+        </w:rPr>
+        <w:t xml:space="preserve"> output in </w:t>
+      </w:r>
+      <w:proofErr w:type="spellStart"/>
+      <w:r>
+        <w:rPr>
+          <w:rFonts w:ascii="Times New Roman" w:eastAsia="CMR10" w:hAnsi="Times New Roman" w:cs="Times New Roman"/>
+          <w:kern w:val="0"/>
+        </w:rPr>
+        <w:t>your</w:t>
+      </w:r>
+      <w:proofErr w:type="spellEnd"/>
+      <w:r>
+        <w:rPr>
+          <w:rFonts w:ascii="Times New Roman" w:eastAsia="CMR10" w:hAnsi="Times New Roman" w:cs="Times New Roman"/>
+          <w:kern w:val="0"/>
+        </w:rPr>
+        <w:t xml:space="preserve"> report to support </w:t>
+      </w:r>
+      <w:proofErr w:type="spellStart"/>
+      <w:r>
+        <w:rPr>
+          <w:rFonts w:ascii="Times New Roman" w:eastAsia="CMR10" w:hAnsi="Times New Roman" w:cs="Times New Roman"/>
+          <w:kern w:val="0"/>
+        </w:rPr>
+        <w:t>your</w:t>
+      </w:r>
+      <w:proofErr w:type="spellEnd"/>
+      <w:r>
+        <w:rPr>
+          <w:rFonts w:ascii="Times New Roman" w:eastAsia="CMR10" w:hAnsi="Times New Roman" w:cs="Times New Roman"/>
+          <w:kern w:val="0"/>
+        </w:rPr>
+        <w:t xml:space="preserve"> arguments.</w:t>
       </w:r>
     </w:p>
     <w:p>
@@ -852,21 +2028,87 @@
           <w:rFonts w:ascii="Times New Roman" w:eastAsia="CMBX10" w:hAnsi="Times New Roman" w:cs="Times New Roman"/>
           <w:kern w:val="0"/>
         </w:rPr>
-        <w:t xml:space="preserve">(10 pts) </w:t>
-      </w:r>
-      <w:r>
-        <w:rPr>
-          <w:rFonts w:ascii="Times New Roman" w:eastAsia="CMR10" w:hAnsi="Times New Roman" w:cs="Times New Roman"/>
-          <w:kern w:val="0"/>
-        </w:rPr>
-        <w:t xml:space="preserve">Which values of </w:t>
-      </w:r>
+        <w:t xml:space="preserve">(10 </w:t>
+      </w:r>
+      <w:proofErr w:type="spellStart"/>
+      <w:r>
+        <w:rPr>
+          <w:rFonts w:ascii="Times New Roman" w:eastAsia="CMBX10" w:hAnsi="Times New Roman" w:cs="Times New Roman"/>
+          <w:kern w:val="0"/>
+        </w:rPr>
+        <w:t>pts</w:t>
+      </w:r>
+      <w:proofErr w:type="spellEnd"/>
+      <w:r>
+        <w:rPr>
+          <w:rFonts w:ascii="Times New Roman" w:eastAsia="CMBX10" w:hAnsi="Times New Roman" w:cs="Times New Roman"/>
+          <w:kern w:val="0"/>
+        </w:rPr>
+        <w:t xml:space="preserve">) </w:t>
+      </w:r>
+      <w:proofErr w:type="spellStart"/>
+      <w:r>
+        <w:rPr>
+          <w:rFonts w:ascii="Times New Roman" w:eastAsia="CMR10" w:hAnsi="Times New Roman" w:cs="Times New Roman"/>
+          <w:kern w:val="0"/>
+        </w:rPr>
+        <w:t>Which</w:t>
+      </w:r>
+      <w:proofErr w:type="spellEnd"/>
+      <w:r>
+        <w:rPr>
+          <w:rFonts w:ascii="Times New Roman" w:eastAsia="CMR10" w:hAnsi="Times New Roman" w:cs="Times New Roman"/>
+          <w:kern w:val="0"/>
+        </w:rPr>
+        <w:t xml:space="preserve"> </w:t>
+      </w:r>
+      <w:proofErr w:type="spellStart"/>
+      <w:r>
+        <w:rPr>
+          <w:rFonts w:ascii="Times New Roman" w:eastAsia="CMR10" w:hAnsi="Times New Roman" w:cs="Times New Roman"/>
+          <w:kern w:val="0"/>
+        </w:rPr>
+        <w:t>values</w:t>
+      </w:r>
+      <w:proofErr w:type="spellEnd"/>
+      <w:r>
+        <w:rPr>
+          <w:rFonts w:ascii="Times New Roman" w:eastAsia="CMR10" w:hAnsi="Times New Roman" w:cs="Times New Roman"/>
+          <w:kern w:val="0"/>
+        </w:rPr>
+        <w:t xml:space="preserve"> </w:t>
+      </w:r>
+      <w:proofErr w:type="spellStart"/>
+      <w:r>
+        <w:rPr>
+          <w:rFonts w:ascii="Times New Roman" w:eastAsia="CMR10" w:hAnsi="Times New Roman" w:cs="Times New Roman"/>
+          <w:kern w:val="0"/>
+        </w:rPr>
+        <w:t>of</w:t>
+      </w:r>
+      <w:proofErr w:type="spellEnd"/>
+      <w:r>
+        <w:rPr>
+          <w:rFonts w:ascii="Times New Roman" w:eastAsia="CMR10" w:hAnsi="Times New Roman" w:cs="Times New Roman"/>
+          <w:kern w:val="0"/>
+        </w:rPr>
+        <w:t xml:space="preserve"> </w:t>
+      </w:r>
+      <w:proofErr w:type="spellStart"/>
       <w:r>
         <w:rPr>
           <w:rFonts w:ascii="Times New Roman" w:eastAsia="CMTT10" w:hAnsi="Times New Roman" w:cs="Times New Roman"/>
           <w:kern w:val="0"/>
         </w:rPr>
-        <w:t xml:space="preserve">Threshold </w:t>
+        <w:t>Threshold</w:t>
+      </w:r>
+      <w:proofErr w:type="spellEnd"/>
+      <w:r>
+        <w:rPr>
+          <w:rFonts w:ascii="Times New Roman" w:eastAsia="CMTT10" w:hAnsi="Times New Roman" w:cs="Times New Roman"/>
+          <w:kern w:val="0"/>
+        </w:rPr>
+        <w:t xml:space="preserve"> </w:t>
       </w:r>
       <w:r>
         <w:rPr>
@@ -880,28 +2122,135 @@
           <w:rFonts w:ascii="Times New Roman" w:eastAsia="CMTT10" w:hAnsi="Times New Roman" w:cs="Times New Roman"/>
           <w:kern w:val="0"/>
         </w:rPr>
-        <w:t xml:space="preserve">Level of Parallelism </w:t>
-      </w:r>
-      <w:r>
-        <w:rPr>
-          <w:rFonts w:ascii="Times New Roman" w:eastAsia="CMR10" w:hAnsi="Times New Roman" w:cs="Times New Roman"/>
-          <w:kern w:val="0"/>
-        </w:rPr>
-        <w:t>give you the (likely) shortest</w:t>
-      </w:r>
-      <w:r>
-        <w:rPr>
-          <w:rFonts w:ascii="Times New Roman" w:eastAsia="CMR10" w:hAnsi="Times New Roman" w:cs="Times New Roman"/>
-          <w:kern w:val="0"/>
-        </w:rPr>
-        <w:t xml:space="preserve"> </w:t>
-      </w:r>
-      <w:r>
-        <w:rPr>
-          <w:rFonts w:ascii="Times New Roman" w:eastAsia="CMR10" w:hAnsi="Times New Roman" w:cs="Times New Roman"/>
-          <w:kern w:val="0"/>
-        </w:rPr>
-        <w:t>running time?</w:t>
+        <w:t xml:space="preserve">Level </w:t>
+      </w:r>
+      <w:proofErr w:type="spellStart"/>
+      <w:r>
+        <w:rPr>
+          <w:rFonts w:ascii="Times New Roman" w:eastAsia="CMTT10" w:hAnsi="Times New Roman" w:cs="Times New Roman"/>
+          <w:kern w:val="0"/>
+        </w:rPr>
+        <w:t>of</w:t>
+      </w:r>
+      <w:proofErr w:type="spellEnd"/>
+      <w:r>
+        <w:rPr>
+          <w:rFonts w:ascii="Times New Roman" w:eastAsia="CMTT10" w:hAnsi="Times New Roman" w:cs="Times New Roman"/>
+          <w:kern w:val="0"/>
+        </w:rPr>
+        <w:t xml:space="preserve"> </w:t>
+      </w:r>
+      <w:proofErr w:type="spellStart"/>
+      <w:r>
+        <w:rPr>
+          <w:rFonts w:ascii="Times New Roman" w:eastAsia="CMTT10" w:hAnsi="Times New Roman" w:cs="Times New Roman"/>
+          <w:kern w:val="0"/>
+        </w:rPr>
+        <w:t>Parallelism</w:t>
+      </w:r>
+      <w:proofErr w:type="spellEnd"/>
+      <w:r>
+        <w:rPr>
+          <w:rFonts w:ascii="Times New Roman" w:eastAsia="CMTT10" w:hAnsi="Times New Roman" w:cs="Times New Roman"/>
+          <w:kern w:val="0"/>
+        </w:rPr>
+        <w:t xml:space="preserve"> </w:t>
+      </w:r>
+      <w:proofErr w:type="spellStart"/>
+      <w:r>
+        <w:rPr>
+          <w:rFonts w:ascii="Times New Roman" w:eastAsia="CMR10" w:hAnsi="Times New Roman" w:cs="Times New Roman"/>
+          <w:kern w:val="0"/>
+        </w:rPr>
+        <w:t>give</w:t>
+      </w:r>
+      <w:proofErr w:type="spellEnd"/>
+      <w:r>
+        <w:rPr>
+          <w:rFonts w:ascii="Times New Roman" w:eastAsia="CMR10" w:hAnsi="Times New Roman" w:cs="Times New Roman"/>
+          <w:kern w:val="0"/>
+        </w:rPr>
+        <w:t xml:space="preserve"> </w:t>
+      </w:r>
+      <w:proofErr w:type="spellStart"/>
+      <w:r>
+        <w:rPr>
+          <w:rFonts w:ascii="Times New Roman" w:eastAsia="CMR10" w:hAnsi="Times New Roman" w:cs="Times New Roman"/>
+          <w:kern w:val="0"/>
+        </w:rPr>
+        <w:t>you</w:t>
+      </w:r>
+      <w:proofErr w:type="spellEnd"/>
+      <w:r>
+        <w:rPr>
+          <w:rFonts w:ascii="Times New Roman" w:eastAsia="CMR10" w:hAnsi="Times New Roman" w:cs="Times New Roman"/>
+          <w:kern w:val="0"/>
+        </w:rPr>
+        <w:t xml:space="preserve"> </w:t>
+      </w:r>
+      <w:proofErr w:type="spellStart"/>
+      <w:r>
+        <w:rPr>
+          <w:rFonts w:ascii="Times New Roman" w:eastAsia="CMR10" w:hAnsi="Times New Roman" w:cs="Times New Roman"/>
+          <w:kern w:val="0"/>
+        </w:rPr>
+        <w:t>the</w:t>
+      </w:r>
+      <w:proofErr w:type="spellEnd"/>
+      <w:r>
+        <w:rPr>
+          <w:rFonts w:ascii="Times New Roman" w:eastAsia="CMR10" w:hAnsi="Times New Roman" w:cs="Times New Roman"/>
+          <w:kern w:val="0"/>
+        </w:rPr>
+        <w:t xml:space="preserve"> (</w:t>
+      </w:r>
+      <w:proofErr w:type="spellStart"/>
+      <w:r>
+        <w:rPr>
+          <w:rFonts w:ascii="Times New Roman" w:eastAsia="CMR10" w:hAnsi="Times New Roman" w:cs="Times New Roman"/>
+          <w:kern w:val="0"/>
+        </w:rPr>
+        <w:t>likely</w:t>
+      </w:r>
+      <w:proofErr w:type="spellEnd"/>
+      <w:r>
+        <w:rPr>
+          <w:rFonts w:ascii="Times New Roman" w:eastAsia="CMR10" w:hAnsi="Times New Roman" w:cs="Times New Roman"/>
+          <w:kern w:val="0"/>
+        </w:rPr>
+        <w:t xml:space="preserve">) </w:t>
+      </w:r>
+      <w:proofErr w:type="spellStart"/>
+      <w:r>
+        <w:rPr>
+          <w:rFonts w:ascii="Times New Roman" w:eastAsia="CMR10" w:hAnsi="Times New Roman" w:cs="Times New Roman"/>
+          <w:kern w:val="0"/>
+        </w:rPr>
+        <w:t>shortest</w:t>
+      </w:r>
+      <w:proofErr w:type="spellEnd"/>
+      <w:r>
+        <w:rPr>
+          <w:rFonts w:ascii="Times New Roman" w:eastAsia="CMR10" w:hAnsi="Times New Roman" w:cs="Times New Roman"/>
+          <w:kern w:val="0"/>
+        </w:rPr>
+        <w:t xml:space="preserve"> </w:t>
+      </w:r>
+      <w:proofErr w:type="spellStart"/>
+      <w:r>
+        <w:rPr>
+          <w:rFonts w:ascii="Times New Roman" w:eastAsia="CMR10" w:hAnsi="Times New Roman" w:cs="Times New Roman"/>
+          <w:kern w:val="0"/>
+        </w:rPr>
+        <w:t>running</w:t>
+      </w:r>
+      <w:proofErr w:type="spellEnd"/>
+      <w:r>
+        <w:rPr>
+          <w:rFonts w:ascii="Times New Roman" w:eastAsia="CMR10" w:hAnsi="Times New Roman" w:cs="Times New Roman"/>
+          <w:kern w:val="0"/>
+        </w:rPr>
+        <w:t xml:space="preserve"> time?</w:t>
       </w:r>
     </w:p>
     <w:p>
@@ -920,13 +2269,147 @@
         <w:rPr>
           <w:rFonts w:ascii="Times New Roman" w:eastAsia="CMBX10" w:hAnsi="Times New Roman" w:cs="Times New Roman"/>
         </w:rPr>
-        <w:t xml:space="preserve">(10 pts) </w:t>
-      </w:r>
-      <w:r>
-        <w:rPr>
-          <w:rFonts w:ascii="Times New Roman" w:hAnsi="Times New Roman" w:cs="Times New Roman"/>
-        </w:rPr>
-        <w:t>Use one AI tool to complete the implementation of Task class and</w:t>
+        <w:t xml:space="preserve">(10 </w:t>
+      </w:r>
+      <w:proofErr w:type="spellStart"/>
+      <w:r>
+        <w:rPr>
+          <w:rFonts w:ascii="Times New Roman" w:eastAsia="CMBX10" w:hAnsi="Times New Roman" w:cs="Times New Roman"/>
+        </w:rPr>
+        <w:t>pts</w:t>
+      </w:r>
+      <w:proofErr w:type="spellEnd"/>
+      <w:r>
+        <w:rPr>
+          <w:rFonts w:ascii="Times New Roman" w:eastAsia="CMBX10" w:hAnsi="Times New Roman" w:cs="Times New Roman"/>
+        </w:rPr>
+        <w:t xml:space="preserve">) </w:t>
+      </w:r>
+      <w:proofErr w:type="spellStart"/>
+      <w:r>
+        <w:rPr>
+          <w:rFonts w:ascii="Times New Roman" w:hAnsi="Times New Roman" w:cs="Times New Roman"/>
+        </w:rPr>
+        <w:t>Use</w:t>
+      </w:r>
+      <w:proofErr w:type="spellEnd"/>
+      <w:r>
+        <w:rPr>
+          <w:rFonts w:ascii="Times New Roman" w:hAnsi="Times New Roman" w:cs="Times New Roman"/>
+        </w:rPr>
+        <w:t xml:space="preserve"> </w:t>
+      </w:r>
+      <w:proofErr w:type="spellStart"/>
+      <w:r>
+        <w:rPr>
+          <w:rFonts w:ascii="Times New Roman" w:hAnsi="Times New Roman" w:cs="Times New Roman"/>
+        </w:rPr>
+        <w:t>one</w:t>
+      </w:r>
+      <w:proofErr w:type="spellEnd"/>
+      <w:r>
+        <w:rPr>
+          <w:rFonts w:ascii="Times New Roman" w:hAnsi="Times New Roman" w:cs="Times New Roman"/>
+        </w:rPr>
+        <w:t xml:space="preserve"> AI </w:t>
+      </w:r>
+      <w:proofErr w:type="spellStart"/>
+      <w:r>
+        <w:rPr>
+          <w:rFonts w:ascii="Times New Roman" w:hAnsi="Times New Roman" w:cs="Times New Roman"/>
+        </w:rPr>
+        <w:t>tool</w:t>
+      </w:r>
+      <w:proofErr w:type="spellEnd"/>
+      <w:r>
+        <w:rPr>
+          <w:rFonts w:ascii="Times New Roman" w:hAnsi="Times New Roman" w:cs="Times New Roman"/>
+        </w:rPr>
+        <w:t xml:space="preserve"> to </w:t>
+      </w:r>
+      <w:proofErr w:type="spellStart"/>
+      <w:r>
+        <w:rPr>
+          <w:rFonts w:ascii="Times New Roman" w:hAnsi="Times New Roman" w:cs="Times New Roman"/>
+        </w:rPr>
+        <w:t>complete</w:t>
+      </w:r>
+      <w:proofErr w:type="spellEnd"/>
+      <w:r>
+        <w:rPr>
+          <w:rFonts w:ascii="Times New Roman" w:hAnsi="Times New Roman" w:cs="Times New Roman"/>
+        </w:rPr>
+        <w:t xml:space="preserve"> </w:t>
+      </w:r>
+      <w:proofErr w:type="spellStart"/>
+      <w:r>
+        <w:rPr>
+          <w:rFonts w:ascii="Times New Roman" w:hAnsi="Times New Roman" w:cs="Times New Roman"/>
+        </w:rPr>
+        <w:t>the</w:t>
+      </w:r>
+      <w:proofErr w:type="spellEnd"/>
+      <w:r>
+        <w:rPr>
+          <w:rFonts w:ascii="Times New Roman" w:hAnsi="Times New Roman" w:cs="Times New Roman"/>
+        </w:rPr>
+        <w:t xml:space="preserve"> </w:t>
+      </w:r>
+      <w:proofErr w:type="spellStart"/>
+      <w:r>
+        <w:rPr>
+          <w:rFonts w:ascii="Times New Roman" w:hAnsi="Times New Roman" w:cs="Times New Roman"/>
+        </w:rPr>
+        <w:t>implementation</w:t>
+      </w:r>
+      <w:proofErr w:type="spellEnd"/>
+      <w:r>
+        <w:rPr>
+          <w:rFonts w:ascii="Times New Roman" w:hAnsi="Times New Roman" w:cs="Times New Roman"/>
+        </w:rPr>
+        <w:t xml:space="preserve"> </w:t>
+      </w:r>
+      <w:proofErr w:type="spellStart"/>
+      <w:r>
+        <w:rPr>
+          <w:rFonts w:ascii="Times New Roman" w:hAnsi="Times New Roman" w:cs="Times New Roman"/>
+        </w:rPr>
+        <w:t>of</w:t>
+      </w:r>
+      <w:proofErr w:type="spellEnd"/>
+      <w:r>
+        <w:rPr>
+          <w:rFonts w:ascii="Times New Roman" w:hAnsi="Times New Roman" w:cs="Times New Roman"/>
+        </w:rPr>
+        <w:t xml:space="preserve"> </w:t>
+      </w:r>
+      <w:proofErr w:type="spellStart"/>
+      <w:r>
+        <w:rPr>
+          <w:rFonts w:ascii="Times New Roman" w:hAnsi="Times New Roman" w:cs="Times New Roman"/>
+        </w:rPr>
+        <w:t>Task</w:t>
+      </w:r>
+      <w:proofErr w:type="spellEnd"/>
+      <w:r>
+        <w:rPr>
+          <w:rFonts w:ascii="Times New Roman" w:hAnsi="Times New Roman" w:cs="Times New Roman"/>
+        </w:rPr>
+        <w:t xml:space="preserve"> </w:t>
+      </w:r>
+      <w:proofErr w:type="spellStart"/>
+      <w:r>
+        <w:rPr>
+          <w:rFonts w:ascii="Times New Roman" w:hAnsi="Times New Roman" w:cs="Times New Roman"/>
+        </w:rPr>
+        <w:t>class</w:t>
+      </w:r>
+      <w:proofErr w:type="spellEnd"/>
+      <w:r>
+        <w:rPr>
+          <w:rFonts w:ascii="Times New Roman" w:hAnsi="Times New Roman" w:cs="Times New Roman"/>
+        </w:rPr>
+        <w:t xml:space="preserve"> and</w:t>
       </w:r>
     </w:p>
     <w:sectPr>

</xml_diff>

<commit_message>
lab4: Almost finished exercise 2
</commit_message>
<xml_diff>
--- a/lab4/lab4_report.docx
+++ b/lab4/lab4_report.docx
@@ -169,8 +169,16 @@
           <w:lang w:val="en-GB"/>
         </w:rPr>
         <w:lastRenderedPageBreak/>
-        <w:t>Exercise 1: Review and run code</w:t>
-      </w:r>
+        <w:t xml:space="preserve">Exercise 1: Review and run </w:t>
+      </w:r>
+      <w:proofErr w:type="gramStart"/>
+      <w:r>
+        <w:rPr>
+          <w:lang w:val="en-GB"/>
+        </w:rPr>
+        <w:t>code</w:t>
+      </w:r>
+      <w:proofErr w:type="gramEnd"/>
     </w:p>
     <w:p>
       <w:pPr>
@@ -236,7 +244,23 @@
           <w:rFonts w:ascii="Times New Roman" w:hAnsi="Times New Roman" w:cs="Times New Roman"/>
           <w:lang w:val="en-GB"/>
         </w:rPr>
-        <w:t>&lt;Double&gt; and implements compute() using the usual pattern: if the assigned index range is small, it sums prices directly in a loop; if it’s large, it splits the range into two subtasks, forks one, computes the other, then combines the two results.</w:t>
+        <w:t xml:space="preserve">&lt;Double&gt; and implements compute() using the usual pattern: if the assigned index range is small, it sums prices directly in a loop; if </w:t>
+      </w:r>
+      <w:proofErr w:type="gramStart"/>
+      <w:r>
+        <w:rPr>
+          <w:rFonts w:ascii="Times New Roman" w:hAnsi="Times New Roman" w:cs="Times New Roman"/>
+          <w:lang w:val="en-GB"/>
+        </w:rPr>
+        <w:t>it’s</w:t>
+      </w:r>
+      <w:proofErr w:type="gramEnd"/>
+      <w:r>
+        <w:rPr>
+          <w:rFonts w:ascii="Times New Roman" w:hAnsi="Times New Roman" w:cs="Times New Roman"/>
+          <w:lang w:val="en-GB"/>
+        </w:rPr>
+        <w:t xml:space="preserve"> large, it splits the range into two subtasks, forks one, computes the other, then combines the two results.</w:t>
       </w:r>
     </w:p>
     <w:p>
@@ -283,7 +307,23 @@
           <w:rFonts w:ascii="Times New Roman" w:hAnsi="Times New Roman" w:cs="Times New Roman"/>
           <w:lang w:val="en-GB"/>
         </w:rPr>
-        <w:t>(task), waits until it’s done, then reads the final sum from the task (</w:t>
+        <w:t xml:space="preserve">(task), waits until </w:t>
+      </w:r>
+      <w:proofErr w:type="gramStart"/>
+      <w:r>
+        <w:rPr>
+          <w:rFonts w:ascii="Times New Roman" w:hAnsi="Times New Roman" w:cs="Times New Roman"/>
+          <w:lang w:val="en-GB"/>
+        </w:rPr>
+        <w:t>it’s</w:t>
+      </w:r>
+      <w:proofErr w:type="gramEnd"/>
+      <w:r>
+        <w:rPr>
+          <w:rFonts w:ascii="Times New Roman" w:hAnsi="Times New Roman" w:cs="Times New Roman"/>
+          <w:lang w:val="en-GB"/>
+        </w:rPr>
+        <w:t xml:space="preserve"> done, then reads the final sum from the task (</w:t>
       </w:r>
       <w:proofErr w:type="spellStart"/>
       <w:r>
@@ -344,49 +384,7 @@
           <w:rFonts w:ascii="Times New Roman" w:hAnsi="Times New Roman" w:cs="Times New Roman"/>
           <w:lang w:val="en-GB"/>
         </w:rPr>
-        <w:t xml:space="preserve"> and overrides compute(). If the assigned range is </w:t>
-      </w:r>
-      <w:r>
-        <w:rPr>
-          <w:rFonts w:ascii="Times New Roman" w:hAnsi="Times New Roman" w:cs="Times New Roman"/>
-          <w:lang w:val="en-GB"/>
-        </w:rPr>
-        <w:t>small,</w:t>
-      </w:r>
-      <w:r>
-        <w:rPr>
-          <w:rFonts w:ascii="Times New Roman" w:hAnsi="Times New Roman" w:cs="Times New Roman"/>
-          <w:lang w:val="en-GB"/>
-        </w:rPr>
-        <w:t xml:space="preserve"> it updates prices directly; </w:t>
-      </w:r>
-      <w:r>
-        <w:rPr>
-          <w:rFonts w:ascii="Times New Roman" w:hAnsi="Times New Roman" w:cs="Times New Roman"/>
-          <w:lang w:val="en-GB"/>
-        </w:rPr>
-        <w:t>otherwise,</w:t>
-      </w:r>
-      <w:r>
-        <w:rPr>
-          <w:rFonts w:ascii="Times New Roman" w:hAnsi="Times New Roman" w:cs="Times New Roman"/>
-          <w:lang w:val="en-GB"/>
-        </w:rPr>
-        <w:t xml:space="preserve"> it splits the range into two new Tasks and runs them in parallel using fork() + join()</w:t>
-      </w:r>
-      <w:r>
-        <w:rPr>
-          <w:rFonts w:ascii="Times New Roman" w:hAnsi="Times New Roman" w:cs="Times New Roman"/>
-          <w:lang w:val="en-GB"/>
-        </w:rPr>
-        <w:t xml:space="preserve">, </w:t>
-      </w:r>
-      <w:r>
-        <w:rPr>
-          <w:rFonts w:ascii="Times New Roman" w:hAnsi="Times New Roman" w:cs="Times New Roman"/>
-          <w:lang w:val="en-GB"/>
-        </w:rPr>
-        <w:t xml:space="preserve">or </w:t>
+        <w:t xml:space="preserve"> and overrides compute(). If the assigned range is small, it updates prices directly; otherwise, it splits the range into two new Tasks and runs them in parallel using fork() + join(), or </w:t>
       </w:r>
       <w:proofErr w:type="spellStart"/>
       <w:r>
@@ -417,21 +415,7 @@
           <w:rFonts w:ascii="Times New Roman" w:hAnsi="Times New Roman" w:cs="Times New Roman"/>
           <w:lang w:val="en-GB"/>
         </w:rPr>
-        <w:t xml:space="preserve">The pool usage is in </w:t>
-      </w:r>
-      <w:r>
-        <w:rPr>
-          <w:rFonts w:ascii="Times New Roman" w:hAnsi="Times New Roman" w:cs="Times New Roman"/>
-          <w:lang w:val="en-GB"/>
-        </w:rPr>
-        <w:t>Main.java</w:t>
-      </w:r>
-      <w:r>
-        <w:rPr>
-          <w:rFonts w:ascii="Times New Roman" w:hAnsi="Times New Roman" w:cs="Times New Roman"/>
-          <w:lang w:val="en-GB"/>
-        </w:rPr>
-        <w:t xml:space="preserve">. It uses </w:t>
+        <w:t xml:space="preserve">The pool usage is in Main.java. It uses </w:t>
       </w:r>
       <w:proofErr w:type="spellStart"/>
       <w:r>
@@ -890,134 +874,83 @@
         <w:rPr>
           <w:rFonts w:ascii="Times New Roman" w:eastAsia="CMR10" w:hAnsi="Times New Roman" w:cs="Times New Roman"/>
           <w:kern w:val="0"/>
+          <w:lang w:val="en-GB"/>
         </w:rPr>
       </w:pPr>
       <w:r>
         <w:rPr>
           <w:rFonts w:ascii="Times New Roman" w:eastAsia="CMBX10" w:hAnsi="Times New Roman" w:cs="Times New Roman"/>
           <w:kern w:val="0"/>
-        </w:rPr>
-        <w:t xml:space="preserve">(10 </w:t>
-      </w:r>
-      <w:proofErr w:type="spellStart"/>
-      <w:r>
-        <w:rPr>
-          <w:rFonts w:ascii="Times New Roman" w:eastAsia="CMBX10" w:hAnsi="Times New Roman" w:cs="Times New Roman"/>
-          <w:kern w:val="0"/>
-        </w:rPr>
-        <w:t>pts</w:t>
-      </w:r>
-      <w:proofErr w:type="spellEnd"/>
-      <w:r>
-        <w:rPr>
-          <w:rFonts w:ascii="Times New Roman" w:eastAsia="CMBX10" w:hAnsi="Times New Roman" w:cs="Times New Roman"/>
-          <w:kern w:val="0"/>
-        </w:rPr>
-        <w:t xml:space="preserve">) </w:t>
-      </w:r>
-      <w:proofErr w:type="spellStart"/>
-      <w:r>
-        <w:rPr>
-          <w:rFonts w:ascii="Times New Roman" w:eastAsia="CMR10" w:hAnsi="Times New Roman" w:cs="Times New Roman"/>
-          <w:kern w:val="0"/>
-        </w:rPr>
-        <w:t>Create</w:t>
-      </w:r>
-      <w:proofErr w:type="spellEnd"/>
-      <w:r>
-        <w:rPr>
-          <w:rFonts w:ascii="Times New Roman" w:eastAsia="CMR10" w:hAnsi="Times New Roman" w:cs="Times New Roman"/>
-          <w:kern w:val="0"/>
-        </w:rPr>
-        <w:t xml:space="preserve"> a </w:t>
-      </w:r>
-      <w:proofErr w:type="spellStart"/>
-      <w:r>
-        <w:rPr>
-          <w:rFonts w:ascii="Times New Roman" w:eastAsia="CMR10" w:hAnsi="Times New Roman" w:cs="Times New Roman"/>
-          <w:kern w:val="0"/>
-        </w:rPr>
-        <w:t>project</w:t>
-      </w:r>
-      <w:proofErr w:type="spellEnd"/>
-      <w:r>
-        <w:rPr>
-          <w:rFonts w:ascii="Times New Roman" w:eastAsia="CMR10" w:hAnsi="Times New Roman" w:cs="Times New Roman"/>
-          <w:kern w:val="0"/>
-        </w:rPr>
-        <w:t xml:space="preserve"> and </w:t>
-      </w:r>
-      <w:proofErr w:type="spellStart"/>
-      <w:r>
-        <w:rPr>
-          <w:rFonts w:ascii="Times New Roman" w:eastAsia="CMR10" w:hAnsi="Times New Roman" w:cs="Times New Roman"/>
-          <w:kern w:val="0"/>
-        </w:rPr>
-        <w:t>name</w:t>
-      </w:r>
-      <w:proofErr w:type="spellEnd"/>
-      <w:r>
-        <w:rPr>
-          <w:rFonts w:ascii="Times New Roman" w:eastAsia="CMR10" w:hAnsi="Times New Roman" w:cs="Times New Roman"/>
-          <w:kern w:val="0"/>
-        </w:rPr>
-        <w:t xml:space="preserve"> it </w:t>
-      </w:r>
-      <w:proofErr w:type="spellStart"/>
+          <w:lang w:val="en-GB"/>
+        </w:rPr>
+        <w:t xml:space="preserve">(10 pts) </w:t>
+      </w:r>
+      <w:r>
+        <w:rPr>
+          <w:rFonts w:ascii="Times New Roman" w:eastAsia="CMR10" w:hAnsi="Times New Roman" w:cs="Times New Roman"/>
+          <w:kern w:val="0"/>
+          <w:lang w:val="en-GB"/>
+        </w:rPr>
+        <w:t xml:space="preserve">Create a project and name it </w:t>
+      </w:r>
       <w:r>
         <w:rPr>
           <w:rFonts w:ascii="Times New Roman" w:eastAsia="CMTT10" w:hAnsi="Times New Roman" w:cs="Times New Roman"/>
           <w:kern w:val="0"/>
-        </w:rPr>
-        <w:t>Exercise</w:t>
-      </w:r>
-      <w:proofErr w:type="spellEnd"/>
-      <w:r>
-        <w:rPr>
-          <w:rFonts w:ascii="Times New Roman" w:eastAsia="CMTT10" w:hAnsi="Times New Roman" w:cs="Times New Roman"/>
-          <w:kern w:val="0"/>
-        </w:rPr>
-        <w:t xml:space="preserve"> </w:t>
-      </w:r>
-      <w:r>
-        <w:rPr>
-          <w:rFonts w:ascii="Times New Roman" w:eastAsia="CMR10" w:hAnsi="Times New Roman" w:cs="Times New Roman"/>
-          <w:kern w:val="0"/>
-        </w:rPr>
-        <w:t xml:space="preserve">for </w:t>
-      </w:r>
-      <w:proofErr w:type="spellStart"/>
-      <w:r>
-        <w:rPr>
-          <w:rFonts w:ascii="Times New Roman" w:eastAsia="CMR10" w:hAnsi="Times New Roman" w:cs="Times New Roman"/>
-          <w:kern w:val="0"/>
-        </w:rPr>
-        <w:t>this</w:t>
-      </w:r>
-      <w:proofErr w:type="spellEnd"/>
-      <w:r>
-        <w:rPr>
-          <w:rFonts w:ascii="Times New Roman" w:eastAsia="CMR10" w:hAnsi="Times New Roman" w:cs="Times New Roman"/>
-          <w:kern w:val="0"/>
-        </w:rPr>
-        <w:t xml:space="preserve"> </w:t>
-      </w:r>
-      <w:proofErr w:type="spellStart"/>
-      <w:r>
-        <w:rPr>
-          <w:rFonts w:ascii="Times New Roman" w:eastAsia="CMR10" w:hAnsi="Times New Roman" w:cs="Times New Roman"/>
-          <w:kern w:val="0"/>
-        </w:rPr>
-        <w:t>exercise</w:t>
-      </w:r>
-      <w:proofErr w:type="spellEnd"/>
-      <w:r>
-        <w:rPr>
-          <w:rFonts w:ascii="Times New Roman" w:eastAsia="CMR10" w:hAnsi="Times New Roman" w:cs="Times New Roman"/>
-          <w:kern w:val="0"/>
-        </w:rPr>
-        <w:t>.</w:t>
-      </w:r>
+          <w:lang w:val="en-GB"/>
+        </w:rPr>
+        <w:t xml:space="preserve">Exercise </w:t>
+      </w:r>
+      <w:r>
+        <w:rPr>
+          <w:rFonts w:ascii="Times New Roman" w:eastAsia="CMR10" w:hAnsi="Times New Roman" w:cs="Times New Roman"/>
+          <w:kern w:val="0"/>
+          <w:lang w:val="en-GB"/>
+        </w:rPr>
+        <w:t>for this exercise.</w:t>
+      </w:r>
+    </w:p>
+    <w:p>
+      <w:pPr>
+        <w:pStyle w:val="Listeavsnitt"/>
+        <w:numPr>
+          <w:ilvl w:val="1"/>
+          <w:numId w:val="5"/>
+        </w:numPr>
+        <w:autoSpaceDE w:val="0"/>
+        <w:autoSpaceDN w:val="0"/>
+        <w:adjustRightInd w:val="0"/>
+        <w:spacing w:after="0" w:line="240" w:lineRule="auto"/>
+        <w:rPr>
+          <w:rFonts w:ascii="Times New Roman" w:eastAsia="CMR10" w:hAnsi="Times New Roman" w:cs="Times New Roman"/>
+          <w:b/>
+          <w:bCs/>
+          <w:kern w:val="0"/>
+          <w:lang w:val="en-GB"/>
+        </w:rPr>
+      </w:pPr>
+      <w:r>
+        <w:rPr>
+          <w:rFonts w:ascii="Times New Roman" w:eastAsia="CMR10" w:hAnsi="Times New Roman" w:cs="Times New Roman"/>
+          <w:b/>
+          <w:bCs/>
+          <w:kern w:val="0"/>
+          <w:lang w:val="en-GB"/>
+        </w:rPr>
+        <w:t xml:space="preserve">DONE – Created project with the name «Exercise </w:t>
+      </w:r>
+      <w:proofErr w:type="gramStart"/>
+      <w:r>
+        <w:rPr>
+          <w:rFonts w:ascii="Times New Roman" w:eastAsia="CMR10" w:hAnsi="Times New Roman" w:cs="Times New Roman"/>
+          <w:b/>
+          <w:bCs/>
+          <w:kern w:val="0"/>
+          <w:lang w:val="en-GB"/>
+        </w:rPr>
+        <w:t>2»</w:t>
+      </w:r>
+      <w:proofErr w:type="gramEnd"/>
     </w:p>
     <w:p>
       <w:pPr>
@@ -1033,140 +966,108 @@
         <w:rPr>
           <w:rFonts w:ascii="Times New Roman" w:eastAsia="CMR10" w:hAnsi="Times New Roman" w:cs="Times New Roman"/>
           <w:kern w:val="0"/>
+          <w:lang w:val="en-GB"/>
         </w:rPr>
       </w:pPr>
       <w:r>
         <w:rPr>
           <w:rFonts w:ascii="Times New Roman" w:eastAsia="CMBX10" w:hAnsi="Times New Roman" w:cs="Times New Roman"/>
           <w:kern w:val="0"/>
-        </w:rPr>
-        <w:t xml:space="preserve">(10 </w:t>
+          <w:lang w:val="en-GB"/>
+        </w:rPr>
+        <w:t xml:space="preserve">(10 pts) </w:t>
+      </w:r>
+      <w:r>
+        <w:rPr>
+          <w:rFonts w:ascii="Times New Roman" w:eastAsia="CMR10" w:hAnsi="Times New Roman" w:cs="Times New Roman"/>
+          <w:kern w:val="0"/>
+          <w:lang w:val="en-GB"/>
+        </w:rPr>
+        <w:t xml:space="preserve">Complete the implementation of </w:t>
+      </w:r>
+      <w:r>
+        <w:rPr>
+          <w:rFonts w:ascii="Times New Roman" w:eastAsia="CMTT10" w:hAnsi="Times New Roman" w:cs="Times New Roman"/>
+          <w:kern w:val="0"/>
+          <w:lang w:val="en-GB"/>
+        </w:rPr>
+        <w:t xml:space="preserve">Task </w:t>
+      </w:r>
+      <w:r>
+        <w:rPr>
+          <w:rFonts w:ascii="Times New Roman" w:eastAsia="CMR10" w:hAnsi="Times New Roman" w:cs="Times New Roman"/>
+          <w:kern w:val="0"/>
+          <w:lang w:val="en-GB"/>
+        </w:rPr>
+        <w:t xml:space="preserve">class and </w:t>
+      </w:r>
+      <w:r>
+        <w:rPr>
+          <w:rFonts w:ascii="Times New Roman" w:eastAsia="CMTT10" w:hAnsi="Times New Roman" w:cs="Times New Roman"/>
+          <w:kern w:val="0"/>
+          <w:lang w:val="en-GB"/>
+        </w:rPr>
+        <w:t xml:space="preserve">Main </w:t>
+      </w:r>
+      <w:r>
+        <w:rPr>
+          <w:rFonts w:ascii="Times New Roman" w:eastAsia="CMR10" w:hAnsi="Times New Roman" w:cs="Times New Roman"/>
+          <w:kern w:val="0"/>
+          <w:lang w:val="en-GB"/>
+        </w:rPr>
+        <w:t>class.</w:t>
+      </w:r>
+    </w:p>
+    <w:p>
+      <w:pPr>
+        <w:pStyle w:val="Listeavsnitt"/>
+        <w:numPr>
+          <w:ilvl w:val="1"/>
+          <w:numId w:val="5"/>
+        </w:numPr>
+        <w:autoSpaceDE w:val="0"/>
+        <w:autoSpaceDN w:val="0"/>
+        <w:adjustRightInd w:val="0"/>
+        <w:spacing w:after="0" w:line="240" w:lineRule="auto"/>
+        <w:rPr>
+          <w:rFonts w:ascii="Times New Roman" w:eastAsia="CMR10" w:hAnsi="Times New Roman" w:cs="Times New Roman"/>
+          <w:b/>
+          <w:bCs/>
+          <w:kern w:val="0"/>
+          <w:lang w:val="en-GB"/>
+        </w:rPr>
+      </w:pPr>
+      <w:r>
+        <w:rPr>
+          <w:rFonts w:ascii="Times New Roman" w:eastAsia="CMR10" w:hAnsi="Times New Roman" w:cs="Times New Roman"/>
+          <w:b/>
+          <w:bCs/>
+          <w:kern w:val="0"/>
+          <w:lang w:val="en-GB"/>
+        </w:rPr>
+        <w:t xml:space="preserve">DONE – </w:t>
       </w:r>
       <w:proofErr w:type="spellStart"/>
       <w:r>
         <w:rPr>
-          <w:rFonts w:ascii="Times New Roman" w:eastAsia="CMBX10" w:hAnsi="Times New Roman" w:cs="Times New Roman"/>
-          <w:kern w:val="0"/>
-        </w:rPr>
-        <w:t>pts</w:t>
+          <w:rFonts w:ascii="Times New Roman" w:eastAsia="CMR10" w:hAnsi="Times New Roman" w:cs="Times New Roman"/>
+          <w:b/>
+          <w:bCs/>
+          <w:kern w:val="0"/>
+          <w:lang w:val="en-GB"/>
+        </w:rPr>
+        <w:t>ToDo</w:t>
       </w:r>
       <w:proofErr w:type="spellEnd"/>
       <w:r>
         <w:rPr>
-          <w:rFonts w:ascii="Times New Roman" w:eastAsia="CMBX10" w:hAnsi="Times New Roman" w:cs="Times New Roman"/>
-          <w:kern w:val="0"/>
-        </w:rPr>
-        <w:t xml:space="preserve">) </w:t>
-      </w:r>
-      <w:r>
-        <w:rPr>
-          <w:rFonts w:ascii="Times New Roman" w:eastAsia="CMR10" w:hAnsi="Times New Roman" w:cs="Times New Roman"/>
-          <w:kern w:val="0"/>
-        </w:rPr>
-        <w:t xml:space="preserve">Complete </w:t>
-      </w:r>
-      <w:proofErr w:type="spellStart"/>
-      <w:r>
-        <w:rPr>
-          <w:rFonts w:ascii="Times New Roman" w:eastAsia="CMR10" w:hAnsi="Times New Roman" w:cs="Times New Roman"/>
-          <w:kern w:val="0"/>
-        </w:rPr>
-        <w:t>the</w:t>
-      </w:r>
-      <w:proofErr w:type="spellEnd"/>
-      <w:r>
-        <w:rPr>
-          <w:rFonts w:ascii="Times New Roman" w:eastAsia="CMR10" w:hAnsi="Times New Roman" w:cs="Times New Roman"/>
-          <w:kern w:val="0"/>
-        </w:rPr>
-        <w:t xml:space="preserve"> </w:t>
-      </w:r>
-      <w:proofErr w:type="spellStart"/>
-      <w:r>
-        <w:rPr>
-          <w:rFonts w:ascii="Times New Roman" w:eastAsia="CMR10" w:hAnsi="Times New Roman" w:cs="Times New Roman"/>
-          <w:kern w:val="0"/>
-        </w:rPr>
-        <w:t>implementation</w:t>
-      </w:r>
-      <w:proofErr w:type="spellEnd"/>
-      <w:r>
-        <w:rPr>
-          <w:rFonts w:ascii="Times New Roman" w:eastAsia="CMR10" w:hAnsi="Times New Roman" w:cs="Times New Roman"/>
-          <w:kern w:val="0"/>
-        </w:rPr>
-        <w:t xml:space="preserve"> </w:t>
-      </w:r>
-      <w:proofErr w:type="spellStart"/>
-      <w:r>
-        <w:rPr>
-          <w:rFonts w:ascii="Times New Roman" w:eastAsia="CMR10" w:hAnsi="Times New Roman" w:cs="Times New Roman"/>
-          <w:kern w:val="0"/>
-        </w:rPr>
-        <w:t>of</w:t>
-      </w:r>
-      <w:proofErr w:type="spellEnd"/>
-      <w:r>
-        <w:rPr>
-          <w:rFonts w:ascii="Times New Roman" w:eastAsia="CMR10" w:hAnsi="Times New Roman" w:cs="Times New Roman"/>
-          <w:kern w:val="0"/>
-        </w:rPr>
-        <w:t xml:space="preserve"> </w:t>
-      </w:r>
-      <w:proofErr w:type="spellStart"/>
-      <w:r>
-        <w:rPr>
-          <w:rFonts w:ascii="Times New Roman" w:eastAsia="CMTT10" w:hAnsi="Times New Roman" w:cs="Times New Roman"/>
-          <w:kern w:val="0"/>
-        </w:rPr>
-        <w:t>Task</w:t>
-      </w:r>
-      <w:proofErr w:type="spellEnd"/>
-      <w:r>
-        <w:rPr>
-          <w:rFonts w:ascii="Times New Roman" w:eastAsia="CMTT10" w:hAnsi="Times New Roman" w:cs="Times New Roman"/>
-          <w:kern w:val="0"/>
-        </w:rPr>
-        <w:t xml:space="preserve"> </w:t>
-      </w:r>
-      <w:proofErr w:type="spellStart"/>
-      <w:r>
-        <w:rPr>
-          <w:rFonts w:ascii="Times New Roman" w:eastAsia="CMR10" w:hAnsi="Times New Roman" w:cs="Times New Roman"/>
-          <w:kern w:val="0"/>
-        </w:rPr>
-        <w:t>class</w:t>
-      </w:r>
-      <w:proofErr w:type="spellEnd"/>
-      <w:r>
-        <w:rPr>
-          <w:rFonts w:ascii="Times New Roman" w:eastAsia="CMR10" w:hAnsi="Times New Roman" w:cs="Times New Roman"/>
-          <w:kern w:val="0"/>
-        </w:rPr>
-        <w:t xml:space="preserve"> and </w:t>
-      </w:r>
-      <w:r>
-        <w:rPr>
-          <w:rFonts w:ascii="Times New Roman" w:eastAsia="CMTT10" w:hAnsi="Times New Roman" w:cs="Times New Roman"/>
-          <w:kern w:val="0"/>
-        </w:rPr>
-        <w:t xml:space="preserve">Main </w:t>
-      </w:r>
-      <w:proofErr w:type="spellStart"/>
-      <w:r>
-        <w:rPr>
-          <w:rFonts w:ascii="Times New Roman" w:eastAsia="CMR10" w:hAnsi="Times New Roman" w:cs="Times New Roman"/>
-          <w:kern w:val="0"/>
-        </w:rPr>
-        <w:t>class</w:t>
-      </w:r>
-      <w:proofErr w:type="spellEnd"/>
-      <w:r>
-        <w:rPr>
-          <w:rFonts w:ascii="Times New Roman" w:eastAsia="CMR10" w:hAnsi="Times New Roman" w:cs="Times New Roman"/>
-          <w:kern w:val="0"/>
-        </w:rPr>
-        <w:t>.</w:t>
+          <w:rFonts w:ascii="Times New Roman" w:eastAsia="CMR10" w:hAnsi="Times New Roman" w:cs="Times New Roman"/>
+          <w:b/>
+          <w:bCs/>
+          <w:kern w:val="0"/>
+          <w:lang w:val="en-GB"/>
+        </w:rPr>
+        <w:t xml:space="preserve"> list has been resolved, and program runs.</w:t>
       </w:r>
     </w:p>
     <w:p>
@@ -1183,197 +1084,169 @@
         <w:rPr>
           <w:rFonts w:ascii="Times New Roman" w:eastAsia="CMR10" w:hAnsi="Times New Roman" w:cs="Times New Roman"/>
           <w:kern w:val="0"/>
+          <w:lang w:val="en-GB"/>
         </w:rPr>
       </w:pPr>
       <w:r>
         <w:rPr>
           <w:rFonts w:ascii="Times New Roman" w:eastAsia="CMBX10" w:hAnsi="Times New Roman" w:cs="Times New Roman"/>
           <w:kern w:val="0"/>
-        </w:rPr>
-        <w:t xml:space="preserve">(10 </w:t>
-      </w:r>
-      <w:proofErr w:type="spellStart"/>
-      <w:r>
-        <w:rPr>
-          <w:rFonts w:ascii="Times New Roman" w:eastAsia="CMBX10" w:hAnsi="Times New Roman" w:cs="Times New Roman"/>
-          <w:kern w:val="0"/>
-        </w:rPr>
-        <w:t>pts</w:t>
-      </w:r>
-      <w:proofErr w:type="spellEnd"/>
-      <w:r>
-        <w:rPr>
-          <w:rFonts w:ascii="Times New Roman" w:eastAsia="CMBX10" w:hAnsi="Times New Roman" w:cs="Times New Roman"/>
-          <w:kern w:val="0"/>
-        </w:rPr>
-        <w:t xml:space="preserve">) </w:t>
-      </w:r>
-      <w:r>
-        <w:rPr>
-          <w:rFonts w:ascii="Times New Roman" w:eastAsia="CMR10" w:hAnsi="Times New Roman" w:cs="Times New Roman"/>
-          <w:kern w:val="0"/>
-        </w:rPr>
-        <w:t xml:space="preserve">Run </w:t>
-      </w:r>
-      <w:proofErr w:type="spellStart"/>
-      <w:r>
-        <w:rPr>
-          <w:rFonts w:ascii="Times New Roman" w:eastAsia="CMR10" w:hAnsi="Times New Roman" w:cs="Times New Roman"/>
-          <w:kern w:val="0"/>
-        </w:rPr>
-        <w:t>your</w:t>
-      </w:r>
-      <w:proofErr w:type="spellEnd"/>
-      <w:r>
-        <w:rPr>
-          <w:rFonts w:ascii="Times New Roman" w:eastAsia="CMR10" w:hAnsi="Times New Roman" w:cs="Times New Roman"/>
-          <w:kern w:val="0"/>
-        </w:rPr>
-        <w:t xml:space="preserve"> </w:t>
-      </w:r>
-      <w:proofErr w:type="spellStart"/>
-      <w:r>
-        <w:rPr>
-          <w:rFonts w:ascii="Times New Roman" w:eastAsia="CMR10" w:hAnsi="Times New Roman" w:cs="Times New Roman"/>
-          <w:kern w:val="0"/>
-        </w:rPr>
-        <w:t>code</w:t>
-      </w:r>
-      <w:proofErr w:type="spellEnd"/>
-      <w:r>
-        <w:rPr>
-          <w:rFonts w:ascii="Times New Roman" w:eastAsia="CMR10" w:hAnsi="Times New Roman" w:cs="Times New Roman"/>
-          <w:kern w:val="0"/>
-        </w:rPr>
-        <w:t xml:space="preserve"> </w:t>
-      </w:r>
-      <w:proofErr w:type="spellStart"/>
-      <w:r>
-        <w:rPr>
-          <w:rFonts w:ascii="Times New Roman" w:eastAsia="CMR10" w:hAnsi="Times New Roman" w:cs="Times New Roman"/>
-          <w:kern w:val="0"/>
-        </w:rPr>
-        <w:t>with</w:t>
-      </w:r>
-      <w:proofErr w:type="spellEnd"/>
-      <w:r>
-        <w:rPr>
-          <w:rFonts w:ascii="Times New Roman" w:eastAsia="CMR10" w:hAnsi="Times New Roman" w:cs="Times New Roman"/>
-          <w:kern w:val="0"/>
-        </w:rPr>
-        <w:t xml:space="preserve"> different </w:t>
-      </w:r>
-      <w:proofErr w:type="spellStart"/>
-      <w:r>
-        <w:rPr>
-          <w:rFonts w:ascii="Times New Roman" w:eastAsia="CMR10" w:hAnsi="Times New Roman" w:cs="Times New Roman"/>
-          <w:kern w:val="0"/>
-        </w:rPr>
-        <w:t>values</w:t>
-      </w:r>
-      <w:proofErr w:type="spellEnd"/>
-      <w:r>
-        <w:rPr>
-          <w:rFonts w:ascii="Times New Roman" w:eastAsia="CMR10" w:hAnsi="Times New Roman" w:cs="Times New Roman"/>
-          <w:kern w:val="0"/>
-        </w:rPr>
-        <w:t xml:space="preserve"> </w:t>
-      </w:r>
-      <w:proofErr w:type="spellStart"/>
-      <w:r>
-        <w:rPr>
-          <w:rFonts w:ascii="Times New Roman" w:eastAsia="CMR10" w:hAnsi="Times New Roman" w:cs="Times New Roman"/>
-          <w:kern w:val="0"/>
-        </w:rPr>
-        <w:t>of</w:t>
-      </w:r>
-      <w:proofErr w:type="spellEnd"/>
-      <w:r>
-        <w:rPr>
-          <w:rFonts w:ascii="Times New Roman" w:eastAsia="CMR10" w:hAnsi="Times New Roman" w:cs="Times New Roman"/>
-          <w:kern w:val="0"/>
-        </w:rPr>
-        <w:t xml:space="preserve"> </w:t>
-      </w:r>
-      <w:proofErr w:type="spellStart"/>
-      <w:r>
-        <w:rPr>
-          <w:rFonts w:ascii="Times New Roman" w:eastAsia="CMR10" w:hAnsi="Times New Roman" w:cs="Times New Roman"/>
-          <w:kern w:val="0"/>
-        </w:rPr>
-        <w:t>Threshold</w:t>
-      </w:r>
-      <w:proofErr w:type="spellEnd"/>
-      <w:r>
-        <w:rPr>
-          <w:rFonts w:ascii="Times New Roman" w:eastAsia="CMR10" w:hAnsi="Times New Roman" w:cs="Times New Roman"/>
-          <w:kern w:val="0"/>
-        </w:rPr>
-        <w:t xml:space="preserve"> and Level </w:t>
-      </w:r>
-      <w:proofErr w:type="spellStart"/>
-      <w:r>
-        <w:rPr>
-          <w:rFonts w:ascii="Times New Roman" w:eastAsia="CMR10" w:hAnsi="Times New Roman" w:cs="Times New Roman"/>
-          <w:kern w:val="0"/>
-        </w:rPr>
-        <w:t>of</w:t>
-      </w:r>
-      <w:proofErr w:type="spellEnd"/>
-      <w:r>
-        <w:rPr>
-          <w:rFonts w:ascii="Times New Roman" w:eastAsia="CMR10" w:hAnsi="Times New Roman" w:cs="Times New Roman"/>
-          <w:kern w:val="0"/>
-        </w:rPr>
-        <w:t xml:space="preserve"> </w:t>
-      </w:r>
-      <w:proofErr w:type="spellStart"/>
-      <w:r>
-        <w:rPr>
-          <w:rFonts w:ascii="Times New Roman" w:eastAsia="CMR10" w:hAnsi="Times New Roman" w:cs="Times New Roman"/>
-          <w:kern w:val="0"/>
-        </w:rPr>
-        <w:t>Parallelism</w:t>
-      </w:r>
-      <w:proofErr w:type="spellEnd"/>
-      <w:r>
-        <w:rPr>
-          <w:rFonts w:ascii="Times New Roman" w:eastAsia="CMR10" w:hAnsi="Times New Roman" w:cs="Times New Roman"/>
-          <w:kern w:val="0"/>
-        </w:rPr>
-        <w:t xml:space="preserve"> and </w:t>
-      </w:r>
-      <w:proofErr w:type="spellStart"/>
-      <w:r>
-        <w:rPr>
-          <w:rFonts w:ascii="Times New Roman" w:eastAsia="CMR10" w:hAnsi="Times New Roman" w:cs="Times New Roman"/>
-          <w:kern w:val="0"/>
-        </w:rPr>
-        <w:t>add</w:t>
-      </w:r>
-      <w:proofErr w:type="spellEnd"/>
-      <w:r>
-        <w:rPr>
-          <w:rFonts w:ascii="Times New Roman" w:eastAsia="CMR10" w:hAnsi="Times New Roman" w:cs="Times New Roman"/>
-          <w:kern w:val="0"/>
-        </w:rPr>
-        <w:t xml:space="preserve"> screenshots to </w:t>
-      </w:r>
-      <w:proofErr w:type="spellStart"/>
-      <w:r>
-        <w:rPr>
-          <w:rFonts w:ascii="Times New Roman" w:eastAsia="CMR10" w:hAnsi="Times New Roman" w:cs="Times New Roman"/>
-          <w:kern w:val="0"/>
-        </w:rPr>
-        <w:t>your</w:t>
-      </w:r>
-      <w:proofErr w:type="spellEnd"/>
-      <w:r>
-        <w:rPr>
-          <w:rFonts w:ascii="Times New Roman" w:eastAsia="CMR10" w:hAnsi="Times New Roman" w:cs="Times New Roman"/>
-          <w:kern w:val="0"/>
-        </w:rPr>
-        <w:t xml:space="preserve"> report.</w:t>
+          <w:lang w:val="en-GB"/>
+        </w:rPr>
+        <w:t xml:space="preserve">(10 pts) </w:t>
+      </w:r>
+      <w:r>
+        <w:rPr>
+          <w:rFonts w:ascii="Times New Roman" w:eastAsia="CMR10" w:hAnsi="Times New Roman" w:cs="Times New Roman"/>
+          <w:kern w:val="0"/>
+          <w:lang w:val="en-GB"/>
+        </w:rPr>
+        <w:t>Run your code with different values of Threshold and Level of Parallelism and add screenshots to your report.</w:t>
+      </w:r>
+    </w:p>
+    <w:p>
+      <w:pPr>
+        <w:pStyle w:val="Listeavsnitt"/>
+        <w:numPr>
+          <w:ilvl w:val="1"/>
+          <w:numId w:val="5"/>
+        </w:numPr>
+        <w:autoSpaceDE w:val="0"/>
+        <w:autoSpaceDN w:val="0"/>
+        <w:adjustRightInd w:val="0"/>
+        <w:spacing w:after="0" w:line="240" w:lineRule="auto"/>
+        <w:rPr>
+          <w:rFonts w:ascii="Times New Roman" w:eastAsia="CMR10" w:hAnsi="Times New Roman" w:cs="Times New Roman"/>
+          <w:b/>
+          <w:bCs/>
+          <w:kern w:val="0"/>
+          <w:lang w:val="en-GB"/>
+        </w:rPr>
+      </w:pPr>
+      <w:r>
+        <w:rPr>
+          <w:rFonts w:ascii="Times New Roman" w:eastAsia="CMR10" w:hAnsi="Times New Roman" w:cs="Times New Roman"/>
+          <w:b/>
+          <w:bCs/>
+          <w:kern w:val="0"/>
+          <w:lang w:val="en-GB"/>
+        </w:rPr>
+        <w:t>DONE – Screenshot</w:t>
+      </w:r>
+      <w:r>
+        <w:rPr>
+          <w:rFonts w:ascii="Times New Roman" w:eastAsia="CMR10" w:hAnsi="Times New Roman" w:cs="Times New Roman"/>
+          <w:b/>
+          <w:bCs/>
+          <w:kern w:val="0"/>
+          <w:lang w:val="en-GB"/>
+        </w:rPr>
+        <w:t>s</w:t>
+      </w:r>
+      <w:r>
+        <w:rPr>
+          <w:rFonts w:ascii="Times New Roman" w:eastAsia="CMR10" w:hAnsi="Times New Roman" w:cs="Times New Roman"/>
+          <w:b/>
+          <w:bCs/>
+          <w:kern w:val="0"/>
+          <w:lang w:val="en-GB"/>
+        </w:rPr>
+        <w:t xml:space="preserve"> below.</w:t>
+      </w:r>
+    </w:p>
+    <w:p>
+      <w:pPr>
+        <w:rPr>
+          <w:lang w:val="en-GB"/>
+        </w:rPr>
+      </w:pPr>
+      <w:r>
+        <w:rPr>
+          <w:lang w:val="en-GB"/>
+        </w:rPr>
+        <w:lastRenderedPageBreak/>
+        <w:drawing>
+          <wp:inline distT="0" distB="0" distL="0" distR="0" wp14:anchorId="67551EA1" wp14:editId="50316197">
+            <wp:extent cx="4458322" cy="3381847"/>
+            <wp:effectExtent l="0" t="0" r="0" b="9525"/>
+            <wp:docPr id="1680271430" name="Bilde 1" descr="Et bilde som inneholder tekst, skjermbilde, Font&#10;&#10;KI-generert innhold kan være feil."/>
+            <wp:cNvGraphicFramePr>
+              <a:graphicFrameLocks xmlns:a="http://schemas.openxmlformats.org/drawingml/2006/main" noChangeAspect="1"/>
+            </wp:cNvGraphicFramePr>
+            <a:graphic xmlns:a="http://schemas.openxmlformats.org/drawingml/2006/main">
+              <a:graphicData uri="http://schemas.openxmlformats.org/drawingml/2006/picture">
+                <pic:pic xmlns:pic="http://schemas.openxmlformats.org/drawingml/2006/picture">
+                  <pic:nvPicPr>
+                    <pic:cNvPr id="1680271430" name="Bilde 1" descr="Et bilde som inneholder tekst, skjermbilde, Font&#10;&#10;KI-generert innhold kan være feil."/>
+                    <pic:cNvPicPr/>
+                  </pic:nvPicPr>
+                  <pic:blipFill>
+                    <a:blip r:embed="rId12"/>
+                    <a:stretch>
+                      <a:fillRect/>
+                    </a:stretch>
+                  </pic:blipFill>
+                  <pic:spPr>
+                    <a:xfrm>
+                      <a:off x="0" y="0"/>
+                      <a:ext cx="4458322" cy="3381847"/>
+                    </a:xfrm>
+                    <a:prstGeom prst="rect">
+                      <a:avLst/>
+                    </a:prstGeom>
+                  </pic:spPr>
+                </pic:pic>
+              </a:graphicData>
+            </a:graphic>
+          </wp:inline>
+        </w:drawing>
+      </w:r>
+    </w:p>
+    <w:p>
+      <w:pPr>
+        <w:rPr>
+          <w:lang w:val="en-GB"/>
+        </w:rPr>
+      </w:pPr>
+      <w:r>
+        <w:rPr>
+          <w:lang w:val="en-GB"/>
+        </w:rPr>
+        <w:drawing>
+          <wp:inline distT="0" distB="0" distL="0" distR="0" wp14:anchorId="0EBA2AD7" wp14:editId="6DD50683">
+            <wp:extent cx="4915586" cy="2505425"/>
+            <wp:effectExtent l="0" t="0" r="0" b="9525"/>
+            <wp:docPr id="131633933" name="Bilde 1" descr="Et bilde som inneholder tekst, skjermbilde, Font, programvare&#10;&#10;KI-generert innhold kan være feil."/>
+            <wp:cNvGraphicFramePr>
+              <a:graphicFrameLocks xmlns:a="http://schemas.openxmlformats.org/drawingml/2006/main" noChangeAspect="1"/>
+            </wp:cNvGraphicFramePr>
+            <a:graphic xmlns:a="http://schemas.openxmlformats.org/drawingml/2006/main">
+              <a:graphicData uri="http://schemas.openxmlformats.org/drawingml/2006/picture">
+                <pic:pic xmlns:pic="http://schemas.openxmlformats.org/drawingml/2006/picture">
+                  <pic:nvPicPr>
+                    <pic:cNvPr id="131633933" name="Bilde 1" descr="Et bilde som inneholder tekst, skjermbilde, Font, programvare&#10;&#10;KI-generert innhold kan være feil."/>
+                    <pic:cNvPicPr/>
+                  </pic:nvPicPr>
+                  <pic:blipFill>
+                    <a:blip r:embed="rId13"/>
+                    <a:stretch>
+                      <a:fillRect/>
+                    </a:stretch>
+                  </pic:blipFill>
+                  <pic:spPr>
+                    <a:xfrm>
+                      <a:off x="0" y="0"/>
+                      <a:ext cx="4915586" cy="2505425"/>
+                    </a:xfrm>
+                    <a:prstGeom prst="rect">
+                      <a:avLst/>
+                    </a:prstGeom>
+                  </pic:spPr>
+                </pic:pic>
+              </a:graphicData>
+            </a:graphic>
+          </wp:inline>
+        </w:drawing>
       </w:r>
     </w:p>
     <w:p>
@@ -1390,182 +1263,383 @@
         <w:rPr>
           <w:rFonts w:ascii="Times New Roman" w:eastAsia="CMR10" w:hAnsi="Times New Roman" w:cs="Times New Roman"/>
           <w:kern w:val="0"/>
+          <w:lang w:val="en-GB"/>
         </w:rPr>
       </w:pPr>
       <w:r>
         <w:rPr>
           <w:rFonts w:ascii="Times New Roman" w:eastAsia="CMBX10" w:hAnsi="Times New Roman" w:cs="Times New Roman"/>
           <w:kern w:val="0"/>
-        </w:rPr>
-        <w:t xml:space="preserve">(10 </w:t>
-      </w:r>
+          <w:lang w:val="en-GB"/>
+        </w:rPr>
+        <w:t xml:space="preserve">(10 pts) </w:t>
+      </w:r>
+      <w:r>
+        <w:rPr>
+          <w:rFonts w:ascii="Times New Roman" w:eastAsia="CMR10" w:hAnsi="Times New Roman" w:cs="Times New Roman"/>
+          <w:kern w:val="0"/>
+          <w:lang w:val="en-GB"/>
+        </w:rPr>
+        <w:t>How the running time of the program varies with the above two arguments?</w:t>
+      </w:r>
+    </w:p>
+    <w:p>
+      <w:pPr>
+        <w:pStyle w:val="Listeavsnitt"/>
+        <w:numPr>
+          <w:ilvl w:val="1"/>
+          <w:numId w:val="5"/>
+        </w:numPr>
+        <w:autoSpaceDE w:val="0"/>
+        <w:autoSpaceDN w:val="0"/>
+        <w:adjustRightInd w:val="0"/>
+        <w:spacing w:after="0" w:line="240" w:lineRule="auto"/>
+        <w:rPr>
+          <w:rFonts w:ascii="Times New Roman" w:eastAsia="CMR10" w:hAnsi="Times New Roman" w:cs="Times New Roman"/>
+          <w:kern w:val="0"/>
+          <w:u w:val="single"/>
+          <w:lang w:val="en-GB"/>
+        </w:rPr>
+      </w:pPr>
+      <w:r>
+        <w:rPr>
+          <w:rFonts w:ascii="Times New Roman" w:eastAsia="CMR10" w:hAnsi="Times New Roman" w:cs="Times New Roman"/>
+          <w:kern w:val="0"/>
+          <w:u w:val="single"/>
+          <w:lang w:val="en-GB"/>
+        </w:rPr>
+        <w:t>threshold = when to stop splitting work.</w:t>
+      </w:r>
+    </w:p>
+    <w:p>
+      <w:pPr>
+        <w:pStyle w:val="Listeavsnitt"/>
+        <w:autoSpaceDE w:val="0"/>
+        <w:autoSpaceDN w:val="0"/>
+        <w:adjustRightInd w:val="0"/>
+        <w:spacing w:after="0" w:line="240" w:lineRule="auto"/>
+        <w:ind w:left="1440"/>
+        <w:rPr>
+          <w:rFonts w:ascii="Times New Roman" w:eastAsia="CMR10" w:hAnsi="Times New Roman" w:cs="Times New Roman"/>
+          <w:kern w:val="0"/>
+          <w:lang w:val="en-GB"/>
+        </w:rPr>
+      </w:pPr>
+      <w:r>
+        <w:rPr>
+          <w:rFonts w:ascii="Times New Roman" w:eastAsia="CMR10" w:hAnsi="Times New Roman" w:cs="Times New Roman"/>
+          <w:kern w:val="0"/>
+          <w:lang w:val="en-GB"/>
+        </w:rPr>
+        <w:t xml:space="preserve">Smaller threshold </w:t>
+      </w:r>
+      <w:r>
+        <w:rPr>
+          <w:rFonts w:ascii="Times New Roman" w:eastAsia="CMR10" w:hAnsi="Times New Roman" w:cs="Times New Roman"/>
+          <w:kern w:val="0"/>
+          <w:lang w:val="en-GB"/>
+        </w:rPr>
+        <w:sym w:font="Wingdings" w:char="F0E0"/>
+      </w:r>
+      <w:r>
+        <w:rPr>
+          <w:rFonts w:ascii="Times New Roman" w:eastAsia="CMR10" w:hAnsi="Times New Roman" w:cs="Times New Roman"/>
+          <w:kern w:val="0"/>
+          <w:lang w:val="en-GB"/>
+        </w:rPr>
+        <w:t xml:space="preserve"> more (smaller) tasks </w:t>
+      </w:r>
+      <w:r>
+        <w:rPr>
+          <w:rFonts w:ascii="Times New Roman" w:eastAsia="CMR10" w:hAnsi="Times New Roman" w:cs="Times New Roman"/>
+          <w:kern w:val="0"/>
+          <w:lang w:val="en-GB"/>
+        </w:rPr>
+        <w:sym w:font="Wingdings" w:char="F0E0"/>
+      </w:r>
+      <w:r>
+        <w:rPr>
+          <w:rFonts w:ascii="Times New Roman" w:eastAsia="CMR10" w:hAnsi="Times New Roman" w:cs="Times New Roman"/>
+          <w:kern w:val="0"/>
+          <w:lang w:val="en-GB"/>
+        </w:rPr>
+        <w:t xml:space="preserve"> </w:t>
+      </w:r>
+      <w:r>
+        <w:rPr>
+          <w:rFonts w:ascii="Times New Roman" w:eastAsia="CMR10" w:hAnsi="Times New Roman" w:cs="Times New Roman"/>
+          <w:kern w:val="0"/>
+          <w:lang w:val="en-GB"/>
+        </w:rPr>
+        <w:t>better core usage, but more</w:t>
+      </w:r>
+      <w:r>
+        <w:rPr>
+          <w:rFonts w:ascii="Times New Roman" w:eastAsia="CMR10" w:hAnsi="Times New Roman" w:cs="Times New Roman"/>
+          <w:kern w:val="0"/>
+          <w:lang w:val="en-GB"/>
+        </w:rPr>
+        <w:t xml:space="preserve"> </w:t>
+      </w:r>
+      <w:r>
+        <w:rPr>
+          <w:rFonts w:ascii="Times New Roman" w:eastAsia="CMR10" w:hAnsi="Times New Roman" w:cs="Times New Roman"/>
+          <w:kern w:val="0"/>
+          <w:lang w:val="en-GB"/>
+        </w:rPr>
+        <w:t>overhead.</w:t>
+      </w:r>
+      <w:r>
+        <w:rPr>
+          <w:rFonts w:ascii="Times New Roman" w:eastAsia="CMR10" w:hAnsi="Times New Roman" w:cs="Times New Roman"/>
+          <w:kern w:val="0"/>
+          <w:lang w:val="en-GB"/>
+        </w:rPr>
+        <w:t xml:space="preserve"> </w:t>
+      </w:r>
+    </w:p>
+    <w:p>
+      <w:pPr>
+        <w:pStyle w:val="Listeavsnitt"/>
+        <w:autoSpaceDE w:val="0"/>
+        <w:autoSpaceDN w:val="0"/>
+        <w:adjustRightInd w:val="0"/>
+        <w:spacing w:after="0" w:line="240" w:lineRule="auto"/>
+        <w:ind w:left="1440"/>
+        <w:rPr>
+          <w:rFonts w:ascii="Times New Roman" w:eastAsia="CMR10" w:hAnsi="Times New Roman" w:cs="Times New Roman"/>
+          <w:kern w:val="0"/>
+          <w:lang w:val="en-GB"/>
+        </w:rPr>
+      </w:pPr>
+      <w:r>
+        <w:rPr>
+          <w:rFonts w:ascii="Times New Roman" w:eastAsia="CMR10" w:hAnsi="Times New Roman" w:cs="Times New Roman"/>
+          <w:kern w:val="0"/>
+          <w:lang w:val="en-GB"/>
+        </w:rPr>
+        <w:t xml:space="preserve">Bigger threshold </w:t>
+      </w:r>
+      <w:r>
+        <w:rPr>
+          <w:rFonts w:ascii="Times New Roman" w:eastAsia="CMR10" w:hAnsi="Times New Roman" w:cs="Times New Roman"/>
+          <w:kern w:val="0"/>
+          <w:lang w:val="en-GB"/>
+        </w:rPr>
+        <w:sym w:font="Wingdings" w:char="F0E0"/>
+      </w:r>
+      <w:r>
+        <w:rPr>
+          <w:rFonts w:ascii="Times New Roman" w:eastAsia="CMR10" w:hAnsi="Times New Roman" w:cs="Times New Roman"/>
+          <w:kern w:val="0"/>
+          <w:lang w:val="en-GB"/>
+        </w:rPr>
+        <w:t xml:space="preserve"> fewer (bigger) tasks </w:t>
+      </w:r>
+      <w:r>
+        <w:rPr>
+          <w:rFonts w:ascii="Times New Roman" w:eastAsia="CMR10" w:hAnsi="Times New Roman" w:cs="Times New Roman"/>
+          <w:kern w:val="0"/>
+          <w:lang w:val="en-GB"/>
+        </w:rPr>
+        <w:sym w:font="Wingdings" w:char="F0E0"/>
+      </w:r>
+      <w:r>
+        <w:rPr>
+          <w:rFonts w:ascii="Times New Roman" w:eastAsia="CMR10" w:hAnsi="Times New Roman" w:cs="Times New Roman"/>
+          <w:kern w:val="0"/>
+          <w:lang w:val="en-GB"/>
+        </w:rPr>
+        <w:t xml:space="preserve"> less </w:t>
+      </w:r>
+      <w:r>
+        <w:rPr>
+          <w:rFonts w:ascii="Times New Roman" w:eastAsia="CMR10" w:hAnsi="Times New Roman" w:cs="Times New Roman"/>
+          <w:kern w:val="0"/>
+          <w:lang w:val="en-GB"/>
+        </w:rPr>
+        <w:t>overhead but</w:t>
+      </w:r>
+      <w:r>
+        <w:rPr>
+          <w:rFonts w:ascii="Times New Roman" w:eastAsia="CMR10" w:hAnsi="Times New Roman" w:cs="Times New Roman"/>
+          <w:kern w:val="0"/>
+          <w:lang w:val="en-GB"/>
+        </w:rPr>
+        <w:t xml:space="preserve"> can leave cores idle.</w:t>
+      </w:r>
+    </w:p>
+    <w:p>
+      <w:pPr>
+        <w:pStyle w:val="Listeavsnitt"/>
+        <w:numPr>
+          <w:ilvl w:val="1"/>
+          <w:numId w:val="5"/>
+        </w:numPr>
+        <w:autoSpaceDE w:val="0"/>
+        <w:autoSpaceDN w:val="0"/>
+        <w:adjustRightInd w:val="0"/>
+        <w:spacing w:after="0" w:line="240" w:lineRule="auto"/>
+        <w:rPr>
+          <w:rFonts w:ascii="Times New Roman" w:eastAsia="CMR10" w:hAnsi="Times New Roman" w:cs="Times New Roman"/>
+          <w:kern w:val="0"/>
+          <w:u w:val="single"/>
+          <w:lang w:val="en-GB"/>
+        </w:rPr>
+      </w:pPr>
       <w:proofErr w:type="spellStart"/>
       <w:r>
         <w:rPr>
-          <w:rFonts w:ascii="Times New Roman" w:eastAsia="CMBX10" w:hAnsi="Times New Roman" w:cs="Times New Roman"/>
-          <w:kern w:val="0"/>
-        </w:rPr>
-        <w:t>pts</w:t>
+          <w:rFonts w:ascii="Times New Roman" w:eastAsia="CMR10" w:hAnsi="Times New Roman" w:cs="Times New Roman"/>
+          <w:kern w:val="0"/>
+          <w:u w:val="single"/>
+          <w:lang w:val="en-GB"/>
+        </w:rPr>
+        <w:t>parallel_level</w:t>
       </w:r>
       <w:proofErr w:type="spellEnd"/>
       <w:r>
         <w:rPr>
-          <w:rFonts w:ascii="Times New Roman" w:eastAsia="CMBX10" w:hAnsi="Times New Roman" w:cs="Times New Roman"/>
-          <w:kern w:val="0"/>
-        </w:rPr>
-        <w:t xml:space="preserve">) </w:t>
-      </w:r>
-      <w:r>
-        <w:rPr>
-          <w:rFonts w:ascii="Times New Roman" w:eastAsia="CMR10" w:hAnsi="Times New Roman" w:cs="Times New Roman"/>
-          <w:kern w:val="0"/>
-        </w:rPr>
-        <w:t xml:space="preserve">How </w:t>
+          <w:rFonts w:ascii="Times New Roman" w:eastAsia="CMR10" w:hAnsi="Times New Roman" w:cs="Times New Roman"/>
+          <w:kern w:val="0"/>
+          <w:u w:val="single"/>
+          <w:lang w:val="en-GB"/>
+        </w:rPr>
+        <w:t xml:space="preserve"> = how </w:t>
+      </w:r>
+      <w:proofErr w:type="gramStart"/>
+      <w:r>
+        <w:rPr>
+          <w:rFonts w:ascii="Times New Roman" w:eastAsia="CMR10" w:hAnsi="Times New Roman" w:cs="Times New Roman"/>
+          <w:kern w:val="0"/>
+          <w:u w:val="single"/>
+          <w:lang w:val="en-GB"/>
+        </w:rPr>
+        <w:t>many</w:t>
+      </w:r>
+      <w:proofErr w:type="gramEnd"/>
+      <w:r>
+        <w:rPr>
+          <w:rFonts w:ascii="Times New Roman" w:eastAsia="CMR10" w:hAnsi="Times New Roman" w:cs="Times New Roman"/>
+          <w:kern w:val="0"/>
+          <w:u w:val="single"/>
+          <w:lang w:val="en-GB"/>
+        </w:rPr>
+        <w:t xml:space="preserve"> threads the </w:t>
       </w:r>
       <w:proofErr w:type="spellStart"/>
       <w:r>
         <w:rPr>
           <w:rFonts w:ascii="Times New Roman" w:eastAsia="CMR10" w:hAnsi="Times New Roman" w:cs="Times New Roman"/>
           <w:kern w:val="0"/>
-        </w:rPr>
-        <w:t>the</w:t>
+          <w:u w:val="single"/>
+          <w:lang w:val="en-GB"/>
+        </w:rPr>
+        <w:t>ForkJoinPool</w:t>
       </w:r>
       <w:proofErr w:type="spellEnd"/>
       <w:r>
         <w:rPr>
           <w:rFonts w:ascii="Times New Roman" w:eastAsia="CMR10" w:hAnsi="Times New Roman" w:cs="Times New Roman"/>
           <w:kern w:val="0"/>
+          <w:u w:val="single"/>
+          <w:lang w:val="en-GB"/>
+        </w:rPr>
+        <w:t xml:space="preserve"> uses.</w:t>
+      </w:r>
+      <w:r>
+        <w:rPr>
+          <w:rFonts w:ascii="Times New Roman" w:eastAsia="CMR10" w:hAnsi="Times New Roman" w:cs="Times New Roman"/>
+          <w:kern w:val="0"/>
+          <w:u w:val="single"/>
+          <w:lang w:val="en-GB"/>
         </w:rPr>
         <w:t xml:space="preserve"> </w:t>
       </w:r>
-      <w:proofErr w:type="spellStart"/>
-      <w:r>
-        <w:rPr>
-          <w:rFonts w:ascii="Times New Roman" w:eastAsia="CMR10" w:hAnsi="Times New Roman" w:cs="Times New Roman"/>
-          <w:kern w:val="0"/>
-        </w:rPr>
-        <w:t>running</w:t>
-      </w:r>
-      <w:proofErr w:type="spellEnd"/>
-      <w:r>
-        <w:rPr>
-          <w:rFonts w:ascii="Times New Roman" w:eastAsia="CMR10" w:hAnsi="Times New Roman" w:cs="Times New Roman"/>
-          <w:kern w:val="0"/>
-        </w:rPr>
-        <w:t xml:space="preserve"> time </w:t>
-      </w:r>
-      <w:proofErr w:type="spellStart"/>
-      <w:r>
-        <w:rPr>
-          <w:rFonts w:ascii="Times New Roman" w:eastAsia="CMR10" w:hAnsi="Times New Roman" w:cs="Times New Roman"/>
-          <w:kern w:val="0"/>
-        </w:rPr>
-        <w:t>of</w:t>
-      </w:r>
-      <w:proofErr w:type="spellEnd"/>
-      <w:r>
-        <w:rPr>
-          <w:rFonts w:ascii="Times New Roman" w:eastAsia="CMR10" w:hAnsi="Times New Roman" w:cs="Times New Roman"/>
-          <w:kern w:val="0"/>
+    </w:p>
+    <w:p>
+      <w:pPr>
+        <w:pStyle w:val="Listeavsnitt"/>
+        <w:autoSpaceDE w:val="0"/>
+        <w:autoSpaceDN w:val="0"/>
+        <w:adjustRightInd w:val="0"/>
+        <w:spacing w:after="0" w:line="240" w:lineRule="auto"/>
+        <w:ind w:left="1440"/>
+        <w:rPr>
+          <w:rFonts w:ascii="Times New Roman" w:eastAsia="CMR10" w:hAnsi="Times New Roman" w:cs="Times New Roman"/>
+          <w:kern w:val="0"/>
+          <w:lang w:val="en-GB"/>
+        </w:rPr>
+      </w:pPr>
+      <w:r>
+        <w:rPr>
+          <w:rFonts w:ascii="Times New Roman" w:eastAsia="CMR10" w:hAnsi="Times New Roman" w:cs="Times New Roman"/>
+          <w:kern w:val="0"/>
+          <w:lang w:val="en-GB"/>
+        </w:rPr>
+        <w:t>Higher (up to your CPU cores) → usually faster.</w:t>
+      </w:r>
+      <w:r>
+        <w:rPr>
+          <w:rFonts w:ascii="Times New Roman" w:eastAsia="CMR10" w:hAnsi="Times New Roman" w:cs="Times New Roman"/>
+          <w:kern w:val="0"/>
+          <w:lang w:val="en-GB"/>
         </w:rPr>
         <w:t xml:space="preserve"> </w:t>
       </w:r>
-      <w:proofErr w:type="spellStart"/>
-      <w:r>
-        <w:rPr>
-          <w:rFonts w:ascii="Times New Roman" w:eastAsia="CMR10" w:hAnsi="Times New Roman" w:cs="Times New Roman"/>
-          <w:kern w:val="0"/>
-        </w:rPr>
-        <w:t>the</w:t>
-      </w:r>
-      <w:proofErr w:type="spellEnd"/>
-      <w:r>
-        <w:rPr>
-          <w:rFonts w:ascii="Times New Roman" w:eastAsia="CMR10" w:hAnsi="Times New Roman" w:cs="Times New Roman"/>
-          <w:kern w:val="0"/>
-        </w:rPr>
-        <w:t xml:space="preserve"> program </w:t>
-      </w:r>
-      <w:proofErr w:type="spellStart"/>
-      <w:r>
-        <w:rPr>
-          <w:rFonts w:ascii="Times New Roman" w:eastAsia="CMR10" w:hAnsi="Times New Roman" w:cs="Times New Roman"/>
-          <w:kern w:val="0"/>
-        </w:rPr>
-        <w:t>varies</w:t>
-      </w:r>
-      <w:proofErr w:type="spellEnd"/>
-      <w:r>
-        <w:rPr>
-          <w:rFonts w:ascii="Times New Roman" w:eastAsia="CMR10" w:hAnsi="Times New Roman" w:cs="Times New Roman"/>
-          <w:kern w:val="0"/>
-        </w:rPr>
-        <w:t xml:space="preserve"> </w:t>
-      </w:r>
-      <w:proofErr w:type="spellStart"/>
-      <w:r>
-        <w:rPr>
-          <w:rFonts w:ascii="Times New Roman" w:eastAsia="CMR10" w:hAnsi="Times New Roman" w:cs="Times New Roman"/>
-          <w:kern w:val="0"/>
-        </w:rPr>
-        <w:t>with</w:t>
-      </w:r>
-      <w:proofErr w:type="spellEnd"/>
-      <w:r>
-        <w:rPr>
-          <w:rFonts w:ascii="Times New Roman" w:eastAsia="CMR10" w:hAnsi="Times New Roman" w:cs="Times New Roman"/>
-          <w:kern w:val="0"/>
-        </w:rPr>
-        <w:t xml:space="preserve"> </w:t>
-      </w:r>
-      <w:proofErr w:type="spellStart"/>
-      <w:r>
-        <w:rPr>
-          <w:rFonts w:ascii="Times New Roman" w:eastAsia="CMR10" w:hAnsi="Times New Roman" w:cs="Times New Roman"/>
-          <w:kern w:val="0"/>
-        </w:rPr>
-        <w:t>the</w:t>
-      </w:r>
-      <w:proofErr w:type="spellEnd"/>
-      <w:r>
-        <w:rPr>
-          <w:rFonts w:ascii="Times New Roman" w:eastAsia="CMR10" w:hAnsi="Times New Roman" w:cs="Times New Roman"/>
-          <w:kern w:val="0"/>
-        </w:rPr>
-        <w:t xml:space="preserve"> </w:t>
-      </w:r>
-      <w:proofErr w:type="spellStart"/>
-      <w:r>
-        <w:rPr>
-          <w:rFonts w:ascii="Times New Roman" w:eastAsia="CMR10" w:hAnsi="Times New Roman" w:cs="Times New Roman"/>
-          <w:kern w:val="0"/>
-        </w:rPr>
-        <w:t>above</w:t>
-      </w:r>
-      <w:proofErr w:type="spellEnd"/>
-      <w:r>
-        <w:rPr>
-          <w:rFonts w:ascii="Times New Roman" w:eastAsia="CMR10" w:hAnsi="Times New Roman" w:cs="Times New Roman"/>
-          <w:kern w:val="0"/>
-        </w:rPr>
-        <w:t xml:space="preserve"> </w:t>
-      </w:r>
-      <w:proofErr w:type="spellStart"/>
-      <w:r>
-        <w:rPr>
-          <w:rFonts w:ascii="Times New Roman" w:eastAsia="CMR10" w:hAnsi="Times New Roman" w:cs="Times New Roman"/>
-          <w:kern w:val="0"/>
-        </w:rPr>
-        <w:t>two</w:t>
-      </w:r>
-      <w:proofErr w:type="spellEnd"/>
-      <w:r>
-        <w:rPr>
-          <w:rFonts w:ascii="Times New Roman" w:eastAsia="CMR10" w:hAnsi="Times New Roman" w:cs="Times New Roman"/>
-          <w:kern w:val="0"/>
-        </w:rPr>
-        <w:t xml:space="preserve"> arguments?</w:t>
-      </w:r>
+    </w:p>
+    <w:p>
+      <w:pPr>
+        <w:pStyle w:val="Listeavsnitt"/>
+        <w:autoSpaceDE w:val="0"/>
+        <w:autoSpaceDN w:val="0"/>
+        <w:adjustRightInd w:val="0"/>
+        <w:spacing w:after="0" w:line="240" w:lineRule="auto"/>
+        <w:ind w:left="1440"/>
+        <w:rPr>
+          <w:rFonts w:ascii="Times New Roman" w:eastAsia="CMR10" w:hAnsi="Times New Roman" w:cs="Times New Roman"/>
+          <w:kern w:val="0"/>
+          <w:lang w:val="en-GB"/>
+        </w:rPr>
+      </w:pPr>
+      <w:r>
+        <w:rPr>
+          <w:rFonts w:ascii="Times New Roman" w:eastAsia="CMR10" w:hAnsi="Times New Roman" w:cs="Times New Roman"/>
+          <w:kern w:val="0"/>
+          <w:lang w:val="en-GB"/>
+        </w:rPr>
+        <w:t>Too high (above cores) → little gain or slower (thread overhead).</w:t>
+      </w:r>
+    </w:p>
+    <w:p>
+      <w:pPr>
+        <w:pStyle w:val="Listeavsnitt"/>
+        <w:autoSpaceDE w:val="0"/>
+        <w:autoSpaceDN w:val="0"/>
+        <w:adjustRightInd w:val="0"/>
+        <w:spacing w:after="0" w:line="240" w:lineRule="auto"/>
+        <w:ind w:left="1440"/>
+        <w:rPr>
+          <w:rFonts w:ascii="Times New Roman" w:eastAsia="CMR10" w:hAnsi="Times New Roman" w:cs="Times New Roman"/>
+          <w:kern w:val="0"/>
+          <w:lang w:val="en-GB"/>
+        </w:rPr>
+      </w:pPr>
+    </w:p>
+    <w:p>
+      <w:pPr>
+        <w:pStyle w:val="Listeavsnitt"/>
+        <w:autoSpaceDE w:val="0"/>
+        <w:autoSpaceDN w:val="0"/>
+        <w:adjustRightInd w:val="0"/>
+        <w:spacing w:after="0" w:line="240" w:lineRule="auto"/>
+        <w:ind w:left="1440"/>
+        <w:rPr>
+          <w:rFonts w:ascii="Times New Roman" w:eastAsia="CMR10" w:hAnsi="Times New Roman" w:cs="Times New Roman"/>
+          <w:kern w:val="0"/>
+          <w:lang w:val="en-GB"/>
+        </w:rPr>
+      </w:pPr>
     </w:p>
     <w:p>
       <w:pPr>
@@ -1581,430 +1655,68 @@
         <w:rPr>
           <w:rFonts w:ascii="Times New Roman" w:eastAsia="CMR10" w:hAnsi="Times New Roman" w:cs="Times New Roman"/>
           <w:kern w:val="0"/>
+          <w:lang w:val="en-GB"/>
         </w:rPr>
       </w:pPr>
       <w:r>
         <w:rPr>
           <w:rFonts w:ascii="Times New Roman" w:eastAsia="CMBX10" w:hAnsi="Times New Roman" w:cs="Times New Roman"/>
           <w:kern w:val="0"/>
-        </w:rPr>
-        <w:t xml:space="preserve">(10 </w:t>
+          <w:lang w:val="en-GB"/>
+        </w:rPr>
+        <w:t xml:space="preserve">(10 pts) </w:t>
+      </w:r>
+      <w:r>
+        <w:rPr>
+          <w:rFonts w:ascii="Times New Roman" w:eastAsia="CMR10" w:hAnsi="Times New Roman" w:cs="Times New Roman"/>
+          <w:kern w:val="0"/>
+          <w:lang w:val="en-GB"/>
+        </w:rPr>
+        <w:t xml:space="preserve">What happens when you set </w:t>
       </w:r>
       <w:proofErr w:type="spellStart"/>
       <w:r>
         <w:rPr>
-          <w:rFonts w:ascii="Times New Roman" w:eastAsia="CMBX10" w:hAnsi="Times New Roman" w:cs="Times New Roman"/>
-          <w:kern w:val="0"/>
-        </w:rPr>
-        <w:t>pts</w:t>
+          <w:rFonts w:ascii="Times New Roman" w:eastAsia="CMTT10" w:hAnsi="Times New Roman" w:cs="Times New Roman"/>
+          <w:kern w:val="0"/>
+          <w:lang w:val="en-GB"/>
+        </w:rPr>
+        <w:t>paral</w:t>
       </w:r>
       <w:proofErr w:type="spellEnd"/>
       <w:r>
         <w:rPr>
-          <w:rFonts w:ascii="Times New Roman" w:eastAsia="CMBX10" w:hAnsi="Times New Roman" w:cs="Times New Roman"/>
-          <w:kern w:val="0"/>
-        </w:rPr>
-        <w:t xml:space="preserve">) </w:t>
+          <w:rFonts w:ascii="Times New Roman" w:eastAsia="CMTT10" w:hAnsi="Times New Roman" w:cs="Times New Roman"/>
+          <w:kern w:val="0"/>
+          <w:lang w:val="en-GB"/>
+        </w:rPr>
+        <w:t xml:space="preserve"> level </w:t>
+      </w:r>
+      <w:r>
+        <w:rPr>
+          <w:rFonts w:ascii="Times New Roman" w:eastAsia="CMR10" w:hAnsi="Times New Roman" w:cs="Times New Roman"/>
+          <w:kern w:val="0"/>
+          <w:lang w:val="en-GB"/>
+        </w:rPr>
+        <w:t xml:space="preserve">higher than the number of </w:t>
       </w:r>
       <w:proofErr w:type="spellStart"/>
       <w:r>
         <w:rPr>
           <w:rFonts w:ascii="Times New Roman" w:eastAsia="CMR10" w:hAnsi="Times New Roman" w:cs="Times New Roman"/>
           <w:kern w:val="0"/>
-        </w:rPr>
-        <w:t>What</w:t>
+          <w:lang w:val="en-GB"/>
+        </w:rPr>
+        <w:t>proccessors</w:t>
       </w:r>
       <w:proofErr w:type="spellEnd"/>
       <w:r>
         <w:rPr>
           <w:rFonts w:ascii="Times New Roman" w:eastAsia="CMR10" w:hAnsi="Times New Roman" w:cs="Times New Roman"/>
           <w:kern w:val="0"/>
-        </w:rPr>
-        <w:t xml:space="preserve"> </w:t>
-      </w:r>
-      <w:proofErr w:type="spellStart"/>
-      <w:r>
-        <w:rPr>
-          <w:rFonts w:ascii="Times New Roman" w:eastAsia="CMR10" w:hAnsi="Times New Roman" w:cs="Times New Roman"/>
-          <w:kern w:val="0"/>
-        </w:rPr>
-        <w:t>happens</w:t>
-      </w:r>
-      <w:proofErr w:type="spellEnd"/>
-      <w:r>
-        <w:rPr>
-          <w:rFonts w:ascii="Times New Roman" w:eastAsia="CMR10" w:hAnsi="Times New Roman" w:cs="Times New Roman"/>
-          <w:kern w:val="0"/>
-        </w:rPr>
-        <w:t xml:space="preserve"> </w:t>
-      </w:r>
-      <w:proofErr w:type="spellStart"/>
-      <w:r>
-        <w:rPr>
-          <w:rFonts w:ascii="Times New Roman" w:eastAsia="CMR10" w:hAnsi="Times New Roman" w:cs="Times New Roman"/>
-          <w:kern w:val="0"/>
-        </w:rPr>
-        <w:t>when</w:t>
-      </w:r>
-      <w:proofErr w:type="spellEnd"/>
-      <w:r>
-        <w:rPr>
-          <w:rFonts w:ascii="Times New Roman" w:eastAsia="CMR10" w:hAnsi="Times New Roman" w:cs="Times New Roman"/>
-          <w:kern w:val="0"/>
-        </w:rPr>
-        <w:t xml:space="preserve"> </w:t>
-      </w:r>
-      <w:proofErr w:type="spellStart"/>
-      <w:r>
-        <w:rPr>
-          <w:rFonts w:ascii="Times New Roman" w:eastAsia="CMR10" w:hAnsi="Times New Roman" w:cs="Times New Roman"/>
-          <w:kern w:val="0"/>
-        </w:rPr>
-        <w:t>you</w:t>
-      </w:r>
-      <w:proofErr w:type="spellEnd"/>
-      <w:r>
-        <w:rPr>
-          <w:rFonts w:ascii="Times New Roman" w:eastAsia="CMR10" w:hAnsi="Times New Roman" w:cs="Times New Roman"/>
-          <w:kern w:val="0"/>
-        </w:rPr>
-        <w:t xml:space="preserve"> </w:t>
-      </w:r>
-      <w:proofErr w:type="spellStart"/>
-      <w:r>
-        <w:rPr>
-          <w:rFonts w:ascii="Times New Roman" w:eastAsia="CMR10" w:hAnsi="Times New Roman" w:cs="Times New Roman"/>
-          <w:kern w:val="0"/>
-        </w:rPr>
-        <w:t>set</w:t>
-      </w:r>
-      <w:proofErr w:type="spellEnd"/>
-      <w:r>
-        <w:rPr>
-          <w:rFonts w:ascii="Times New Roman" w:eastAsia="CMR10" w:hAnsi="Times New Roman" w:cs="Times New Roman"/>
-          <w:kern w:val="0"/>
-        </w:rPr>
-        <w:t xml:space="preserve"> </w:t>
-      </w:r>
-      <w:proofErr w:type="spellStart"/>
-      <w:r>
-        <w:rPr>
-          <w:rFonts w:ascii="Times New Roman" w:eastAsia="CMTT10" w:hAnsi="Times New Roman" w:cs="Times New Roman"/>
-          <w:kern w:val="0"/>
-        </w:rPr>
-        <w:t>paral</w:t>
-      </w:r>
-      <w:proofErr w:type="spellEnd"/>
-      <w:r>
-        <w:rPr>
-          <w:rFonts w:ascii="Times New Roman" w:eastAsia="CMTT10" w:hAnsi="Times New Roman" w:cs="Times New Roman"/>
-          <w:kern w:val="0"/>
-        </w:rPr>
-        <w:t xml:space="preserve"> </w:t>
-      </w:r>
-      <w:proofErr w:type="spellStart"/>
-      <w:r>
-        <w:rPr>
-          <w:rFonts w:ascii="Times New Roman" w:eastAsia="CMTT10" w:hAnsi="Times New Roman" w:cs="Times New Roman"/>
-          <w:kern w:val="0"/>
-        </w:rPr>
-        <w:t>level</w:t>
-      </w:r>
-      <w:proofErr w:type="spellEnd"/>
-      <w:r>
-        <w:rPr>
-          <w:rFonts w:ascii="Times New Roman" w:eastAsia="CMTT10" w:hAnsi="Times New Roman" w:cs="Times New Roman"/>
-          <w:kern w:val="0"/>
-        </w:rPr>
-        <w:t xml:space="preserve"> </w:t>
-      </w:r>
-      <w:proofErr w:type="spellStart"/>
-      <w:r>
-        <w:rPr>
-          <w:rFonts w:ascii="Times New Roman" w:eastAsia="CMR10" w:hAnsi="Times New Roman" w:cs="Times New Roman"/>
-          <w:kern w:val="0"/>
-        </w:rPr>
-        <w:t>higher</w:t>
-      </w:r>
-      <w:proofErr w:type="spellEnd"/>
-      <w:r>
-        <w:rPr>
-          <w:rFonts w:ascii="Times New Roman" w:eastAsia="CMR10" w:hAnsi="Times New Roman" w:cs="Times New Roman"/>
-          <w:kern w:val="0"/>
-        </w:rPr>
-        <w:t xml:space="preserve"> </w:t>
-      </w:r>
-      <w:proofErr w:type="spellStart"/>
-      <w:r>
-        <w:rPr>
-          <w:rFonts w:ascii="Times New Roman" w:eastAsia="CMR10" w:hAnsi="Times New Roman" w:cs="Times New Roman"/>
-          <w:kern w:val="0"/>
-        </w:rPr>
-        <w:t>than</w:t>
-      </w:r>
-      <w:proofErr w:type="spellEnd"/>
-      <w:r>
-        <w:rPr>
-          <w:rFonts w:ascii="Times New Roman" w:eastAsia="CMR10" w:hAnsi="Times New Roman" w:cs="Times New Roman"/>
-          <w:kern w:val="0"/>
-        </w:rPr>
-        <w:t xml:space="preserve"> </w:t>
-      </w:r>
-      <w:proofErr w:type="spellStart"/>
-      <w:r>
-        <w:rPr>
-          <w:rFonts w:ascii="Times New Roman" w:eastAsia="CMR10" w:hAnsi="Times New Roman" w:cs="Times New Roman"/>
-          <w:kern w:val="0"/>
-        </w:rPr>
-        <w:t>the</w:t>
-      </w:r>
-      <w:proofErr w:type="spellEnd"/>
-      <w:r>
-        <w:rPr>
-          <w:rFonts w:ascii="Times New Roman" w:eastAsia="CMR10" w:hAnsi="Times New Roman" w:cs="Times New Roman"/>
-          <w:kern w:val="0"/>
-        </w:rPr>
-        <w:t xml:space="preserve"> </w:t>
-      </w:r>
-      <w:proofErr w:type="spellStart"/>
-      <w:r>
-        <w:rPr>
-          <w:rFonts w:ascii="Times New Roman" w:eastAsia="CMR10" w:hAnsi="Times New Roman" w:cs="Times New Roman"/>
-          <w:kern w:val="0"/>
-        </w:rPr>
-        <w:t>number</w:t>
-      </w:r>
-      <w:proofErr w:type="spellEnd"/>
-      <w:r>
-        <w:rPr>
-          <w:rFonts w:ascii="Times New Roman" w:eastAsia="CMR10" w:hAnsi="Times New Roman" w:cs="Times New Roman"/>
-          <w:kern w:val="0"/>
-        </w:rPr>
-        <w:t xml:space="preserve"> </w:t>
-      </w:r>
-      <w:proofErr w:type="spellStart"/>
-      <w:r>
-        <w:rPr>
-          <w:rFonts w:ascii="Times New Roman" w:eastAsia="CMR10" w:hAnsi="Times New Roman" w:cs="Times New Roman"/>
-          <w:kern w:val="0"/>
-        </w:rPr>
-        <w:t>of</w:t>
-      </w:r>
-      <w:proofErr w:type="spellEnd"/>
-      <w:r>
-        <w:rPr>
-          <w:rFonts w:ascii="Times New Roman" w:eastAsia="CMR10" w:hAnsi="Times New Roman" w:cs="Times New Roman"/>
-          <w:kern w:val="0"/>
-        </w:rPr>
-        <w:t xml:space="preserve"> </w:t>
-      </w:r>
-      <w:proofErr w:type="spellStart"/>
-      <w:r>
-        <w:rPr>
-          <w:rFonts w:ascii="Times New Roman" w:eastAsia="CMR10" w:hAnsi="Times New Roman" w:cs="Times New Roman"/>
-          <w:kern w:val="0"/>
-        </w:rPr>
-        <w:t>proccessors</w:t>
-      </w:r>
-      <w:proofErr w:type="spellEnd"/>
-      <w:r>
-        <w:rPr>
-          <w:rFonts w:ascii="Times New Roman" w:eastAsia="CMR10" w:hAnsi="Times New Roman" w:cs="Times New Roman"/>
-          <w:kern w:val="0"/>
-        </w:rPr>
-        <w:t xml:space="preserve"> </w:t>
-      </w:r>
-      <w:proofErr w:type="spellStart"/>
-      <w:r>
-        <w:rPr>
-          <w:rFonts w:ascii="Times New Roman" w:eastAsia="CMR10" w:hAnsi="Times New Roman" w:cs="Times New Roman"/>
-          <w:kern w:val="0"/>
-        </w:rPr>
-        <w:t>cores</w:t>
-      </w:r>
-      <w:proofErr w:type="spellEnd"/>
-      <w:r>
-        <w:rPr>
-          <w:rFonts w:ascii="Times New Roman" w:eastAsia="CMR10" w:hAnsi="Times New Roman" w:cs="Times New Roman"/>
-          <w:kern w:val="0"/>
-        </w:rPr>
-        <w:t xml:space="preserve"> </w:t>
-      </w:r>
-      <w:proofErr w:type="spellStart"/>
-      <w:r>
-        <w:rPr>
-          <w:rFonts w:ascii="Times New Roman" w:eastAsia="CMR10" w:hAnsi="Times New Roman" w:cs="Times New Roman"/>
-          <w:kern w:val="0"/>
-        </w:rPr>
-        <w:t>available</w:t>
-      </w:r>
-      <w:proofErr w:type="spellEnd"/>
-      <w:r>
-        <w:rPr>
-          <w:rFonts w:ascii="Times New Roman" w:eastAsia="CMR10" w:hAnsi="Times New Roman" w:cs="Times New Roman"/>
-          <w:kern w:val="0"/>
-        </w:rPr>
-        <w:t xml:space="preserve"> in </w:t>
-      </w:r>
-      <w:proofErr w:type="spellStart"/>
-      <w:r>
-        <w:rPr>
-          <w:rFonts w:ascii="Times New Roman" w:eastAsia="CMR10" w:hAnsi="Times New Roman" w:cs="Times New Roman"/>
-          <w:kern w:val="0"/>
-        </w:rPr>
-        <w:t>your</w:t>
-      </w:r>
-      <w:proofErr w:type="spellEnd"/>
-      <w:r>
-        <w:rPr>
-          <w:rFonts w:ascii="Times New Roman" w:eastAsia="CMR10" w:hAnsi="Times New Roman" w:cs="Times New Roman"/>
-          <w:kern w:val="0"/>
-        </w:rPr>
-        <w:t xml:space="preserve"> computer? Run </w:t>
-      </w:r>
-      <w:proofErr w:type="spellStart"/>
-      <w:r>
-        <w:rPr>
-          <w:rFonts w:ascii="Times New Roman" w:eastAsia="CMR10" w:hAnsi="Times New Roman" w:cs="Times New Roman"/>
-          <w:kern w:val="0"/>
-        </w:rPr>
-        <w:t>the</w:t>
-      </w:r>
-      <w:proofErr w:type="spellEnd"/>
-      <w:r>
-        <w:rPr>
-          <w:rFonts w:ascii="Times New Roman" w:eastAsia="CMR10" w:hAnsi="Times New Roman" w:cs="Times New Roman"/>
-          <w:kern w:val="0"/>
-        </w:rPr>
-        <w:t xml:space="preserve"> </w:t>
-      </w:r>
-      <w:proofErr w:type="spellStart"/>
-      <w:r>
-        <w:rPr>
-          <w:rFonts w:ascii="Times New Roman" w:eastAsia="CMR10" w:hAnsi="Times New Roman" w:cs="Times New Roman"/>
-          <w:kern w:val="0"/>
-        </w:rPr>
-        <w:t>code</w:t>
-      </w:r>
-      <w:proofErr w:type="spellEnd"/>
-      <w:r>
-        <w:rPr>
-          <w:rFonts w:ascii="Times New Roman" w:eastAsia="CMR10" w:hAnsi="Times New Roman" w:cs="Times New Roman"/>
-          <w:kern w:val="0"/>
-        </w:rPr>
-        <w:t xml:space="preserve"> </w:t>
-      </w:r>
-      <w:proofErr w:type="spellStart"/>
-      <w:r>
-        <w:rPr>
-          <w:rFonts w:ascii="Times New Roman" w:eastAsia="CMR10" w:hAnsi="Times New Roman" w:cs="Times New Roman"/>
-          <w:kern w:val="0"/>
-        </w:rPr>
-        <w:t>with</w:t>
-      </w:r>
-      <w:proofErr w:type="spellEnd"/>
-      <w:r>
-        <w:rPr>
-          <w:rFonts w:ascii="Times New Roman" w:eastAsia="CMR10" w:hAnsi="Times New Roman" w:cs="Times New Roman"/>
-          <w:kern w:val="0"/>
-        </w:rPr>
-        <w:t xml:space="preserve"> different settings and </w:t>
-      </w:r>
-      <w:proofErr w:type="spellStart"/>
-      <w:r>
-        <w:rPr>
-          <w:rFonts w:ascii="Times New Roman" w:eastAsia="CMR10" w:hAnsi="Times New Roman" w:cs="Times New Roman"/>
-          <w:kern w:val="0"/>
-        </w:rPr>
-        <w:t>include</w:t>
-      </w:r>
-      <w:proofErr w:type="spellEnd"/>
-      <w:r>
-        <w:rPr>
-          <w:rFonts w:ascii="Times New Roman" w:eastAsia="CMR10" w:hAnsi="Times New Roman" w:cs="Times New Roman"/>
-          <w:kern w:val="0"/>
-        </w:rPr>
-        <w:t xml:space="preserve"> </w:t>
-      </w:r>
-      <w:proofErr w:type="spellStart"/>
-      <w:r>
-        <w:rPr>
-          <w:rFonts w:ascii="Times New Roman" w:eastAsia="CMR10" w:hAnsi="Times New Roman" w:cs="Times New Roman"/>
-          <w:kern w:val="0"/>
-        </w:rPr>
-        <w:t>the</w:t>
-      </w:r>
-      <w:proofErr w:type="spellEnd"/>
-      <w:r>
-        <w:rPr>
-          <w:rFonts w:ascii="Times New Roman" w:eastAsia="CMR10" w:hAnsi="Times New Roman" w:cs="Times New Roman"/>
-          <w:kern w:val="0"/>
-        </w:rPr>
-        <w:t xml:space="preserve"> screenshots </w:t>
-      </w:r>
-      <w:proofErr w:type="spellStart"/>
-      <w:r>
-        <w:rPr>
-          <w:rFonts w:ascii="Times New Roman" w:eastAsia="CMR10" w:hAnsi="Times New Roman" w:cs="Times New Roman"/>
-          <w:kern w:val="0"/>
-        </w:rPr>
-        <w:t>of</w:t>
-      </w:r>
-      <w:proofErr w:type="spellEnd"/>
-      <w:r>
-        <w:rPr>
-          <w:rFonts w:ascii="Times New Roman" w:eastAsia="CMR10" w:hAnsi="Times New Roman" w:cs="Times New Roman"/>
-          <w:kern w:val="0"/>
-        </w:rPr>
-        <w:t xml:space="preserve"> </w:t>
-      </w:r>
-      <w:proofErr w:type="spellStart"/>
-      <w:r>
-        <w:rPr>
-          <w:rFonts w:ascii="Times New Roman" w:eastAsia="CMR10" w:hAnsi="Times New Roman" w:cs="Times New Roman"/>
-          <w:kern w:val="0"/>
-        </w:rPr>
-        <w:t>the</w:t>
-      </w:r>
-      <w:proofErr w:type="spellEnd"/>
-      <w:r>
-        <w:rPr>
-          <w:rFonts w:ascii="Times New Roman" w:eastAsia="CMR10" w:hAnsi="Times New Roman" w:cs="Times New Roman"/>
-          <w:kern w:val="0"/>
-        </w:rPr>
-        <w:t xml:space="preserve"> output in </w:t>
-      </w:r>
-      <w:proofErr w:type="spellStart"/>
-      <w:r>
-        <w:rPr>
-          <w:rFonts w:ascii="Times New Roman" w:eastAsia="CMR10" w:hAnsi="Times New Roman" w:cs="Times New Roman"/>
-          <w:kern w:val="0"/>
-        </w:rPr>
-        <w:t>your</w:t>
-      </w:r>
-      <w:proofErr w:type="spellEnd"/>
-      <w:r>
-        <w:rPr>
-          <w:rFonts w:ascii="Times New Roman" w:eastAsia="CMR10" w:hAnsi="Times New Roman" w:cs="Times New Roman"/>
-          <w:kern w:val="0"/>
-        </w:rPr>
-        <w:t xml:space="preserve"> report to support </w:t>
-      </w:r>
-      <w:proofErr w:type="spellStart"/>
-      <w:r>
-        <w:rPr>
-          <w:rFonts w:ascii="Times New Roman" w:eastAsia="CMR10" w:hAnsi="Times New Roman" w:cs="Times New Roman"/>
-          <w:kern w:val="0"/>
-        </w:rPr>
-        <w:t>your</w:t>
-      </w:r>
-      <w:proofErr w:type="spellEnd"/>
-      <w:r>
-        <w:rPr>
-          <w:rFonts w:ascii="Times New Roman" w:eastAsia="CMR10" w:hAnsi="Times New Roman" w:cs="Times New Roman"/>
-          <w:kern w:val="0"/>
-        </w:rPr>
-        <w:t xml:space="preserve"> arguments.</w:t>
+          <w:lang w:val="en-GB"/>
+        </w:rPr>
+        <w:t xml:space="preserve"> cores available in your computer? Run the code with different settings and include the screenshots of the output in your report to support your arguments.</w:t>
       </w:r>
     </w:p>
     <w:p>
@@ -2021,236 +1733,57 @@
         <w:rPr>
           <w:rFonts w:ascii="Times New Roman" w:eastAsia="CMR10" w:hAnsi="Times New Roman" w:cs="Times New Roman"/>
           <w:kern w:val="0"/>
+          <w:lang w:val="en-GB"/>
         </w:rPr>
       </w:pPr>
       <w:r>
         <w:rPr>
           <w:rFonts w:ascii="Times New Roman" w:eastAsia="CMBX10" w:hAnsi="Times New Roman" w:cs="Times New Roman"/>
           <w:kern w:val="0"/>
-        </w:rPr>
-        <w:t xml:space="preserve">(10 </w:t>
-      </w:r>
-      <w:proofErr w:type="spellStart"/>
-      <w:r>
-        <w:rPr>
-          <w:rFonts w:ascii="Times New Roman" w:eastAsia="CMBX10" w:hAnsi="Times New Roman" w:cs="Times New Roman"/>
-          <w:kern w:val="0"/>
-        </w:rPr>
-        <w:t>pts</w:t>
-      </w:r>
-      <w:proofErr w:type="spellEnd"/>
-      <w:r>
-        <w:rPr>
-          <w:rFonts w:ascii="Times New Roman" w:eastAsia="CMBX10" w:hAnsi="Times New Roman" w:cs="Times New Roman"/>
-          <w:kern w:val="0"/>
-        </w:rPr>
-        <w:t xml:space="preserve">) </w:t>
-      </w:r>
-      <w:proofErr w:type="spellStart"/>
-      <w:r>
-        <w:rPr>
-          <w:rFonts w:ascii="Times New Roman" w:eastAsia="CMR10" w:hAnsi="Times New Roman" w:cs="Times New Roman"/>
-          <w:kern w:val="0"/>
-        </w:rPr>
-        <w:t>Which</w:t>
-      </w:r>
-      <w:proofErr w:type="spellEnd"/>
-      <w:r>
-        <w:rPr>
-          <w:rFonts w:ascii="Times New Roman" w:eastAsia="CMR10" w:hAnsi="Times New Roman" w:cs="Times New Roman"/>
-          <w:kern w:val="0"/>
-        </w:rPr>
-        <w:t xml:space="preserve"> </w:t>
-      </w:r>
-      <w:proofErr w:type="spellStart"/>
-      <w:r>
-        <w:rPr>
-          <w:rFonts w:ascii="Times New Roman" w:eastAsia="CMR10" w:hAnsi="Times New Roman" w:cs="Times New Roman"/>
-          <w:kern w:val="0"/>
-        </w:rPr>
-        <w:t>values</w:t>
-      </w:r>
-      <w:proofErr w:type="spellEnd"/>
-      <w:r>
-        <w:rPr>
-          <w:rFonts w:ascii="Times New Roman" w:eastAsia="CMR10" w:hAnsi="Times New Roman" w:cs="Times New Roman"/>
-          <w:kern w:val="0"/>
-        </w:rPr>
-        <w:t xml:space="preserve"> </w:t>
-      </w:r>
-      <w:proofErr w:type="spellStart"/>
-      <w:r>
-        <w:rPr>
-          <w:rFonts w:ascii="Times New Roman" w:eastAsia="CMR10" w:hAnsi="Times New Roman" w:cs="Times New Roman"/>
-          <w:kern w:val="0"/>
-        </w:rPr>
-        <w:t>of</w:t>
-      </w:r>
-      <w:proofErr w:type="spellEnd"/>
-      <w:r>
-        <w:rPr>
-          <w:rFonts w:ascii="Times New Roman" w:eastAsia="CMR10" w:hAnsi="Times New Roman" w:cs="Times New Roman"/>
-          <w:kern w:val="0"/>
-        </w:rPr>
-        <w:t xml:space="preserve"> </w:t>
-      </w:r>
-      <w:proofErr w:type="spellStart"/>
+          <w:lang w:val="en-GB"/>
+        </w:rPr>
+        <w:lastRenderedPageBreak/>
+        <w:t xml:space="preserve">(10 pts) </w:t>
+      </w:r>
+      <w:r>
+        <w:rPr>
+          <w:rFonts w:ascii="Times New Roman" w:eastAsia="CMR10" w:hAnsi="Times New Roman" w:cs="Times New Roman"/>
+          <w:kern w:val="0"/>
+          <w:lang w:val="en-GB"/>
+        </w:rPr>
+        <w:t xml:space="preserve">Which values of </w:t>
+      </w:r>
       <w:r>
         <w:rPr>
           <w:rFonts w:ascii="Times New Roman" w:eastAsia="CMTT10" w:hAnsi="Times New Roman" w:cs="Times New Roman"/>
           <w:kern w:val="0"/>
-        </w:rPr>
-        <w:t>Threshold</w:t>
-      </w:r>
-      <w:proofErr w:type="spellEnd"/>
+          <w:lang w:val="en-GB"/>
+        </w:rPr>
+        <w:t xml:space="preserve">Threshold </w:t>
+      </w:r>
+      <w:r>
+        <w:rPr>
+          <w:rFonts w:ascii="Times New Roman" w:eastAsia="CMR10" w:hAnsi="Times New Roman" w:cs="Times New Roman"/>
+          <w:kern w:val="0"/>
+          <w:lang w:val="en-GB"/>
+        </w:rPr>
+        <w:t xml:space="preserve">and </w:t>
+      </w:r>
       <w:r>
         <w:rPr>
           <w:rFonts w:ascii="Times New Roman" w:eastAsia="CMTT10" w:hAnsi="Times New Roman" w:cs="Times New Roman"/>
           <w:kern w:val="0"/>
-        </w:rPr>
-        <w:t xml:space="preserve"> </w:t>
-      </w:r>
-      <w:r>
-        <w:rPr>
-          <w:rFonts w:ascii="Times New Roman" w:eastAsia="CMR10" w:hAnsi="Times New Roman" w:cs="Times New Roman"/>
-          <w:kern w:val="0"/>
-        </w:rPr>
-        <w:t xml:space="preserve">and </w:t>
-      </w:r>
-      <w:r>
-        <w:rPr>
-          <w:rFonts w:ascii="Times New Roman" w:eastAsia="CMTT10" w:hAnsi="Times New Roman" w:cs="Times New Roman"/>
-          <w:kern w:val="0"/>
-        </w:rPr>
-        <w:t xml:space="preserve">Level </w:t>
-      </w:r>
-      <w:proofErr w:type="spellStart"/>
-      <w:r>
-        <w:rPr>
-          <w:rFonts w:ascii="Times New Roman" w:eastAsia="CMTT10" w:hAnsi="Times New Roman" w:cs="Times New Roman"/>
-          <w:kern w:val="0"/>
-        </w:rPr>
-        <w:t>of</w:t>
-      </w:r>
-      <w:proofErr w:type="spellEnd"/>
-      <w:r>
-        <w:rPr>
-          <w:rFonts w:ascii="Times New Roman" w:eastAsia="CMTT10" w:hAnsi="Times New Roman" w:cs="Times New Roman"/>
-          <w:kern w:val="0"/>
-        </w:rPr>
-        <w:t xml:space="preserve"> </w:t>
-      </w:r>
-      <w:proofErr w:type="spellStart"/>
-      <w:r>
-        <w:rPr>
-          <w:rFonts w:ascii="Times New Roman" w:eastAsia="CMTT10" w:hAnsi="Times New Roman" w:cs="Times New Roman"/>
-          <w:kern w:val="0"/>
-        </w:rPr>
-        <w:t>Parallelism</w:t>
-      </w:r>
-      <w:proofErr w:type="spellEnd"/>
-      <w:r>
-        <w:rPr>
-          <w:rFonts w:ascii="Times New Roman" w:eastAsia="CMTT10" w:hAnsi="Times New Roman" w:cs="Times New Roman"/>
-          <w:kern w:val="0"/>
-        </w:rPr>
-        <w:t xml:space="preserve"> </w:t>
-      </w:r>
-      <w:proofErr w:type="spellStart"/>
-      <w:r>
-        <w:rPr>
-          <w:rFonts w:ascii="Times New Roman" w:eastAsia="CMR10" w:hAnsi="Times New Roman" w:cs="Times New Roman"/>
-          <w:kern w:val="0"/>
-        </w:rPr>
-        <w:t>give</w:t>
-      </w:r>
-      <w:proofErr w:type="spellEnd"/>
-      <w:r>
-        <w:rPr>
-          <w:rFonts w:ascii="Times New Roman" w:eastAsia="CMR10" w:hAnsi="Times New Roman" w:cs="Times New Roman"/>
-          <w:kern w:val="0"/>
-        </w:rPr>
-        <w:t xml:space="preserve"> </w:t>
-      </w:r>
-      <w:proofErr w:type="spellStart"/>
-      <w:r>
-        <w:rPr>
-          <w:rFonts w:ascii="Times New Roman" w:eastAsia="CMR10" w:hAnsi="Times New Roman" w:cs="Times New Roman"/>
-          <w:kern w:val="0"/>
-        </w:rPr>
-        <w:t>you</w:t>
-      </w:r>
-      <w:proofErr w:type="spellEnd"/>
-      <w:r>
-        <w:rPr>
-          <w:rFonts w:ascii="Times New Roman" w:eastAsia="CMR10" w:hAnsi="Times New Roman" w:cs="Times New Roman"/>
-          <w:kern w:val="0"/>
-        </w:rPr>
-        <w:t xml:space="preserve"> </w:t>
-      </w:r>
-      <w:proofErr w:type="spellStart"/>
-      <w:r>
-        <w:rPr>
-          <w:rFonts w:ascii="Times New Roman" w:eastAsia="CMR10" w:hAnsi="Times New Roman" w:cs="Times New Roman"/>
-          <w:kern w:val="0"/>
-        </w:rPr>
-        <w:t>the</w:t>
-      </w:r>
-      <w:proofErr w:type="spellEnd"/>
-      <w:r>
-        <w:rPr>
-          <w:rFonts w:ascii="Times New Roman" w:eastAsia="CMR10" w:hAnsi="Times New Roman" w:cs="Times New Roman"/>
-          <w:kern w:val="0"/>
-        </w:rPr>
-        <w:t xml:space="preserve"> (</w:t>
-      </w:r>
-      <w:proofErr w:type="spellStart"/>
-      <w:r>
-        <w:rPr>
-          <w:rFonts w:ascii="Times New Roman" w:eastAsia="CMR10" w:hAnsi="Times New Roman" w:cs="Times New Roman"/>
-          <w:kern w:val="0"/>
-        </w:rPr>
-        <w:t>likely</w:t>
-      </w:r>
-      <w:proofErr w:type="spellEnd"/>
-      <w:r>
-        <w:rPr>
-          <w:rFonts w:ascii="Times New Roman" w:eastAsia="CMR10" w:hAnsi="Times New Roman" w:cs="Times New Roman"/>
-          <w:kern w:val="0"/>
-        </w:rPr>
-        <w:t xml:space="preserve">) </w:t>
-      </w:r>
-      <w:proofErr w:type="spellStart"/>
-      <w:r>
-        <w:rPr>
-          <w:rFonts w:ascii="Times New Roman" w:eastAsia="CMR10" w:hAnsi="Times New Roman" w:cs="Times New Roman"/>
-          <w:kern w:val="0"/>
-        </w:rPr>
-        <w:t>shortest</w:t>
-      </w:r>
-      <w:proofErr w:type="spellEnd"/>
-      <w:r>
-        <w:rPr>
-          <w:rFonts w:ascii="Times New Roman" w:eastAsia="CMR10" w:hAnsi="Times New Roman" w:cs="Times New Roman"/>
-          <w:kern w:val="0"/>
-        </w:rPr>
-        <w:t xml:space="preserve"> </w:t>
-      </w:r>
-      <w:proofErr w:type="spellStart"/>
-      <w:r>
-        <w:rPr>
-          <w:rFonts w:ascii="Times New Roman" w:eastAsia="CMR10" w:hAnsi="Times New Roman" w:cs="Times New Roman"/>
-          <w:kern w:val="0"/>
-        </w:rPr>
-        <w:t>running</w:t>
-      </w:r>
-      <w:proofErr w:type="spellEnd"/>
-      <w:r>
-        <w:rPr>
-          <w:rFonts w:ascii="Times New Roman" w:eastAsia="CMR10" w:hAnsi="Times New Roman" w:cs="Times New Roman"/>
-          <w:kern w:val="0"/>
-        </w:rPr>
-        <w:t xml:space="preserve"> time?</w:t>
+          <w:lang w:val="en-GB"/>
+        </w:rPr>
+        <w:t xml:space="preserve">Level of Parallelism </w:t>
+      </w:r>
+      <w:r>
+        <w:rPr>
+          <w:rFonts w:ascii="Times New Roman" w:eastAsia="CMR10" w:hAnsi="Times New Roman" w:cs="Times New Roman"/>
+          <w:kern w:val="0"/>
+          <w:lang w:val="en-GB"/>
+        </w:rPr>
+        <w:t>give you the (likely) shortest running time?</w:t>
       </w:r>
     </w:p>
     <w:p>
@@ -2261,159 +1794,34 @@
           <w:numId w:val="5"/>
         </w:numPr>
         <w:rPr>
-          <w:rFonts w:ascii="Times New Roman" w:hAnsi="Times New Roman" w:cs="Times New Roman"/>
-          <w:lang w:val="en-GB"/>
-        </w:rPr>
-      </w:pPr>
-      <w:r>
-        <w:rPr>
           <w:rFonts w:ascii="Times New Roman" w:eastAsia="CMBX10" w:hAnsi="Times New Roman" w:cs="Times New Roman"/>
-        </w:rPr>
-        <w:t xml:space="preserve">(10 </w:t>
-      </w:r>
-      <w:proofErr w:type="spellStart"/>
+          <w:lang w:val="en-GB"/>
+        </w:rPr>
+      </w:pPr>
       <w:r>
         <w:rPr>
           <w:rFonts w:ascii="Times New Roman" w:eastAsia="CMBX10" w:hAnsi="Times New Roman" w:cs="Times New Roman"/>
-        </w:rPr>
-        <w:t>pts</w:t>
-      </w:r>
-      <w:proofErr w:type="spellEnd"/>
+          <w:lang w:val="en-GB"/>
+        </w:rPr>
+        <w:t>(10 pts) Use one AI tool to complete the implementation of Task class and Main class. Show the</w:t>
+      </w:r>
       <w:r>
         <w:rPr>
           <w:rFonts w:ascii="Times New Roman" w:eastAsia="CMBX10" w:hAnsi="Times New Roman" w:cs="Times New Roman"/>
-        </w:rPr>
-        <w:t xml:space="preserve">) </w:t>
-      </w:r>
-      <w:proofErr w:type="spellStart"/>
-      <w:r>
-        <w:rPr>
-          <w:rFonts w:ascii="Times New Roman" w:hAnsi="Times New Roman" w:cs="Times New Roman"/>
-        </w:rPr>
-        <w:t>Use</w:t>
-      </w:r>
-      <w:proofErr w:type="spellEnd"/>
-      <w:r>
-        <w:rPr>
-          <w:rFonts w:ascii="Times New Roman" w:hAnsi="Times New Roman" w:cs="Times New Roman"/>
+          <w:lang w:val="en-GB"/>
         </w:rPr>
         <w:t xml:space="preserve"> </w:t>
       </w:r>
-      <w:proofErr w:type="spellStart"/>
-      <w:r>
-        <w:rPr>
-          <w:rFonts w:ascii="Times New Roman" w:hAnsi="Times New Roman" w:cs="Times New Roman"/>
-        </w:rPr>
-        <w:t>one</w:t>
-      </w:r>
-      <w:proofErr w:type="spellEnd"/>
-      <w:r>
-        <w:rPr>
-          <w:rFonts w:ascii="Times New Roman" w:hAnsi="Times New Roman" w:cs="Times New Roman"/>
-        </w:rPr>
-        <w:t xml:space="preserve"> AI </w:t>
-      </w:r>
-      <w:proofErr w:type="spellStart"/>
-      <w:r>
-        <w:rPr>
-          <w:rFonts w:ascii="Times New Roman" w:hAnsi="Times New Roman" w:cs="Times New Roman"/>
-        </w:rPr>
-        <w:t>tool</w:t>
-      </w:r>
-      <w:proofErr w:type="spellEnd"/>
-      <w:r>
-        <w:rPr>
-          <w:rFonts w:ascii="Times New Roman" w:hAnsi="Times New Roman" w:cs="Times New Roman"/>
-        </w:rPr>
-        <w:t xml:space="preserve"> to </w:t>
-      </w:r>
-      <w:proofErr w:type="spellStart"/>
-      <w:r>
-        <w:rPr>
-          <w:rFonts w:ascii="Times New Roman" w:hAnsi="Times New Roman" w:cs="Times New Roman"/>
-        </w:rPr>
-        <w:t>complete</w:t>
-      </w:r>
-      <w:proofErr w:type="spellEnd"/>
-      <w:r>
-        <w:rPr>
-          <w:rFonts w:ascii="Times New Roman" w:hAnsi="Times New Roman" w:cs="Times New Roman"/>
-        </w:rPr>
-        <w:t xml:space="preserve"> </w:t>
-      </w:r>
-      <w:proofErr w:type="spellStart"/>
-      <w:r>
-        <w:rPr>
-          <w:rFonts w:ascii="Times New Roman" w:hAnsi="Times New Roman" w:cs="Times New Roman"/>
-        </w:rPr>
-        <w:t>the</w:t>
-      </w:r>
-      <w:proofErr w:type="spellEnd"/>
-      <w:r>
-        <w:rPr>
-          <w:rFonts w:ascii="Times New Roman" w:hAnsi="Times New Roman" w:cs="Times New Roman"/>
-        </w:rPr>
-        <w:t xml:space="preserve"> </w:t>
-      </w:r>
-      <w:proofErr w:type="spellStart"/>
-      <w:r>
-        <w:rPr>
-          <w:rFonts w:ascii="Times New Roman" w:hAnsi="Times New Roman" w:cs="Times New Roman"/>
-        </w:rPr>
-        <w:t>implementation</w:t>
-      </w:r>
-      <w:proofErr w:type="spellEnd"/>
-      <w:r>
-        <w:rPr>
-          <w:rFonts w:ascii="Times New Roman" w:hAnsi="Times New Roman" w:cs="Times New Roman"/>
-        </w:rPr>
-        <w:t xml:space="preserve"> </w:t>
-      </w:r>
-      <w:proofErr w:type="spellStart"/>
-      <w:r>
-        <w:rPr>
-          <w:rFonts w:ascii="Times New Roman" w:hAnsi="Times New Roman" w:cs="Times New Roman"/>
-        </w:rPr>
-        <w:t>of</w:t>
-      </w:r>
-      <w:proofErr w:type="spellEnd"/>
-      <w:r>
-        <w:rPr>
-          <w:rFonts w:ascii="Times New Roman" w:hAnsi="Times New Roman" w:cs="Times New Roman"/>
-        </w:rPr>
-        <w:t xml:space="preserve"> </w:t>
-      </w:r>
-      <w:proofErr w:type="spellStart"/>
-      <w:r>
-        <w:rPr>
-          <w:rFonts w:ascii="Times New Roman" w:hAnsi="Times New Roman" w:cs="Times New Roman"/>
-        </w:rPr>
-        <w:t>Task</w:t>
-      </w:r>
-      <w:proofErr w:type="spellEnd"/>
-      <w:r>
-        <w:rPr>
-          <w:rFonts w:ascii="Times New Roman" w:hAnsi="Times New Roman" w:cs="Times New Roman"/>
-        </w:rPr>
-        <w:t xml:space="preserve"> </w:t>
-      </w:r>
-      <w:proofErr w:type="spellStart"/>
-      <w:r>
-        <w:rPr>
-          <w:rFonts w:ascii="Times New Roman" w:hAnsi="Times New Roman" w:cs="Times New Roman"/>
-        </w:rPr>
-        <w:t>class</w:t>
-      </w:r>
-      <w:proofErr w:type="spellEnd"/>
-      <w:r>
-        <w:rPr>
-          <w:rFonts w:ascii="Times New Roman" w:hAnsi="Times New Roman" w:cs="Times New Roman"/>
-        </w:rPr>
-        <w:t xml:space="preserve"> and</w:t>
+      <w:r>
+        <w:rPr>
+          <w:rFonts w:ascii="Times New Roman" w:eastAsia="CMBX10" w:hAnsi="Times New Roman" w:cs="Times New Roman"/>
+          <w:lang w:val="en-GB"/>
+        </w:rPr>
+        <w:t>difference between the solution generated by AI and your own solution.</w:t>
       </w:r>
     </w:p>
     <w:sectPr>
-      <w:headerReference w:type="default" r:id="rId12"/>
+      <w:headerReference w:type="default" r:id="rId14"/>
       <w:pgSz w:w="11906" w:h="16838"/>
       <w:pgMar w:top="1417" w:right="1417" w:bottom="1417" w:left="1417" w:header="708" w:footer="708" w:gutter="0"/>
       <w:cols w:space="708"/>
@@ -2843,7 +2251,7 @@
         <w:rFonts w:ascii="Times New Roman" w:eastAsia="CMBX10" w:hAnsi="Times New Roman" w:cs="Times New Roman" w:hint="default"/>
       </w:rPr>
     </w:lvl>
-    <w:lvl w:ilvl="1" w:tplc="04140003" w:tentative="1">
+    <w:lvl w:ilvl="1" w:tplc="04140003">
       <w:start w:val="1"/>
       <w:numFmt w:val="bullet"/>
       <w:lvlText w:val="o"/>

</xml_diff>